<commit_message>
S1 embedded float layout (13->9pp); S5 opener image onto page 1
Co-Authored-By: Claude Opus 4.8 <noreply@anthropic.com>
</commit_message>
<xml_diff>
--- a/sessions/session_01_gathering_of_friends.docx
+++ b/sessions/session_01_gathering_of_friends.docx
@@ -241,7 +241,7 @@
       <w:r>
         <w:drawing>
           <wp:inline xmlns:a="http://schemas.openxmlformats.org/drawingml/2006/main" xmlns:pic="http://schemas.openxmlformats.org/drawingml/2006/picture">
-            <wp:extent cx="3291840" cy="3291840"/>
+            <wp:extent cx="2743200" cy="2743200"/>
             <wp:docPr id="1" name="Picture 1"/>
             <wp:cNvGraphicFramePr>
               <a:graphicFrameLocks noChangeAspect="1"/>
@@ -262,7 +262,7 @@
                   <pic:spPr>
                     <a:xfrm>
                       <a:off x="0" y="0"/>
-                      <a:ext cx="3291840" cy="3291840"/>
+                      <a:ext cx="2743200" cy="2743200"/>
                     </a:xfrm>
                     <a:prstGeom prst="rect"/>
                   </pic:spPr>
@@ -479,6 +479,52 @@
     </w:p>
     <w:p>
       <w:pPr>
+        <w:spacing w:after="0" w:before="0"/>
+      </w:pPr>
+      <w:r>
+        <w:drawing>
+          <wp:anchor xmlns:a="http://schemas.openxmlformats.org/drawingml/2006/main" behindDoc="0" distT="0" distB="0" distL="114300" distR="0" simplePos="0" locked="0" layoutInCell="1" allowOverlap="1" relativeHeight="2">
+            <wp:simplePos x="0" y="0"/>
+            <wp:positionH relativeFrom="column">
+              <wp:align>right</wp:align>
+            </wp:positionH>
+            <wp:positionV relativeFrom="paragraph">
+              <wp:posOffset>0</wp:posOffset>
+            </wp:positionV>
+            <wp:extent cx="2103120" cy="2103120"/>
+            <wp:effectExtent l="0" t="0" r="0" b="0"/>
+            <wp:wrapSquare wrapText="bothSides"/>
+            <wp:docPr id="3" name="Picture 3"/>
+            <wp:cNvGraphicFramePr/>
+            <a:graphic xmlns:pic="http://schemas.openxmlformats.org/drawingml/2006/picture">
+              <a:graphicData uri="http://schemas.openxmlformats.org/drawingml/2006/picture">
+                <pic:pic>
+                  <pic:nvPicPr>
+                    <pic:cNvPr id="0" name="image.jpg"/>
+                    <pic:cNvPicPr/>
+                  </pic:nvPicPr>
+                  <pic:blipFill>
+                    <a:blip r:embed="rId12"/>
+                    <a:stretch>
+                      <a:fillRect/>
+                    </a:stretch>
+                  </pic:blipFill>
+                  <pic:spPr>
+                    <a:xfrm>
+                      <a:off x="0" y="0"/>
+                      <a:ext cx="2103120" cy="2103120"/>
+                    </a:xfrm>
+                    <a:prstGeom prst="rect"/>
+                  </pic:spPr>
+                </pic:pic>
+              </a:graphicData>
+            </a:graphic>
+          </wp:anchor>
+        </w:drawing>
+      </w:r>
+    </w:p>
+    <w:p>
+      <w:pPr>
         <w:pBdr>
           <w:left w:val="single" w:sz="18" w:space="12" w:color="B8860B"/>
         </w:pBdr>
@@ -649,62 +695,6 @@
     </w:p>
     <w:p>
       <w:pPr>
-        <w:keepNext/>
-        <w:spacing w:before="120" w:after="40"/>
-        <w:jc w:val="center"/>
-      </w:pPr>
-      <w:r>
-        <w:drawing>
-          <wp:inline xmlns:a="http://schemas.openxmlformats.org/drawingml/2006/main" xmlns:pic="http://schemas.openxmlformats.org/drawingml/2006/picture">
-            <wp:extent cx="2468880" cy="2468880"/>
-            <wp:docPr id="3" name="Picture 3"/>
-            <wp:cNvGraphicFramePr>
-              <a:graphicFrameLocks noChangeAspect="1"/>
-            </wp:cNvGraphicFramePr>
-            <a:graphic>
-              <a:graphicData uri="http://schemas.openxmlformats.org/drawingml/2006/picture">
-                <pic:pic>
-                  <pic:nvPicPr>
-                    <pic:cNvPr id="0" name="image.jpg"/>
-                    <pic:cNvPicPr/>
-                  </pic:nvPicPr>
-                  <pic:blipFill>
-                    <a:blip r:embed="rId12"/>
-                    <a:stretch>
-                      <a:fillRect/>
-                    </a:stretch>
-                  </pic:blipFill>
-                  <pic:spPr>
-                    <a:xfrm>
-                      <a:off x="0" y="0"/>
-                      <a:ext cx="2468880" cy="2468880"/>
-                    </a:xfrm>
-                    <a:prstGeom prst="rect"/>
-                  </pic:spPr>
-                </pic:pic>
-              </a:graphicData>
-            </a:graphic>
-          </wp:inline>
-        </w:drawing>
-      </w:r>
-    </w:p>
-    <w:p>
-      <w:pPr>
-        <w:spacing w:after="140"/>
-        <w:jc w:val="center"/>
-      </w:pPr>
-      <w:r>
-        <w:rPr>
-          <w:rFonts w:ascii="Georgia" w:hAnsi="Georgia" w:cs="Georgia"/>
-          <w:i/>
-          <w:color w:val="888888"/>
-          <w:sz w:val="18"/>
-        </w:rPr>
-        <w:t>Lilly Glimmergear and the Essence Sphere.</w:t>
-      </w:r>
-    </w:p>
-    <w:p>
-      <w:pPr>
         <w:pBdr>
           <w:left w:val="single" w:sz="18" w:space="12" w:color="B8860B"/>
         </w:pBdr>
@@ -766,6 +756,52 @@
           <w:sz w:val="26"/>
         </w:rPr>
         <w:t>Ursa's Curiosity</w:t>
+      </w:r>
+    </w:p>
+    <w:p>
+      <w:pPr>
+        <w:spacing w:after="0" w:before="0"/>
+      </w:pPr>
+      <w:r>
+        <w:drawing>
+          <wp:anchor xmlns:a="http://schemas.openxmlformats.org/drawingml/2006/main" behindDoc="0" distT="0" distB="0" distL="114300" distR="0" simplePos="0" locked="0" layoutInCell="1" allowOverlap="1" relativeHeight="2">
+            <wp:simplePos x="0" y="0"/>
+            <wp:positionH relativeFrom="column">
+              <wp:align>right</wp:align>
+            </wp:positionH>
+            <wp:positionV relativeFrom="paragraph">
+              <wp:posOffset>0</wp:posOffset>
+            </wp:positionV>
+            <wp:extent cx="2103120" cy="2103120"/>
+            <wp:effectExtent l="0" t="0" r="0" b="0"/>
+            <wp:wrapSquare wrapText="bothSides"/>
+            <wp:docPr id="4" name="Picture 4"/>
+            <wp:cNvGraphicFramePr/>
+            <a:graphic xmlns:pic="http://schemas.openxmlformats.org/drawingml/2006/picture">
+              <a:graphicData uri="http://schemas.openxmlformats.org/drawingml/2006/picture">
+                <pic:pic>
+                  <pic:nvPicPr>
+                    <pic:cNvPr id="0" name="image.jpg"/>
+                    <pic:cNvPicPr/>
+                  </pic:nvPicPr>
+                  <pic:blipFill>
+                    <a:blip r:embed="rId13"/>
+                    <a:stretch>
+                      <a:fillRect/>
+                    </a:stretch>
+                  </pic:blipFill>
+                  <pic:spPr>
+                    <a:xfrm>
+                      <a:off x="0" y="0"/>
+                      <a:ext cx="2103120" cy="2103120"/>
+                    </a:xfrm>
+                    <a:prstGeom prst="rect"/>
+                  </pic:spPr>
+                </pic:pic>
+              </a:graphicData>
+            </a:graphic>
+          </wp:anchor>
+        </w:drawing>
       </w:r>
     </w:p>
     <w:p>
@@ -870,62 +906,6 @@
     </w:p>
     <w:p>
       <w:pPr>
-        <w:keepNext/>
-        <w:spacing w:before="120" w:after="40"/>
-        <w:jc w:val="center"/>
-      </w:pPr>
-      <w:r>
-        <w:drawing>
-          <wp:inline xmlns:a="http://schemas.openxmlformats.org/drawingml/2006/main" xmlns:pic="http://schemas.openxmlformats.org/drawingml/2006/picture">
-            <wp:extent cx="2468880" cy="2468880"/>
-            <wp:docPr id="4" name="Picture 4"/>
-            <wp:cNvGraphicFramePr>
-              <a:graphicFrameLocks noChangeAspect="1"/>
-            </wp:cNvGraphicFramePr>
-            <a:graphic>
-              <a:graphicData uri="http://schemas.openxmlformats.org/drawingml/2006/picture">
-                <pic:pic>
-                  <pic:nvPicPr>
-                    <pic:cNvPr id="0" name="image.jpg"/>
-                    <pic:cNvPicPr/>
-                  </pic:nvPicPr>
-                  <pic:blipFill>
-                    <a:blip r:embed="rId13"/>
-                    <a:stretch>
-                      <a:fillRect/>
-                    </a:stretch>
-                  </pic:blipFill>
-                  <pic:spPr>
-                    <a:xfrm>
-                      <a:off x="0" y="0"/>
-                      <a:ext cx="2468880" cy="2468880"/>
-                    </a:xfrm>
-                    <a:prstGeom prst="rect"/>
-                  </pic:spPr>
-                </pic:pic>
-              </a:graphicData>
-            </a:graphic>
-          </wp:inline>
-        </w:drawing>
-      </w:r>
-    </w:p>
-    <w:p>
-      <w:pPr>
-        <w:spacing w:after="140"/>
-        <w:jc w:val="center"/>
-      </w:pPr>
-      <w:r>
-        <w:rPr>
-          <w:rFonts w:ascii="Georgia" w:hAnsi="Georgia" w:cs="Georgia"/>
-          <w:i/>
-          <w:color w:val="888888"/>
-          <w:sz w:val="18"/>
-        </w:rPr>
-        <w:t>Ursa Catchum, son of Ash, with one of his father's enchanted potatoes.</w:t>
-      </w:r>
-    </w:p>
-    <w:p>
-      <w:pPr>
         <w:pBdr>
           <w:left w:val="single" w:sz="18" w:space="12" w:color="B8860B"/>
         </w:pBdr>
@@ -1017,6 +997,52 @@
           <w:sz w:val="26"/>
         </w:rPr>
         <w:t>Stabby's Grand Entrance</w:t>
+      </w:r>
+    </w:p>
+    <w:p>
+      <w:pPr>
+        <w:spacing w:after="0" w:before="0"/>
+      </w:pPr>
+      <w:r>
+        <w:drawing>
+          <wp:anchor xmlns:a="http://schemas.openxmlformats.org/drawingml/2006/main" behindDoc="0" distT="0" distB="0" distL="114300" distR="0" simplePos="0" locked="0" layoutInCell="1" allowOverlap="1" relativeHeight="2">
+            <wp:simplePos x="0" y="0"/>
+            <wp:positionH relativeFrom="column">
+              <wp:align>right</wp:align>
+            </wp:positionH>
+            <wp:positionV relativeFrom="paragraph">
+              <wp:posOffset>0</wp:posOffset>
+            </wp:positionV>
+            <wp:extent cx="2103120" cy="2103120"/>
+            <wp:effectExtent l="0" t="0" r="0" b="0"/>
+            <wp:wrapSquare wrapText="bothSides"/>
+            <wp:docPr id="5" name="Picture 5"/>
+            <wp:cNvGraphicFramePr/>
+            <a:graphic xmlns:pic="http://schemas.openxmlformats.org/drawingml/2006/picture">
+              <a:graphicData uri="http://schemas.openxmlformats.org/drawingml/2006/picture">
+                <pic:pic>
+                  <pic:nvPicPr>
+                    <pic:cNvPr id="0" name="image.jpg"/>
+                    <pic:cNvPicPr/>
+                  </pic:nvPicPr>
+                  <pic:blipFill>
+                    <a:blip r:embed="rId14"/>
+                    <a:stretch>
+                      <a:fillRect/>
+                    </a:stretch>
+                  </pic:blipFill>
+                  <pic:spPr>
+                    <a:xfrm>
+                      <a:off x="0" y="0"/>
+                      <a:ext cx="2103120" cy="2103120"/>
+                    </a:xfrm>
+                    <a:prstGeom prst="rect"/>
+                  </pic:spPr>
+                </pic:pic>
+              </a:graphicData>
+            </a:graphic>
+          </wp:anchor>
+        </w:drawing>
       </w:r>
     </w:p>
     <w:p>
@@ -1147,62 +1173,6 @@
           <w:sz w:val="21"/>
         </w:rPr>
         <w:t xml:space="preserve"> of the Whispering Breeze, taught him balance, patience (a little), and gave him his name. Then the road called, and Stabby followed it here, bored and hungry for excitement.</w:t>
-      </w:r>
-    </w:p>
-    <w:p>
-      <w:pPr>
-        <w:keepNext/>
-        <w:spacing w:before="120" w:after="40"/>
-        <w:jc w:val="center"/>
-      </w:pPr>
-      <w:r>
-        <w:drawing>
-          <wp:inline xmlns:a="http://schemas.openxmlformats.org/drawingml/2006/main" xmlns:pic="http://schemas.openxmlformats.org/drawingml/2006/picture">
-            <wp:extent cx="2468880" cy="2468880"/>
-            <wp:docPr id="5" name="Picture 5"/>
-            <wp:cNvGraphicFramePr>
-              <a:graphicFrameLocks noChangeAspect="1"/>
-            </wp:cNvGraphicFramePr>
-            <a:graphic>
-              <a:graphicData uri="http://schemas.openxmlformats.org/drawingml/2006/picture">
-                <pic:pic>
-                  <pic:nvPicPr>
-                    <pic:cNvPr id="0" name="image.jpg"/>
-                    <pic:cNvPicPr/>
-                  </pic:nvPicPr>
-                  <pic:blipFill>
-                    <a:blip r:embed="rId14"/>
-                    <a:stretch>
-                      <a:fillRect/>
-                    </a:stretch>
-                  </pic:blipFill>
-                  <pic:spPr>
-                    <a:xfrm>
-                      <a:off x="0" y="0"/>
-                      <a:ext cx="2468880" cy="2468880"/>
-                    </a:xfrm>
-                    <a:prstGeom prst="rect"/>
-                  </pic:spPr>
-                </pic:pic>
-              </a:graphicData>
-            </a:graphic>
-          </wp:inline>
-        </w:drawing>
-      </w:r>
-    </w:p>
-    <w:p>
-      <w:pPr>
-        <w:spacing w:after="140"/>
-        <w:jc w:val="center"/>
-      </w:pPr>
-      <w:r>
-        <w:rPr>
-          <w:rFonts w:ascii="Georgia" w:hAnsi="Georgia" w:cs="Georgia"/>
-          <w:i/>
-          <w:color w:val="888888"/>
-          <w:sz w:val="18"/>
-        </w:rPr>
-        <w:t>Stabby Sharpblade of the Bloodfang Clan.</w:t>
       </w:r>
     </w:p>
     <w:p>
@@ -1502,6 +1472,52 @@
     </w:p>
     <w:p>
       <w:pPr>
+        <w:spacing w:after="0" w:before="0"/>
+      </w:pPr>
+      <w:r>
+        <w:drawing>
+          <wp:anchor xmlns:a="http://schemas.openxmlformats.org/drawingml/2006/main" behindDoc="0" distT="0" distB="0" distL="114300" distR="0" simplePos="0" locked="0" layoutInCell="1" allowOverlap="1" relativeHeight="2">
+            <wp:simplePos x="0" y="0"/>
+            <wp:positionH relativeFrom="column">
+              <wp:align>right</wp:align>
+            </wp:positionH>
+            <wp:positionV relativeFrom="paragraph">
+              <wp:posOffset>0</wp:posOffset>
+            </wp:positionV>
+            <wp:extent cx="2560320" cy="2560320"/>
+            <wp:effectExtent l="0" t="0" r="0" b="0"/>
+            <wp:wrapSquare wrapText="bothSides"/>
+            <wp:docPr id="6" name="Picture 6"/>
+            <wp:cNvGraphicFramePr/>
+            <a:graphic xmlns:pic="http://schemas.openxmlformats.org/drawingml/2006/picture">
+              <a:graphicData uri="http://schemas.openxmlformats.org/drawingml/2006/picture">
+                <pic:pic>
+                  <pic:nvPicPr>
+                    <pic:cNvPr id="0" name="image.jpg"/>
+                    <pic:cNvPicPr/>
+                  </pic:nvPicPr>
+                  <pic:blipFill>
+                    <a:blip r:embed="rId15"/>
+                    <a:stretch>
+                      <a:fillRect/>
+                    </a:stretch>
+                  </pic:blipFill>
+                  <pic:spPr>
+                    <a:xfrm>
+                      <a:off x="0" y="0"/>
+                      <a:ext cx="2560320" cy="2560320"/>
+                    </a:xfrm>
+                    <a:prstGeom prst="rect"/>
+                  </pic:spPr>
+                </pic:pic>
+              </a:graphicData>
+            </a:graphic>
+          </wp:anchor>
+        </w:drawing>
+      </w:r>
+    </w:p>
+    <w:p>
+      <w:pPr>
         <w:pBdr>
           <w:left w:val="single" w:sz="18" w:space="12" w:color="B8860B"/>
         </w:pBdr>
@@ -1518,62 +1534,6 @@
           <w:sz w:val="21"/>
         </w:rPr>
         <w:t>It is short, loud, and glorious. Stabby fights like a rumor: everywhere and nowhere. Lilly's gadgets spark and startle. Ursa never even stands up all the way. When Bren finally sits down hard, rubbing his jaw, the whole tavern is laughing, and so, almost, is he.</w:t>
-      </w:r>
-    </w:p>
-    <w:p>
-      <w:pPr>
-        <w:keepNext/>
-        <w:spacing w:before="120" w:after="40"/>
-        <w:jc w:val="center"/>
-      </w:pPr>
-      <w:r>
-        <w:drawing>
-          <wp:inline xmlns:a="http://schemas.openxmlformats.org/drawingml/2006/main" xmlns:pic="http://schemas.openxmlformats.org/drawingml/2006/picture">
-            <wp:extent cx="3657600" cy="3657600"/>
-            <wp:docPr id="6" name="Picture 6"/>
-            <wp:cNvGraphicFramePr>
-              <a:graphicFrameLocks noChangeAspect="1"/>
-            </wp:cNvGraphicFramePr>
-            <a:graphic>
-              <a:graphicData uri="http://schemas.openxmlformats.org/drawingml/2006/picture">
-                <pic:pic>
-                  <pic:nvPicPr>
-                    <pic:cNvPr id="0" name="image.jpg"/>
-                    <pic:cNvPicPr/>
-                  </pic:nvPicPr>
-                  <pic:blipFill>
-                    <a:blip r:embed="rId15"/>
-                    <a:stretch>
-                      <a:fillRect/>
-                    </a:stretch>
-                  </pic:blipFill>
-                  <pic:spPr>
-                    <a:xfrm>
-                      <a:off x="0" y="0"/>
-                      <a:ext cx="3657600" cy="3657600"/>
-                    </a:xfrm>
-                    <a:prstGeom prst="rect"/>
-                  </pic:spPr>
-                </pic:pic>
-              </a:graphicData>
-            </a:graphic>
-          </wp:inline>
-        </w:drawing>
-      </w:r>
-    </w:p>
-    <w:p>
-      <w:pPr>
-        <w:spacing w:after="140"/>
-        <w:jc w:val="center"/>
-      </w:pPr>
-      <w:r>
-        <w:rPr>
-          <w:rFonts w:ascii="Georgia" w:hAnsi="Georgia" w:cs="Georgia"/>
-          <w:i/>
-          <w:color w:val="888888"/>
-          <w:sz w:val="18"/>
-        </w:rPr>
-        <w:t>Bren picks the wrong table, and the three fight side by side for the first time.</w:t>
       </w:r>
     </w:p>
     <w:p>
@@ -1731,6 +1691,52 @@
     </w:p>
     <w:p>
       <w:pPr>
+        <w:spacing w:after="0" w:before="0"/>
+      </w:pPr>
+      <w:r>
+        <w:drawing>
+          <wp:anchor xmlns:a="http://schemas.openxmlformats.org/drawingml/2006/main" behindDoc="0" distT="0" distB="0" distL="114300" distR="0" simplePos="0" locked="0" layoutInCell="1" allowOverlap="1" relativeHeight="2">
+            <wp:simplePos x="0" y="0"/>
+            <wp:positionH relativeFrom="column">
+              <wp:align>right</wp:align>
+            </wp:positionH>
+            <wp:positionV relativeFrom="paragraph">
+              <wp:posOffset>0</wp:posOffset>
+            </wp:positionV>
+            <wp:extent cx="2560320" cy="2560320"/>
+            <wp:effectExtent l="0" t="0" r="0" b="0"/>
+            <wp:wrapSquare wrapText="bothSides"/>
+            <wp:docPr id="7" name="Picture 7"/>
+            <wp:cNvGraphicFramePr/>
+            <a:graphic xmlns:pic="http://schemas.openxmlformats.org/drawingml/2006/picture">
+              <a:graphicData uri="http://schemas.openxmlformats.org/drawingml/2006/picture">
+                <pic:pic>
+                  <pic:nvPicPr>
+                    <pic:cNvPr id="0" name="image.jpg"/>
+                    <pic:cNvPicPr/>
+                  </pic:nvPicPr>
+                  <pic:blipFill>
+                    <a:blip r:embed="rId16"/>
+                    <a:stretch>
+                      <a:fillRect/>
+                    </a:stretch>
+                  </pic:blipFill>
+                  <pic:spPr>
+                    <a:xfrm>
+                      <a:off x="0" y="0"/>
+                      <a:ext cx="2560320" cy="2560320"/>
+                    </a:xfrm>
+                    <a:prstGeom prst="rect"/>
+                  </pic:spPr>
+                </pic:pic>
+              </a:graphicData>
+            </a:graphic>
+          </wp:anchor>
+        </w:drawing>
+      </w:r>
+    </w:p>
+    <w:p>
+      <w:pPr>
         <w:pBdr>
           <w:left w:val="single" w:sz="18" w:space="12" w:color="B8860B"/>
         </w:pBdr>
@@ -1882,62 +1888,6 @@
     <w:p>
       <w:pPr>
         <w:keepNext/>
-        <w:spacing w:before="120" w:after="40"/>
-        <w:jc w:val="center"/>
-      </w:pPr>
-      <w:r>
-        <w:drawing>
-          <wp:inline xmlns:a="http://schemas.openxmlformats.org/drawingml/2006/main" xmlns:pic="http://schemas.openxmlformats.org/drawingml/2006/picture">
-            <wp:extent cx="3657600" cy="3657600"/>
-            <wp:docPr id="7" name="Picture 7"/>
-            <wp:cNvGraphicFramePr>
-              <a:graphicFrameLocks noChangeAspect="1"/>
-            </wp:cNvGraphicFramePr>
-            <a:graphic>
-              <a:graphicData uri="http://schemas.openxmlformats.org/drawingml/2006/picture">
-                <pic:pic>
-                  <pic:nvPicPr>
-                    <pic:cNvPr id="0" name="image.jpg"/>
-                    <pic:cNvPicPr/>
-                  </pic:nvPicPr>
-                  <pic:blipFill>
-                    <a:blip r:embed="rId16"/>
-                    <a:stretch>
-                      <a:fillRect/>
-                    </a:stretch>
-                  </pic:blipFill>
-                  <pic:spPr>
-                    <a:xfrm>
-                      <a:off x="0" y="0"/>
-                      <a:ext cx="3657600" cy="3657600"/>
-                    </a:xfrm>
-                    <a:prstGeom prst="rect"/>
-                  </pic:spPr>
-                </pic:pic>
-              </a:graphicData>
-            </a:graphic>
-          </wp:inline>
-        </w:drawing>
-      </w:r>
-    </w:p>
-    <w:p>
-      <w:pPr>
-        <w:spacing w:after="140"/>
-        <w:jc w:val="center"/>
-      </w:pPr>
-      <w:r>
-        <w:rPr>
-          <w:rFonts w:ascii="Georgia" w:hAnsi="Georgia" w:cs="Georgia"/>
-          <w:i/>
-          <w:color w:val="888888"/>
-          <w:sz w:val="18"/>
-        </w:rPr>
-        <w:t>The whispering pond at moonrise, where Lickgloom wandered through an open door.</w:t>
-      </w:r>
-    </w:p>
-    <w:p>
-      <w:pPr>
-        <w:keepNext/>
         <w:spacing w:before="400" w:after="120"/>
         <w:pBdr>
           <w:bottom w:val="single" w:sz="6" w:space="4" w:color="B8860B"/>
@@ -1986,62 +1936,6 @@
           <w:sz w:val="21"/>
         </w:rPr>
         <w:t>The Forest of Whispers earns its name at once. The canopy closes overhead until the starlight comes through in coins and slivers, and the wind moving in the leaves makes a long, low murmur, like a crowd whispering just out of sight. The mist thickens around your boots. The air feels charged, the way it does before a storm breaks.</w:t>
-      </w:r>
-    </w:p>
-    <w:p>
-      <w:pPr>
-        <w:keepNext/>
-        <w:spacing w:before="120" w:after="40"/>
-        <w:jc w:val="center"/>
-      </w:pPr>
-      <w:r>
-        <w:drawing>
-          <wp:inline xmlns:a="http://schemas.openxmlformats.org/drawingml/2006/main" xmlns:pic="http://schemas.openxmlformats.org/drawingml/2006/picture">
-            <wp:extent cx="3840480" cy="3840480"/>
-            <wp:docPr id="8" name="Picture 8"/>
-            <wp:cNvGraphicFramePr>
-              <a:graphicFrameLocks noChangeAspect="1"/>
-            </wp:cNvGraphicFramePr>
-            <a:graphic>
-              <a:graphicData uri="http://schemas.openxmlformats.org/drawingml/2006/picture">
-                <pic:pic>
-                  <pic:nvPicPr>
-                    <pic:cNvPr id="0" name="image.jpg"/>
-                    <pic:cNvPicPr/>
-                  </pic:nvPicPr>
-                  <pic:blipFill>
-                    <a:blip r:embed="rId17"/>
-                    <a:stretch>
-                      <a:fillRect/>
-                    </a:stretch>
-                  </pic:blipFill>
-                  <pic:spPr>
-                    <a:xfrm>
-                      <a:off x="0" y="0"/>
-                      <a:ext cx="3840480" cy="3840480"/>
-                    </a:xfrm>
-                    <a:prstGeom prst="rect"/>
-                  </pic:spPr>
-                </pic:pic>
-              </a:graphicData>
-            </a:graphic>
-          </wp:inline>
-        </w:drawing>
-      </w:r>
-    </w:p>
-    <w:p>
-      <w:pPr>
-        <w:spacing w:after="140"/>
-        <w:jc w:val="center"/>
-      </w:pPr>
-      <w:r>
-        <w:rPr>
-          <w:rFonts w:ascii="Georgia" w:hAnsi="Georgia" w:cs="Georgia"/>
-          <w:i/>
-          <w:color w:val="888888"/>
-          <w:sz w:val="18"/>
-        </w:rPr>
-        <w:t>Into the Forest of Whispers.</w:t>
       </w:r>
     </w:p>
     <w:p>
@@ -2191,6 +2085,52 @@
     </w:p>
     <w:p>
       <w:pPr>
+        <w:spacing w:after="0" w:before="0"/>
+      </w:pPr>
+      <w:r>
+        <w:drawing>
+          <wp:anchor xmlns:a="http://schemas.openxmlformats.org/drawingml/2006/main" behindDoc="0" distT="0" distB="0" distL="114300" distR="0" simplePos="0" locked="0" layoutInCell="1" allowOverlap="1" relativeHeight="2">
+            <wp:simplePos x="0" y="0"/>
+            <wp:positionH relativeFrom="column">
+              <wp:align>right</wp:align>
+            </wp:positionH>
+            <wp:positionV relativeFrom="paragraph">
+              <wp:posOffset>0</wp:posOffset>
+            </wp:positionV>
+            <wp:extent cx="2377440" cy="2377440"/>
+            <wp:effectExtent l="0" t="0" r="0" b="0"/>
+            <wp:wrapSquare wrapText="bothSides"/>
+            <wp:docPr id="8" name="Picture 8"/>
+            <wp:cNvGraphicFramePr/>
+            <a:graphic xmlns:pic="http://schemas.openxmlformats.org/drawingml/2006/picture">
+              <a:graphicData uri="http://schemas.openxmlformats.org/drawingml/2006/picture">
+                <pic:pic>
+                  <pic:nvPicPr>
+                    <pic:cNvPr id="0" name="image.jpg"/>
+                    <pic:cNvPicPr/>
+                  </pic:nvPicPr>
+                  <pic:blipFill>
+                    <a:blip r:embed="rId17"/>
+                    <a:stretch>
+                      <a:fillRect/>
+                    </a:stretch>
+                  </pic:blipFill>
+                  <pic:spPr>
+                    <a:xfrm>
+                      <a:off x="0" y="0"/>
+                      <a:ext cx="2377440" cy="2377440"/>
+                    </a:xfrm>
+                    <a:prstGeom prst="rect"/>
+                  </pic:spPr>
+                </pic:pic>
+              </a:graphicData>
+            </a:graphic>
+          </wp:anchor>
+        </w:drawing>
+      </w:r>
+    </w:p>
+    <w:p>
+      <w:pPr>
         <w:pBdr>
           <w:left w:val="single" w:sz="18" w:space="12" w:color="B8860B"/>
         </w:pBdr>
@@ -2267,62 +2207,6 @@
           <w:sz w:val="21"/>
         </w:rPr>
         <w:t xml:space="preserve"> When the party disrupts one of the ancient stones, the gusts falter, and the duel turns.</w:t>
-      </w:r>
-    </w:p>
-    <w:p>
-      <w:pPr>
-        <w:keepNext/>
-        <w:spacing w:before="120" w:after="40"/>
-        <w:jc w:val="center"/>
-      </w:pPr>
-      <w:r>
-        <w:drawing>
-          <wp:inline xmlns:a="http://schemas.openxmlformats.org/drawingml/2006/main" xmlns:pic="http://schemas.openxmlformats.org/drawingml/2006/picture">
-            <wp:extent cx="3657600" cy="3657600"/>
-            <wp:docPr id="9" name="Picture 9"/>
-            <wp:cNvGraphicFramePr>
-              <a:graphicFrameLocks noChangeAspect="1"/>
-            </wp:cNvGraphicFramePr>
-            <a:graphic>
-              <a:graphicData uri="http://schemas.openxmlformats.org/drawingml/2006/picture">
-                <pic:pic>
-                  <pic:nvPicPr>
-                    <pic:cNvPr id="0" name="image.jpg"/>
-                    <pic:cNvPicPr/>
-                  </pic:nvPicPr>
-                  <pic:blipFill>
-                    <a:blip r:embed="rId18"/>
-                    <a:stretch>
-                      <a:fillRect/>
-                    </a:stretch>
-                  </pic:blipFill>
-                  <pic:spPr>
-                    <a:xfrm>
-                      <a:off x="0" y="0"/>
-                      <a:ext cx="3657600" cy="3657600"/>
-                    </a:xfrm>
-                    <a:prstGeom prst="rect"/>
-                  </pic:spPr>
-                </pic:pic>
-              </a:graphicData>
-            </a:graphic>
-          </wp:inline>
-        </w:drawing>
-      </w:r>
-    </w:p>
-    <w:p>
-      <w:pPr>
-        <w:spacing w:after="140"/>
-        <w:jc w:val="center"/>
-      </w:pPr>
-      <w:r>
-        <w:rPr>
-          <w:rFonts w:ascii="Georgia" w:hAnsi="Georgia" w:cs="Georgia"/>
-          <w:i/>
-          <w:color w:val="888888"/>
-          <w:sz w:val="18"/>
-        </w:rPr>
-        <w:t>Duckleaf on the tallest stone, leek raised, the wind wheeling at its command.</w:t>
       </w:r>
     </w:p>
     <w:p>
@@ -2412,6 +2296,52 @@
     </w:p>
     <w:p>
       <w:pPr>
+        <w:spacing w:after="0" w:before="0"/>
+      </w:pPr>
+      <w:r>
+        <w:drawing>
+          <wp:anchor xmlns:a="http://schemas.openxmlformats.org/drawingml/2006/main" behindDoc="0" distT="0" distB="0" distL="114300" distR="0" simplePos="0" locked="0" layoutInCell="1" allowOverlap="1" relativeHeight="2">
+            <wp:simplePos x="0" y="0"/>
+            <wp:positionH relativeFrom="column">
+              <wp:align>right</wp:align>
+            </wp:positionH>
+            <wp:positionV relativeFrom="paragraph">
+              <wp:posOffset>0</wp:posOffset>
+            </wp:positionV>
+            <wp:extent cx="2377440" cy="2377440"/>
+            <wp:effectExtent l="0" t="0" r="0" b="0"/>
+            <wp:wrapSquare wrapText="bothSides"/>
+            <wp:docPr id="9" name="Picture 9"/>
+            <wp:cNvGraphicFramePr/>
+            <a:graphic xmlns:pic="http://schemas.openxmlformats.org/drawingml/2006/picture">
+              <a:graphicData uri="http://schemas.openxmlformats.org/drawingml/2006/picture">
+                <pic:pic>
+                  <pic:nvPicPr>
+                    <pic:cNvPr id="0" name="image.jpg"/>
+                    <pic:cNvPicPr/>
+                  </pic:nvPicPr>
+                  <pic:blipFill>
+                    <a:blip r:embed="rId18"/>
+                    <a:stretch>
+                      <a:fillRect/>
+                    </a:stretch>
+                  </pic:blipFill>
+                  <pic:spPr>
+                    <a:xfrm>
+                      <a:off x="0" y="0"/>
+                      <a:ext cx="2377440" cy="2377440"/>
+                    </a:xfrm>
+                    <a:prstGeom prst="rect"/>
+                  </pic:spPr>
+                </pic:pic>
+              </a:graphicData>
+            </a:graphic>
+          </wp:anchor>
+        </w:drawing>
+      </w:r>
+    </w:p>
+    <w:p>
+      <w:pPr>
         <w:pBdr>
           <w:left w:val="single" w:sz="18" w:space="12" w:color="B8860B"/>
         </w:pBdr>
@@ -2478,62 +2408,6 @@
           <w:sz w:val="21"/>
         </w:rPr>
         <w:t xml:space="preserve"> “You stand upon sacred ground. Prove your strength, or the waters will judge you.”</w:t>
-      </w:r>
-    </w:p>
-    <w:p>
-      <w:pPr>
-        <w:keepNext/>
-        <w:spacing w:before="120" w:after="40"/>
-        <w:jc w:val="center"/>
-      </w:pPr>
-      <w:r>
-        <w:drawing>
-          <wp:inline xmlns:a="http://schemas.openxmlformats.org/drawingml/2006/main" xmlns:pic="http://schemas.openxmlformats.org/drawingml/2006/picture">
-            <wp:extent cx="3657600" cy="3657600"/>
-            <wp:docPr id="10" name="Picture 10"/>
-            <wp:cNvGraphicFramePr>
-              <a:graphicFrameLocks noChangeAspect="1"/>
-            </wp:cNvGraphicFramePr>
-            <a:graphic>
-              <a:graphicData uri="http://schemas.openxmlformats.org/drawingml/2006/picture">
-                <pic:pic>
-                  <pic:nvPicPr>
-                    <pic:cNvPr id="0" name="image.jpg"/>
-                    <pic:cNvPicPr/>
-                  </pic:nvPicPr>
-                  <pic:blipFill>
-                    <a:blip r:embed="rId19"/>
-                    <a:stretch>
-                      <a:fillRect/>
-                    </a:stretch>
-                  </pic:blipFill>
-                  <pic:spPr>
-                    <a:xfrm>
-                      <a:off x="0" y="0"/>
-                      <a:ext cx="3657600" cy="3657600"/>
-                    </a:xfrm>
-                    <a:prstGeom prst="rect"/>
-                  </pic:spPr>
-                </pic:pic>
-              </a:graphicData>
-            </a:graphic>
-          </wp:inline>
-        </w:drawing>
-      </w:r>
-    </w:p>
-    <w:p>
-      <w:pPr>
-        <w:spacing w:after="140"/>
-        <w:jc w:val="center"/>
-      </w:pPr>
-      <w:r>
-        <w:rPr>
-          <w:rFonts w:ascii="Georgia" w:hAnsi="Georgia" w:cs="Georgia"/>
-          <w:i/>
-          <w:color w:val="888888"/>
-          <w:sz w:val="18"/>
-        </w:rPr>
-        <w:t>Cognifin rises above its own reflection in the glowing grove, waters waiting to judge.</w:t>
       </w:r>
     </w:p>
     <w:p>
@@ -2741,6 +2615,52 @@
     </w:p>
     <w:p>
       <w:pPr>
+        <w:spacing w:after="0" w:before="0"/>
+      </w:pPr>
+      <w:r>
+        <w:drawing>
+          <wp:anchor xmlns:a="http://schemas.openxmlformats.org/drawingml/2006/main" behindDoc="0" distT="0" distB="0" distL="114300" distR="0" simplePos="0" locked="0" layoutInCell="1" allowOverlap="1" relativeHeight="2">
+            <wp:simplePos x="0" y="0"/>
+            <wp:positionH relativeFrom="column">
+              <wp:align>right</wp:align>
+            </wp:positionH>
+            <wp:positionV relativeFrom="paragraph">
+              <wp:posOffset>0</wp:posOffset>
+            </wp:positionV>
+            <wp:extent cx="2377440" cy="2377440"/>
+            <wp:effectExtent l="0" t="0" r="0" b="0"/>
+            <wp:wrapSquare wrapText="bothSides"/>
+            <wp:docPr id="10" name="Picture 10"/>
+            <wp:cNvGraphicFramePr/>
+            <a:graphic xmlns:pic="http://schemas.openxmlformats.org/drawingml/2006/picture">
+              <a:graphicData uri="http://schemas.openxmlformats.org/drawingml/2006/picture">
+                <pic:pic>
+                  <pic:nvPicPr>
+                    <pic:cNvPr id="0" name="image.jpg"/>
+                    <pic:cNvPicPr/>
+                  </pic:nvPicPr>
+                  <pic:blipFill>
+                    <a:blip r:embed="rId19"/>
+                    <a:stretch>
+                      <a:fillRect/>
+                    </a:stretch>
+                  </pic:blipFill>
+                  <pic:spPr>
+                    <a:xfrm>
+                      <a:off x="0" y="0"/>
+                      <a:ext cx="2377440" cy="2377440"/>
+                    </a:xfrm>
+                    <a:prstGeom prst="rect"/>
+                  </pic:spPr>
+                </pic:pic>
+              </a:graphicData>
+            </a:graphic>
+          </wp:anchor>
+        </w:drawing>
+      </w:r>
+    </w:p>
+    <w:p>
+      <w:pPr>
         <w:pBdr>
           <w:left w:val="single" w:sz="18" w:space="12" w:color="B8860B"/>
         </w:pBdr>
@@ -2777,62 +2697,6 @@
           <w:sz w:val="21"/>
         </w:rPr>
         <w:t xml:space="preserve"> glimmer where the stalkers fell, swirling briefly before the fog swallows them.</w:t>
-      </w:r>
-    </w:p>
-    <w:p>
-      <w:pPr>
-        <w:keepNext/>
-        <w:spacing w:before="120" w:after="40"/>
-        <w:jc w:val="center"/>
-      </w:pPr>
-      <w:r>
-        <w:drawing>
-          <wp:inline xmlns:a="http://schemas.openxmlformats.org/drawingml/2006/main" xmlns:pic="http://schemas.openxmlformats.org/drawingml/2006/picture">
-            <wp:extent cx="3200400" cy="3200400"/>
-            <wp:docPr id="11" name="Picture 11"/>
-            <wp:cNvGraphicFramePr>
-              <a:graphicFrameLocks noChangeAspect="1"/>
-            </wp:cNvGraphicFramePr>
-            <a:graphic>
-              <a:graphicData uri="http://schemas.openxmlformats.org/drawingml/2006/picture">
-                <pic:pic>
-                  <pic:nvPicPr>
-                    <pic:cNvPr id="0" name="image.jpg"/>
-                    <pic:cNvPicPr/>
-                  </pic:nvPicPr>
-                  <pic:blipFill>
-                    <a:blip r:embed="rId20"/>
-                    <a:stretch>
-                      <a:fillRect/>
-                    </a:stretch>
-                  </pic:blipFill>
-                  <pic:spPr>
-                    <a:xfrm>
-                      <a:off x="0" y="0"/>
-                      <a:ext cx="3200400" cy="3200400"/>
-                    </a:xfrm>
-                    <a:prstGeom prst="rect"/>
-                  </pic:spPr>
-                </pic:pic>
-              </a:graphicData>
-            </a:graphic>
-          </wp:inline>
-        </w:drawing>
-      </w:r>
-    </w:p>
-    <w:p>
-      <w:pPr>
-        <w:spacing w:after="140"/>
-        <w:jc w:val="center"/>
-      </w:pPr>
-      <w:r>
-        <w:rPr>
-          <w:rFonts w:ascii="Georgia" w:hAnsi="Georgia" w:cs="Georgia"/>
-          <w:i/>
-          <w:color w:val="888888"/>
-          <w:sz w:val="18"/>
-        </w:rPr>
-        <w:t>On the fog choked road, the Mist Stalkers hunt by howl and shadow.</w:t>
       </w:r>
     </w:p>
     <w:p>
@@ -2899,8 +2763,8 @@
       <w:r>
         <w:drawing>
           <wp:inline xmlns:a="http://schemas.openxmlformats.org/drawingml/2006/main" xmlns:pic="http://schemas.openxmlformats.org/drawingml/2006/picture">
-            <wp:extent cx="2743200" cy="2743200"/>
-            <wp:docPr id="12" name="Picture 12"/>
+            <wp:extent cx="2468880" cy="2468880"/>
+            <wp:docPr id="11" name="Picture 11"/>
             <wp:cNvGraphicFramePr>
               <a:graphicFrameLocks noChangeAspect="1"/>
             </wp:cNvGraphicFramePr>
@@ -2912,7 +2776,7 @@
                     <pic:cNvPicPr/>
                   </pic:nvPicPr>
                   <pic:blipFill>
-                    <a:blip r:embed="rId21"/>
+                    <a:blip r:embed="rId20"/>
                     <a:stretch>
                       <a:fillRect/>
                     </a:stretch>
@@ -2920,7 +2784,7 @@
                   <pic:spPr>
                     <a:xfrm>
                       <a:off x="0" y="0"/>
-                      <a:ext cx="2743200" cy="2743200"/>
+                      <a:ext cx="2468880" cy="2468880"/>
                     </a:xfrm>
                     <a:prstGeom prst="rect"/>
                   </pic:spPr>

</xml_diff>

<commit_message>
Wire final art: S1 (intro regens, Eldridge, Forest of Whispers), S2 (Oakshade opener, glade, mountain path)
Co-Authored-By: Claude Opus 4.8 <noreply@anthropic.com>
</commit_message>
<xml_diff>
--- a/sessions/session_01_gathering_of_friends.docx
+++ b/sessions/session_01_gathering_of_friends.docx
@@ -241,7 +241,7 @@
       <w:r>
         <w:drawing>
           <wp:inline xmlns:a="http://schemas.openxmlformats.org/drawingml/2006/main" xmlns:pic="http://schemas.openxmlformats.org/drawingml/2006/picture">
-            <wp:extent cx="2743200" cy="2743200"/>
+            <wp:extent cx="2651760" cy="2651760"/>
             <wp:docPr id="1" name="Picture 1"/>
             <wp:cNvGraphicFramePr>
               <a:graphicFrameLocks noChangeAspect="1"/>
@@ -255,6 +255,62 @@
                   </pic:nvPicPr>
                   <pic:blipFill>
                     <a:blip r:embed="rId10"/>
+                    <a:stretch>
+                      <a:fillRect/>
+                    </a:stretch>
+                  </pic:blipFill>
+                  <pic:spPr>
+                    <a:xfrm>
+                      <a:off x="0" y="0"/>
+                      <a:ext cx="2651760" cy="2651760"/>
+                    </a:xfrm>
+                    <a:prstGeom prst="rect"/>
+                  </pic:spPr>
+                </pic:pic>
+              </a:graphicData>
+            </a:graphic>
+          </wp:inline>
+        </w:drawing>
+      </w:r>
+    </w:p>
+    <w:p>
+      <w:pPr>
+        <w:spacing w:after="140"/>
+        <w:jc w:val="center"/>
+      </w:pPr>
+      <w:r>
+        <w:rPr>
+          <w:rFonts w:ascii="Georgia" w:hAnsi="Georgia" w:cs="Georgia"/>
+          <w:i/>
+          <w:color w:val="888888"/>
+          <w:sz w:val="18"/>
+        </w:rPr>
+        <w:t>Eldridge Village at dusk, where our story begins.</w:t>
+      </w:r>
+    </w:p>
+    <w:p>
+      <w:pPr>
+        <w:keepNext/>
+        <w:spacing w:before="120" w:after="40"/>
+        <w:jc w:val="center"/>
+      </w:pPr>
+      <w:r>
+        <w:drawing>
+          <wp:inline xmlns:a="http://schemas.openxmlformats.org/drawingml/2006/main" xmlns:pic="http://schemas.openxmlformats.org/drawingml/2006/picture">
+            <wp:extent cx="2743200" cy="2743200"/>
+            <wp:docPr id="2" name="Picture 2"/>
+            <wp:cNvGraphicFramePr>
+              <a:graphicFrameLocks noChangeAspect="1"/>
+            </wp:cNvGraphicFramePr>
+            <a:graphic>
+              <a:graphicData uri="http://schemas.openxmlformats.org/drawingml/2006/picture">
+                <pic:pic>
+                  <pic:nvPicPr>
+                    <pic:cNvPr id="0" name="image.jpg"/>
+                    <pic:cNvPicPr/>
+                  </pic:nvPicPr>
+                  <pic:blipFill>
+                    <a:blip r:embed="rId11"/>
                     <a:stretch>
                       <a:fillRect/>
                     </a:stretch>
@@ -416,7 +472,7 @@
         <w:drawing>
           <wp:inline xmlns:a="http://schemas.openxmlformats.org/drawingml/2006/main" xmlns:pic="http://schemas.openxmlformats.org/drawingml/2006/picture">
             <wp:extent cx="3657600" cy="3657600"/>
-            <wp:docPr id="2" name="Picture 2"/>
+            <wp:docPr id="3" name="Picture 3"/>
             <wp:cNvGraphicFramePr>
               <a:graphicFrameLocks noChangeAspect="1"/>
             </wp:cNvGraphicFramePr>
@@ -428,7 +484,7 @@
                     <pic:cNvPicPr/>
                   </pic:nvPicPr>
                   <pic:blipFill>
-                    <a:blip r:embed="rId11"/>
+                    <a:blip r:embed="rId12"/>
                     <a:stretch>
                       <a:fillRect/>
                     </a:stretch>
@@ -494,7 +550,7 @@
             <wp:extent cx="2103120" cy="2103120"/>
             <wp:effectExtent l="0" t="0" r="0" b="0"/>
             <wp:wrapSquare wrapText="bothSides"/>
-            <wp:docPr id="3" name="Picture 3"/>
+            <wp:docPr id="4" name="Picture 4"/>
             <wp:cNvGraphicFramePr/>
             <a:graphic xmlns:pic="http://schemas.openxmlformats.org/drawingml/2006/picture">
               <a:graphicData uri="http://schemas.openxmlformats.org/drawingml/2006/picture">
@@ -504,7 +560,7 @@
                     <pic:cNvPicPr/>
                   </pic:nvPicPr>
                   <pic:blipFill>
-                    <a:blip r:embed="rId12"/>
+                    <a:blip r:embed="rId13"/>
                     <a:stretch>
                       <a:fillRect/>
                     </a:stretch>
@@ -760,52 +816,6 @@
     </w:p>
     <w:p>
       <w:pPr>
-        <w:spacing w:after="0" w:before="0"/>
-      </w:pPr>
-      <w:r>
-        <w:drawing>
-          <wp:anchor xmlns:a="http://schemas.openxmlformats.org/drawingml/2006/main" behindDoc="0" distT="0" distB="0" distL="114300" distR="0" simplePos="0" locked="0" layoutInCell="1" allowOverlap="1" relativeHeight="2">
-            <wp:simplePos x="0" y="0"/>
-            <wp:positionH relativeFrom="column">
-              <wp:align>right</wp:align>
-            </wp:positionH>
-            <wp:positionV relativeFrom="paragraph">
-              <wp:posOffset>0</wp:posOffset>
-            </wp:positionV>
-            <wp:extent cx="2103120" cy="2103120"/>
-            <wp:effectExtent l="0" t="0" r="0" b="0"/>
-            <wp:wrapSquare wrapText="bothSides"/>
-            <wp:docPr id="4" name="Picture 4"/>
-            <wp:cNvGraphicFramePr/>
-            <a:graphic xmlns:pic="http://schemas.openxmlformats.org/drawingml/2006/picture">
-              <a:graphicData uri="http://schemas.openxmlformats.org/drawingml/2006/picture">
-                <pic:pic>
-                  <pic:nvPicPr>
-                    <pic:cNvPr id="0" name="image.jpg"/>
-                    <pic:cNvPicPr/>
-                  </pic:nvPicPr>
-                  <pic:blipFill>
-                    <a:blip r:embed="rId13"/>
-                    <a:stretch>
-                      <a:fillRect/>
-                    </a:stretch>
-                  </pic:blipFill>
-                  <pic:spPr>
-                    <a:xfrm>
-                      <a:off x="0" y="0"/>
-                      <a:ext cx="2103120" cy="2103120"/>
-                    </a:xfrm>
-                    <a:prstGeom prst="rect"/>
-                  </pic:spPr>
-                </pic:pic>
-              </a:graphicData>
-            </a:graphic>
-          </wp:anchor>
-        </w:drawing>
-      </w:r>
-    </w:p>
-    <w:p>
-      <w:pPr>
         <w:pBdr>
           <w:left w:val="single" w:sz="18" w:space="12" w:color="B8860B"/>
         </w:pBdr>
@@ -906,101 +916,6 @@
     </w:p>
     <w:p>
       <w:pPr>
-        <w:pBdr>
-          <w:left w:val="single" w:sz="18" w:space="12" w:color="B8860B"/>
-        </w:pBdr>
-        <w:shd w:val="clear" w:color="auto" w:fill="FBF6EA"/>
-        <w:spacing w:before="30" w:after="70"/>
-        <w:ind w:left="340" w:right="340"/>
-      </w:pPr>
-      <w:r>
-        <w:rPr>
-          <w:rFonts w:ascii="Georgia" w:hAnsi="Georgia" w:cs="Georgia"/>
-          <w:b w:val="0"/>
-          <w:i w:val="0"/>
-          <w:color w:val="222222"/>
-          <w:sz w:val="21"/>
-        </w:rPr>
-        <w:t>In the tavern, Ursa spots the silver haired gnome girl at once, and the strange contraption glowing faintly in her lap. He crosses the room, cautious and curious in equal measure.</w:t>
-      </w:r>
-    </w:p>
-    <w:p>
-      <w:pPr>
-        <w:pBdr>
-          <w:left w:val="single" w:sz="18" w:space="12" w:color="B8860B"/>
-        </w:pBdr>
-        <w:shd w:val="clear" w:color="auto" w:fill="FBF6EA"/>
-        <w:spacing w:before="30" w:after="70"/>
-        <w:ind w:left="340" w:right="340"/>
-      </w:pPr>
-      <w:r>
-        <w:rPr>
-          <w:rFonts w:ascii="Georgia" w:hAnsi="Georgia" w:cs="Georgia"/>
-          <w:b/>
-          <w:i w:val="0"/>
-          <w:color w:val="222222"/>
-          <w:sz w:val="21"/>
-        </w:rPr>
-        <w:t>Ursa:</w:t>
-      </w:r>
-      <w:r>
-        <w:rPr>
-          <w:rFonts w:ascii="Georgia" w:hAnsi="Georgia" w:cs="Georgia"/>
-          <w:b w:val="0"/>
-          <w:i w:val="0"/>
-          <w:color w:val="222222"/>
-          <w:sz w:val="21"/>
-        </w:rPr>
-        <w:t xml:space="preserve"> “Are you looking for me?”</w:t>
-      </w:r>
-    </w:p>
-    <w:p>
-      <w:pPr>
-        <w:pBdr>
-          <w:left w:val="single" w:sz="18" w:space="12" w:color="B8860B"/>
-        </w:pBdr>
-        <w:shd w:val="clear" w:color="auto" w:fill="FBF6EA"/>
-        <w:spacing w:before="30" w:after="70"/>
-        <w:ind w:left="340" w:right="340"/>
-      </w:pPr>
-      <w:r>
-        <w:rPr>
-          <w:rFonts w:ascii="Georgia" w:hAnsi="Georgia" w:cs="Georgia"/>
-          <w:b/>
-          <w:i w:val="0"/>
-          <w:color w:val="222222"/>
-          <w:sz w:val="21"/>
-        </w:rPr>
-        <w:t>Lilly:</w:t>
-      </w:r>
-      <w:r>
-        <w:rPr>
-          <w:rFonts w:ascii="Georgia" w:hAnsi="Georgia" w:cs="Georgia"/>
-          <w:b w:val="0"/>
-          <w:i w:val="0"/>
-          <w:color w:val="222222"/>
-          <w:sz w:val="21"/>
-        </w:rPr>
-        <w:t xml:space="preserve"> “Yes! I am Lilly. And I believe you can help me with... this.” She lifts the Essence Sphere. As Ursa leans close, he feels the familiar pull of living magic, but unlike any creature or energy he has ever met. Something is in there. Something waiting.</w:t>
-      </w:r>
-    </w:p>
-    <w:p>
-      <w:pPr>
-        <w:keepNext/>
-        <w:spacing w:before="220" w:after="60"/>
-      </w:pPr>
-      <w:r>
-        <w:rPr>
-          <w:rFonts w:ascii="Georgia" w:hAnsi="Georgia" w:cs="Georgia"/>
-          <w:b/>
-          <w:color w:val="A0522D"/>
-          <w:sz w:val="26"/>
-        </w:rPr>
-        <w:t>Stabby's Grand Entrance</w:t>
-      </w:r>
-    </w:p>
-    <w:p>
-      <w:pPr>
         <w:spacing w:after="0" w:before="0"/>
       </w:pPr>
       <w:r>
@@ -1027,6 +942,147 @@
                   </pic:nvPicPr>
                   <pic:blipFill>
                     <a:blip r:embed="rId14"/>
+                    <a:stretch>
+                      <a:fillRect/>
+                    </a:stretch>
+                  </pic:blipFill>
+                  <pic:spPr>
+                    <a:xfrm>
+                      <a:off x="0" y="0"/>
+                      <a:ext cx="2103120" cy="2103120"/>
+                    </a:xfrm>
+                    <a:prstGeom prst="rect"/>
+                  </pic:spPr>
+                </pic:pic>
+              </a:graphicData>
+            </a:graphic>
+          </wp:anchor>
+        </w:drawing>
+      </w:r>
+    </w:p>
+    <w:p>
+      <w:pPr>
+        <w:pBdr>
+          <w:left w:val="single" w:sz="18" w:space="12" w:color="B8860B"/>
+        </w:pBdr>
+        <w:shd w:val="clear" w:color="auto" w:fill="FBF6EA"/>
+        <w:spacing w:before="30" w:after="70"/>
+        <w:ind w:left="340" w:right="340"/>
+      </w:pPr>
+      <w:r>
+        <w:rPr>
+          <w:rFonts w:ascii="Georgia" w:hAnsi="Georgia" w:cs="Georgia"/>
+          <w:b w:val="0"/>
+          <w:i w:val="0"/>
+          <w:color w:val="222222"/>
+          <w:sz w:val="21"/>
+        </w:rPr>
+        <w:t>In the tavern, Ursa spots the silver haired gnome girl at once, and the strange contraption glowing faintly in her lap. He crosses the room, cautious and curious in equal measure.</w:t>
+      </w:r>
+    </w:p>
+    <w:p>
+      <w:pPr>
+        <w:pBdr>
+          <w:left w:val="single" w:sz="18" w:space="12" w:color="B8860B"/>
+        </w:pBdr>
+        <w:shd w:val="clear" w:color="auto" w:fill="FBF6EA"/>
+        <w:spacing w:before="30" w:after="70"/>
+        <w:ind w:left="340" w:right="340"/>
+      </w:pPr>
+      <w:r>
+        <w:rPr>
+          <w:rFonts w:ascii="Georgia" w:hAnsi="Georgia" w:cs="Georgia"/>
+          <w:b/>
+          <w:i w:val="0"/>
+          <w:color w:val="222222"/>
+          <w:sz w:val="21"/>
+        </w:rPr>
+        <w:t>Ursa:</w:t>
+      </w:r>
+      <w:r>
+        <w:rPr>
+          <w:rFonts w:ascii="Georgia" w:hAnsi="Georgia" w:cs="Georgia"/>
+          <w:b w:val="0"/>
+          <w:i w:val="0"/>
+          <w:color w:val="222222"/>
+          <w:sz w:val="21"/>
+        </w:rPr>
+        <w:t xml:space="preserve"> “Are you looking for me?”</w:t>
+      </w:r>
+    </w:p>
+    <w:p>
+      <w:pPr>
+        <w:pBdr>
+          <w:left w:val="single" w:sz="18" w:space="12" w:color="B8860B"/>
+        </w:pBdr>
+        <w:shd w:val="clear" w:color="auto" w:fill="FBF6EA"/>
+        <w:spacing w:before="30" w:after="70"/>
+        <w:ind w:left="340" w:right="340"/>
+      </w:pPr>
+      <w:r>
+        <w:rPr>
+          <w:rFonts w:ascii="Georgia" w:hAnsi="Georgia" w:cs="Georgia"/>
+          <w:b/>
+          <w:i w:val="0"/>
+          <w:color w:val="222222"/>
+          <w:sz w:val="21"/>
+        </w:rPr>
+        <w:t>Lilly:</w:t>
+      </w:r>
+      <w:r>
+        <w:rPr>
+          <w:rFonts w:ascii="Georgia" w:hAnsi="Georgia" w:cs="Georgia"/>
+          <w:b w:val="0"/>
+          <w:i w:val="0"/>
+          <w:color w:val="222222"/>
+          <w:sz w:val="21"/>
+        </w:rPr>
+        <w:t xml:space="preserve"> “Yes! I am Lilly. And I believe you can help me with... this.” She lifts the Essence Sphere. As Ursa leans close, he feels the familiar pull of living magic, but unlike any creature or energy he has ever met. Something is in there. Something waiting.</w:t>
+      </w:r>
+    </w:p>
+    <w:p>
+      <w:pPr>
+        <w:keepNext/>
+        <w:spacing w:before="220" w:after="60"/>
+      </w:pPr>
+      <w:r>
+        <w:rPr>
+          <w:rFonts w:ascii="Georgia" w:hAnsi="Georgia" w:cs="Georgia"/>
+          <w:b/>
+          <w:color w:val="A0522D"/>
+          <w:sz w:val="26"/>
+        </w:rPr>
+        <w:t>Stabby's Grand Entrance</w:t>
+      </w:r>
+    </w:p>
+    <w:p>
+      <w:pPr>
+        <w:spacing w:after="0" w:before="0"/>
+      </w:pPr>
+      <w:r>
+        <w:drawing>
+          <wp:anchor xmlns:a="http://schemas.openxmlformats.org/drawingml/2006/main" behindDoc="0" distT="0" distB="0" distL="114300" distR="0" simplePos="0" locked="0" layoutInCell="1" allowOverlap="1" relativeHeight="2">
+            <wp:simplePos x="0" y="0"/>
+            <wp:positionH relativeFrom="column">
+              <wp:align>right</wp:align>
+            </wp:positionH>
+            <wp:positionV relativeFrom="paragraph">
+              <wp:posOffset>0</wp:posOffset>
+            </wp:positionV>
+            <wp:extent cx="2103120" cy="2103120"/>
+            <wp:effectExtent l="0" t="0" r="0" b="0"/>
+            <wp:wrapSquare wrapText="bothSides"/>
+            <wp:docPr id="6" name="Picture 6"/>
+            <wp:cNvGraphicFramePr/>
+            <a:graphic xmlns:pic="http://schemas.openxmlformats.org/drawingml/2006/picture">
+              <a:graphicData uri="http://schemas.openxmlformats.org/drawingml/2006/picture">
+                <pic:pic>
+                  <pic:nvPicPr>
+                    <pic:cNvPr id="0" name="image.jpg"/>
+                    <pic:cNvPicPr/>
+                  </pic:nvPicPr>
+                  <pic:blipFill>
+                    <a:blip r:embed="rId15"/>
                     <a:stretch>
                       <a:fillRect/>
                     </a:stretch>
@@ -1487,225 +1543,6 @@
             <wp:extent cx="2560320" cy="2560320"/>
             <wp:effectExtent l="0" t="0" r="0" b="0"/>
             <wp:wrapSquare wrapText="bothSides"/>
-            <wp:docPr id="6" name="Picture 6"/>
-            <wp:cNvGraphicFramePr/>
-            <a:graphic xmlns:pic="http://schemas.openxmlformats.org/drawingml/2006/picture">
-              <a:graphicData uri="http://schemas.openxmlformats.org/drawingml/2006/picture">
-                <pic:pic>
-                  <pic:nvPicPr>
-                    <pic:cNvPr id="0" name="image.jpg"/>
-                    <pic:cNvPicPr/>
-                  </pic:nvPicPr>
-                  <pic:blipFill>
-                    <a:blip r:embed="rId15"/>
-                    <a:stretch>
-                      <a:fillRect/>
-                    </a:stretch>
-                  </pic:blipFill>
-                  <pic:spPr>
-                    <a:xfrm>
-                      <a:off x="0" y="0"/>
-                      <a:ext cx="2560320" cy="2560320"/>
-                    </a:xfrm>
-                    <a:prstGeom prst="rect"/>
-                  </pic:spPr>
-                </pic:pic>
-              </a:graphicData>
-            </a:graphic>
-          </wp:anchor>
-        </w:drawing>
-      </w:r>
-    </w:p>
-    <w:p>
-      <w:pPr>
-        <w:pBdr>
-          <w:left w:val="single" w:sz="18" w:space="12" w:color="B8860B"/>
-        </w:pBdr>
-        <w:shd w:val="clear" w:color="auto" w:fill="FBF6EA"/>
-        <w:spacing w:before="30" w:after="70"/>
-        <w:ind w:left="340" w:right="340"/>
-      </w:pPr>
-      <w:r>
-        <w:rPr>
-          <w:rFonts w:ascii="Georgia" w:hAnsi="Georgia" w:cs="Georgia"/>
-          <w:b w:val="0"/>
-          <w:i w:val="0"/>
-          <w:color w:val="222222"/>
-          <w:sz w:val="21"/>
-        </w:rPr>
-        <w:t>It is short, loud, and glorious. Stabby fights like a rumor: everywhere and nowhere. Lilly's gadgets spark and startle. Ursa never even stands up all the way. When Bren finally sits down hard, rubbing his jaw, the whole tavern is laughing, and so, almost, is he.</w:t>
-      </w:r>
-    </w:p>
-    <w:p>
-      <w:pPr>
-        <w:pBdr>
-          <w:left w:val="single" w:sz="18" w:space="12" w:color="B8860B"/>
-        </w:pBdr>
-        <w:shd w:val="clear" w:color="auto" w:fill="FBF6EA"/>
-        <w:spacing w:before="30" w:after="70"/>
-        <w:ind w:left="340" w:right="340"/>
-      </w:pPr>
-      <w:r>
-        <w:rPr>
-          <w:rFonts w:ascii="Georgia" w:hAnsi="Georgia" w:cs="Georgia"/>
-          <w:b/>
-          <w:i w:val="0"/>
-          <w:color w:val="222222"/>
-          <w:sz w:val="21"/>
-        </w:rPr>
-        <w:t>Bren:</w:t>
-      </w:r>
-      <w:r>
-        <w:rPr>
-          <w:rFonts w:ascii="Georgia" w:hAnsi="Georgia" w:cs="Georgia"/>
-          <w:b w:val="0"/>
-          <w:i w:val="0"/>
-          <w:color w:val="222222"/>
-          <w:sz w:val="21"/>
-        </w:rPr>
-        <w:t xml:space="preserve"> “Agh... fine. Maybe you are tougher than you look.”</w:t>
-      </w:r>
-    </w:p>
-    <w:p>
-      <w:pPr>
-        <w:pBdr>
-          <w:left w:val="single" w:sz="18" w:space="12" w:color="B8860B"/>
-        </w:pBdr>
-        <w:shd w:val="clear" w:color="auto" w:fill="FBF6EA"/>
-        <w:spacing w:before="30" w:after="70"/>
-        <w:ind w:left="340" w:right="340"/>
-      </w:pPr>
-      <w:r>
-        <w:rPr>
-          <w:rFonts w:ascii="Georgia" w:hAnsi="Georgia" w:cs="Georgia"/>
-          <w:b/>
-          <w:i w:val="0"/>
-          <w:color w:val="222222"/>
-          <w:sz w:val="21"/>
-        </w:rPr>
-        <w:t>Osric</w:t>
-      </w:r>
-      <w:r>
-        <w:rPr>
-          <w:rFonts w:ascii="Georgia" w:hAnsi="Georgia" w:cs="Georgia"/>
-          <w:b w:val="0"/>
-          <w:i w:val="0"/>
-          <w:color w:val="222222"/>
-          <w:sz w:val="21"/>
-        </w:rPr>
-        <w:t xml:space="preserve"> claps his hands over the noise. “Alright, that is enough! Bren, leave these folks alone before I toss you out!” He sets a fresh round before the three young strangers, on the house. “Sorry about that. But I can see you lot handle yourselves. If you are heading into the forest, you will need that strength. There are more dangerous things out there than Bren, I promise you that. Something is stirring near the Forest of Whispers. And it is not just the wind.”</w:t>
-      </w:r>
-    </w:p>
-    <w:p>
-      <w:pPr>
-        <w:pBdr>
-          <w:left w:val="single" w:sz="18" w:space="12" w:color="B8860B"/>
-        </w:pBdr>
-        <w:shd w:val="clear" w:color="auto" w:fill="FBF6EA"/>
-        <w:spacing w:before="30" w:after="70"/>
-        <w:ind w:left="340" w:right="340"/>
-      </w:pPr>
-      <w:r>
-        <w:rPr>
-          <w:rFonts w:ascii="Georgia" w:hAnsi="Georgia" w:cs="Georgia"/>
-          <w:b w:val="0"/>
-          <w:i w:val="0"/>
-          <w:color w:val="222222"/>
-          <w:sz w:val="21"/>
-        </w:rPr>
-        <w:t>Three strangers walked into the Gilded Acorn tonight. It is a party of adventurers that walks out, under a sky thick with watching stars.</w:t>
-      </w:r>
-    </w:p>
-    <w:p>
-      <w:pPr>
-        <w:keepNext/>
-        <w:spacing w:before="400" w:after="120"/>
-        <w:pBdr>
-          <w:bottom w:val="single" w:sz="6" w:space="4" w:color="B8860B"/>
-        </w:pBdr>
-      </w:pPr>
-      <w:r>
-        <w:rPr>
-          <w:rFonts w:ascii="Georgia" w:hAnsi="Georgia" w:cs="Georgia"/>
-          <w:b/>
-          <w:color w:val="B8860B"/>
-          <w:sz w:val="32"/>
-        </w:rPr>
-        <w:t>Part Two: The Whispering Pond</w:t>
-      </w:r>
-    </w:p>
-    <w:p>
-      <w:pPr>
-        <w:spacing w:before="120" w:after="200"/>
-      </w:pPr>
-      <w:r>
-        <w:rPr>
-          <w:rFonts w:ascii="Georgia" w:hAnsi="Georgia" w:cs="Georgia"/>
-          <w:b w:val="0"/>
-          <w:i/>
-          <w:color w:val="222222"/>
-          <w:sz w:val="21"/>
-        </w:rPr>
-        <w:t>The new friends left the warm noise of the tavern behind and followed the path toward the forest, drawn by rumor and the glow of adventure.</w:t>
-      </w:r>
-    </w:p>
-    <w:p>
-      <w:pPr>
-        <w:pBdr>
-          <w:left w:val="single" w:sz="18" w:space="12" w:color="B8860B"/>
-        </w:pBdr>
-        <w:shd w:val="clear" w:color="auto" w:fill="FBF6EA"/>
-        <w:spacing w:before="30" w:after="70"/>
-        <w:ind w:left="340" w:right="340"/>
-      </w:pPr>
-      <w:r>
-        <w:rPr>
-          <w:rFonts w:ascii="Georgia" w:hAnsi="Georgia" w:cs="Georgia"/>
-          <w:b w:val="0"/>
-          <w:i w:val="0"/>
-          <w:color w:val="222222"/>
-          <w:sz w:val="21"/>
-        </w:rPr>
-        <w:t>Beyond the last cottages, the night turns soft and silver. Mist rolls in from the treeline, and the path bends past a small pond ringed with reeds and wildflowers. The water holds the starlight strangely, glowing faintly from below, and here the air shivers, as though the world's fabric is worn thin as old cloth.</w:t>
-      </w:r>
-    </w:p>
-    <w:p>
-      <w:pPr>
-        <w:pBdr>
-          <w:left w:val="single" w:sz="18" w:space="12" w:color="5B2A86"/>
-        </w:pBdr>
-        <w:shd w:val="clear" w:color="auto" w:fill="F4F0FA"/>
-        <w:spacing w:before="30" w:after="70"/>
-        <w:ind w:left="340" w:right="340"/>
-      </w:pPr>
-      <w:r>
-        <w:rPr>
-          <w:rFonts w:ascii="Georgia" w:hAnsi="Georgia" w:cs="Georgia"/>
-          <w:b w:val="0"/>
-          <w:i w:val="0"/>
-          <w:color w:val="222222"/>
-          <w:sz w:val="19"/>
-        </w:rPr>
-        <w:t>▶ Wisdom (Perception) DC 12 to spot a glimmering light moving in the reeds.</w:t>
-      </w:r>
-    </w:p>
-    <w:p>
-      <w:pPr>
-        <w:spacing w:after="0" w:before="0"/>
-      </w:pPr>
-      <w:r>
-        <w:drawing>
-          <wp:anchor xmlns:a="http://schemas.openxmlformats.org/drawingml/2006/main" behindDoc="0" distT="0" distB="0" distL="114300" distR="0" simplePos="0" locked="0" layoutInCell="1" allowOverlap="1" relativeHeight="2">
-            <wp:simplePos x="0" y="0"/>
-            <wp:positionH relativeFrom="column">
-              <wp:align>right</wp:align>
-            </wp:positionH>
-            <wp:positionV relativeFrom="paragraph">
-              <wp:posOffset>0</wp:posOffset>
-            </wp:positionV>
-            <wp:extent cx="2560320" cy="2560320"/>
-            <wp:effectExtent l="0" t="0" r="0" b="0"/>
-            <wp:wrapSquare wrapText="bothSides"/>
             <wp:docPr id="7" name="Picture 7"/>
             <wp:cNvGraphicFramePr/>
             <a:graphic xmlns:pic="http://schemas.openxmlformats.org/drawingml/2006/picture">
@@ -1752,7 +1589,226 @@
           <w:color w:val="222222"/>
           <w:sz w:val="21"/>
         </w:rPr>
+        <w:t>It is short, loud, and glorious. Stabby fights like a rumor: everywhere and nowhere. Lilly's gadgets spark and startle. Ursa never even stands up all the way. When Bren finally sits down hard, rubbing his jaw, the whole tavern is laughing, and so, almost, is he.</w:t>
+      </w:r>
+    </w:p>
+    <w:p>
+      <w:pPr>
+        <w:pBdr>
+          <w:left w:val="single" w:sz="18" w:space="12" w:color="B8860B"/>
+        </w:pBdr>
+        <w:shd w:val="clear" w:color="auto" w:fill="FBF6EA"/>
+        <w:spacing w:before="30" w:after="70"/>
+        <w:ind w:left="340" w:right="340"/>
+      </w:pPr>
+      <w:r>
+        <w:rPr>
+          <w:rFonts w:ascii="Georgia" w:hAnsi="Georgia" w:cs="Georgia"/>
+          <w:b/>
+          <w:i w:val="0"/>
+          <w:color w:val="222222"/>
+          <w:sz w:val="21"/>
+        </w:rPr>
+        <w:t>Bren:</w:t>
+      </w:r>
+      <w:r>
+        <w:rPr>
+          <w:rFonts w:ascii="Georgia" w:hAnsi="Georgia" w:cs="Georgia"/>
+          <w:b w:val="0"/>
+          <w:i w:val="0"/>
+          <w:color w:val="222222"/>
+          <w:sz w:val="21"/>
+        </w:rPr>
+        <w:t xml:space="preserve"> “Agh... fine. Maybe you are tougher than you look.”</w:t>
+      </w:r>
+    </w:p>
+    <w:p>
+      <w:pPr>
+        <w:pBdr>
+          <w:left w:val="single" w:sz="18" w:space="12" w:color="B8860B"/>
+        </w:pBdr>
+        <w:shd w:val="clear" w:color="auto" w:fill="FBF6EA"/>
+        <w:spacing w:before="30" w:after="70"/>
+        <w:ind w:left="340" w:right="340"/>
+      </w:pPr>
+      <w:r>
+        <w:rPr>
+          <w:rFonts w:ascii="Georgia" w:hAnsi="Georgia" w:cs="Georgia"/>
+          <w:b/>
+          <w:i w:val="0"/>
+          <w:color w:val="222222"/>
+          <w:sz w:val="21"/>
+        </w:rPr>
+        <w:t>Osric</w:t>
+      </w:r>
+      <w:r>
+        <w:rPr>
+          <w:rFonts w:ascii="Georgia" w:hAnsi="Georgia" w:cs="Georgia"/>
+          <w:b w:val="0"/>
+          <w:i w:val="0"/>
+          <w:color w:val="222222"/>
+          <w:sz w:val="21"/>
+        </w:rPr>
+        <w:t xml:space="preserve"> claps his hands over the noise. “Alright, that is enough! Bren, leave these folks alone before I toss you out!” He sets a fresh round before the three young strangers, on the house. “Sorry about that. But I can see you lot handle yourselves. If you are heading into the forest, you will need that strength. There are more dangerous things out there than Bren, I promise you that. Something is stirring near the Forest of Whispers. And it is not just the wind.”</w:t>
+      </w:r>
+    </w:p>
+    <w:p>
+      <w:pPr>
+        <w:pBdr>
+          <w:left w:val="single" w:sz="18" w:space="12" w:color="B8860B"/>
+        </w:pBdr>
+        <w:shd w:val="clear" w:color="auto" w:fill="FBF6EA"/>
+        <w:spacing w:before="30" w:after="70"/>
+        <w:ind w:left="340" w:right="340"/>
+      </w:pPr>
+      <w:r>
+        <w:rPr>
+          <w:rFonts w:ascii="Georgia" w:hAnsi="Georgia" w:cs="Georgia"/>
+          <w:b w:val="0"/>
+          <w:i w:val="0"/>
+          <w:color w:val="222222"/>
+          <w:sz w:val="21"/>
+        </w:rPr>
+        <w:t>Three strangers walked into the Gilded Acorn tonight. It is a party of adventurers that walks out, under a sky thick with watching stars.</w:t>
+      </w:r>
+    </w:p>
+    <w:p>
+      <w:pPr>
+        <w:keepNext/>
+        <w:spacing w:before="400" w:after="120"/>
+        <w:pBdr>
+          <w:bottom w:val="single" w:sz="6" w:space="4" w:color="B8860B"/>
+        </w:pBdr>
+      </w:pPr>
+      <w:r>
+        <w:rPr>
+          <w:rFonts w:ascii="Georgia" w:hAnsi="Georgia" w:cs="Georgia"/>
+          <w:b/>
+          <w:color w:val="B8860B"/>
+          <w:sz w:val="32"/>
+        </w:rPr>
+        <w:t>Part Two: The Whispering Pond</w:t>
+      </w:r>
+    </w:p>
+    <w:p>
+      <w:pPr>
+        <w:spacing w:before="120" w:after="200"/>
+      </w:pPr>
+      <w:r>
+        <w:rPr>
+          <w:rFonts w:ascii="Georgia" w:hAnsi="Georgia" w:cs="Georgia"/>
+          <w:b w:val="0"/>
+          <w:i/>
+          <w:color w:val="222222"/>
+          <w:sz w:val="21"/>
+        </w:rPr>
+        <w:t>The new friends left the warm noise of the tavern behind and followed the path toward the forest, drawn by rumor and the glow of adventure.</w:t>
+      </w:r>
+    </w:p>
+    <w:p>
+      <w:pPr>
+        <w:pBdr>
+          <w:left w:val="single" w:sz="18" w:space="12" w:color="B8860B"/>
+        </w:pBdr>
+        <w:shd w:val="clear" w:color="auto" w:fill="FBF6EA"/>
+        <w:spacing w:before="30" w:after="70"/>
+        <w:ind w:left="340" w:right="340"/>
+      </w:pPr>
+      <w:r>
+        <w:rPr>
+          <w:rFonts w:ascii="Georgia" w:hAnsi="Georgia" w:cs="Georgia"/>
+          <w:b w:val="0"/>
+          <w:i w:val="0"/>
+          <w:color w:val="222222"/>
+          <w:sz w:val="21"/>
+        </w:rPr>
+        <w:t>Beyond the last cottages, the night turns soft and silver. Mist rolls in from the treeline, and the path bends past a small pond ringed with reeds and wildflowers. The water holds the starlight strangely, glowing faintly from below, and here the air shivers, as though the world's fabric is worn thin as old cloth.</w:t>
+      </w:r>
+    </w:p>
+    <w:p>
+      <w:pPr>
+        <w:pBdr>
+          <w:left w:val="single" w:sz="18" w:space="12" w:color="5B2A86"/>
+        </w:pBdr>
+        <w:shd w:val="clear" w:color="auto" w:fill="F4F0FA"/>
+        <w:spacing w:before="30" w:after="70"/>
+        <w:ind w:left="340" w:right="340"/>
+      </w:pPr>
+      <w:r>
+        <w:rPr>
+          <w:rFonts w:ascii="Georgia" w:hAnsi="Georgia" w:cs="Georgia"/>
+          <w:b w:val="0"/>
+          <w:i w:val="0"/>
+          <w:color w:val="222222"/>
+          <w:sz w:val="19"/>
+        </w:rPr>
+        <w:t>▶ Wisdom (Perception) DC 12 to spot a glimmering light moving in the reeds.</w:t>
+      </w:r>
+    </w:p>
+    <w:p>
+      <w:pPr>
+        <w:pBdr>
+          <w:left w:val="single" w:sz="18" w:space="12" w:color="B8860B"/>
+        </w:pBdr>
+        <w:shd w:val="clear" w:color="auto" w:fill="FBF6EA"/>
+        <w:spacing w:before="30" w:after="70"/>
+        <w:ind w:left="340" w:right="340"/>
+      </w:pPr>
+      <w:r>
+        <w:rPr>
+          <w:rFonts w:ascii="Georgia" w:hAnsi="Georgia" w:cs="Georgia"/>
+          <w:b w:val="0"/>
+          <w:i w:val="0"/>
+          <w:color w:val="222222"/>
+          <w:sz w:val="21"/>
+        </w:rPr>
         <w:t>Something small is moving at the water's edge. It is round bodied, about the size of a halfling, with faintly shimmering skin, enormous curious eyes, and a tongue longer than it is tall, which flicks out to taste the pond, then a wildflower, then the air in the party's direction. Around it the reeds sway toward it like friends leaning in, and the colors of the night seem brighter, dreamlike, wherever it goes.</w:t>
+      </w:r>
+    </w:p>
+    <w:p>
+      <w:pPr>
+        <w:spacing w:after="0" w:before="0"/>
+      </w:pPr>
+      <w:r>
+        <w:drawing>
+          <wp:anchor xmlns:a="http://schemas.openxmlformats.org/drawingml/2006/main" behindDoc="0" distT="0" distB="0" distL="114300" distR="0" simplePos="0" locked="0" layoutInCell="1" allowOverlap="1" relativeHeight="2">
+            <wp:simplePos x="0" y="0"/>
+            <wp:positionH relativeFrom="column">
+              <wp:align>right</wp:align>
+            </wp:positionH>
+            <wp:positionV relativeFrom="paragraph">
+              <wp:posOffset>0</wp:posOffset>
+            </wp:positionV>
+            <wp:extent cx="2560320" cy="2560320"/>
+            <wp:effectExtent l="0" t="0" r="0" b="0"/>
+            <wp:wrapSquare wrapText="bothSides"/>
+            <wp:docPr id="8" name="Picture 8"/>
+            <wp:cNvGraphicFramePr/>
+            <a:graphic xmlns:pic="http://schemas.openxmlformats.org/drawingml/2006/picture">
+              <a:graphicData uri="http://schemas.openxmlformats.org/drawingml/2006/picture">
+                <pic:pic>
+                  <pic:nvPicPr>
+                    <pic:cNvPr id="0" name="image.jpg"/>
+                    <pic:cNvPicPr/>
+                  </pic:nvPicPr>
+                  <pic:blipFill>
+                    <a:blip r:embed="rId17"/>
+                    <a:stretch>
+                      <a:fillRect/>
+                    </a:stretch>
+                  </pic:blipFill>
+                  <pic:spPr>
+                    <a:xfrm>
+                      <a:off x="0" y="0"/>
+                      <a:ext cx="2560320" cy="2560320"/>
+                    </a:xfrm>
+                    <a:prstGeom prst="rect"/>
+                  </pic:spPr>
+                </pic:pic>
+              </a:graphicData>
+            </a:graphic>
+          </wp:anchor>
+        </w:drawing>
       </w:r>
     </w:p>
     <w:p>
@@ -1941,6 +1997,62 @@
     <w:p>
       <w:pPr>
         <w:keepNext/>
+        <w:spacing w:before="120" w:after="40"/>
+        <w:jc w:val="center"/>
+      </w:pPr>
+      <w:r>
+        <w:drawing>
+          <wp:inline xmlns:a="http://schemas.openxmlformats.org/drawingml/2006/main" xmlns:pic="http://schemas.openxmlformats.org/drawingml/2006/picture">
+            <wp:extent cx="3383280" cy="3383280"/>
+            <wp:docPr id="9" name="Picture 9"/>
+            <wp:cNvGraphicFramePr>
+              <a:graphicFrameLocks noChangeAspect="1"/>
+            </wp:cNvGraphicFramePr>
+            <a:graphic>
+              <a:graphicData uri="http://schemas.openxmlformats.org/drawingml/2006/picture">
+                <pic:pic>
+                  <pic:nvPicPr>
+                    <pic:cNvPr id="0" name="image.jpg"/>
+                    <pic:cNvPicPr/>
+                  </pic:nvPicPr>
+                  <pic:blipFill>
+                    <a:blip r:embed="rId18"/>
+                    <a:stretch>
+                      <a:fillRect/>
+                    </a:stretch>
+                  </pic:blipFill>
+                  <pic:spPr>
+                    <a:xfrm>
+                      <a:off x="0" y="0"/>
+                      <a:ext cx="3383280" cy="3383280"/>
+                    </a:xfrm>
+                    <a:prstGeom prst="rect"/>
+                  </pic:spPr>
+                </pic:pic>
+              </a:graphicData>
+            </a:graphic>
+          </wp:inline>
+        </w:drawing>
+      </w:r>
+    </w:p>
+    <w:p>
+      <w:pPr>
+        <w:spacing w:after="140"/>
+        <w:jc w:val="center"/>
+      </w:pPr>
+      <w:r>
+        <w:rPr>
+          <w:rFonts w:ascii="Georgia" w:hAnsi="Georgia" w:cs="Georgia"/>
+          <w:i/>
+          <w:color w:val="888888"/>
+          <w:sz w:val="18"/>
+        </w:rPr>
+        <w:t>Beneath the eaves of the Forest of Whispers, where the starlight comes through in coins and slivers.</w:t>
+      </w:r>
+    </w:p>
+    <w:p>
+      <w:pPr>
+        <w:keepNext/>
         <w:spacing w:before="220" w:after="60"/>
       </w:pPr>
       <w:r>
@@ -2100,7 +2212,7 @@
             <wp:extent cx="2377440" cy="2377440"/>
             <wp:effectExtent l="0" t="0" r="0" b="0"/>
             <wp:wrapSquare wrapText="bothSides"/>
-            <wp:docPr id="8" name="Picture 8"/>
+            <wp:docPr id="10" name="Picture 10"/>
             <wp:cNvGraphicFramePr/>
             <a:graphic xmlns:pic="http://schemas.openxmlformats.org/drawingml/2006/picture">
               <a:graphicData uri="http://schemas.openxmlformats.org/drawingml/2006/picture">
@@ -2110,7 +2222,7 @@
                     <pic:cNvPicPr/>
                   </pic:nvPicPr>
                   <pic:blipFill>
-                    <a:blip r:embed="rId17"/>
+                    <a:blip r:embed="rId19"/>
                     <a:stretch>
                       <a:fillRect/>
                     </a:stretch>
@@ -2311,7 +2423,7 @@
             <wp:extent cx="2377440" cy="2377440"/>
             <wp:effectExtent l="0" t="0" r="0" b="0"/>
             <wp:wrapSquare wrapText="bothSides"/>
-            <wp:docPr id="9" name="Picture 9"/>
+            <wp:docPr id="11" name="Picture 11"/>
             <wp:cNvGraphicFramePr/>
             <a:graphic xmlns:pic="http://schemas.openxmlformats.org/drawingml/2006/picture">
               <a:graphicData uri="http://schemas.openxmlformats.org/drawingml/2006/picture">
@@ -2321,7 +2433,7 @@
                     <pic:cNvPicPr/>
                   </pic:nvPicPr>
                   <pic:blipFill>
-                    <a:blip r:embed="rId18"/>
+                    <a:blip r:embed="rId20"/>
                     <a:stretch>
                       <a:fillRect/>
                     </a:stretch>
@@ -2630,7 +2742,7 @@
             <wp:extent cx="2377440" cy="2377440"/>
             <wp:effectExtent l="0" t="0" r="0" b="0"/>
             <wp:wrapSquare wrapText="bothSides"/>
-            <wp:docPr id="10" name="Picture 10"/>
+            <wp:docPr id="12" name="Picture 12"/>
             <wp:cNvGraphicFramePr/>
             <a:graphic xmlns:pic="http://schemas.openxmlformats.org/drawingml/2006/picture">
               <a:graphicData uri="http://schemas.openxmlformats.org/drawingml/2006/picture">
@@ -2640,7 +2752,7 @@
                     <pic:cNvPicPr/>
                   </pic:nvPicPr>
                   <pic:blipFill>
-                    <a:blip r:embed="rId19"/>
+                    <a:blip r:embed="rId21"/>
                     <a:stretch>
                       <a:fillRect/>
                     </a:stretch>
@@ -2756,6 +2868,26 @@
     </w:p>
     <w:p>
       <w:pPr>
+        <w:pBdr>
+          <w:left w:val="single" w:sz="18" w:space="12" w:color="B8860B"/>
+        </w:pBdr>
+        <w:shd w:val="clear" w:color="auto" w:fill="FBF6EA"/>
+        <w:spacing w:before="30" w:after="70"/>
+        <w:ind w:left="340" w:right="340"/>
+      </w:pPr>
+      <w:r>
+        <w:rPr>
+          <w:rFonts w:ascii="Georgia" w:hAnsi="Georgia" w:cs="Georgia"/>
+          <w:b w:val="0"/>
+          <w:i w:val="0"/>
+          <w:color w:val="222222"/>
+          <w:sz w:val="21"/>
+        </w:rPr>
+        <w:t>It should feel peaceful. It almost does. But the villagers walk quickly, and their eyes keep sliding to the forest's edge, as if the trees might follow them home.</w:t>
+      </w:r>
+    </w:p>
+    <w:p>
+      <w:pPr>
         <w:keepNext/>
         <w:spacing w:before="120" w:after="40"/>
         <w:jc w:val="center"/>
@@ -2763,8 +2895,8 @@
       <w:r>
         <w:drawing>
           <wp:inline xmlns:a="http://schemas.openxmlformats.org/drawingml/2006/main" xmlns:pic="http://schemas.openxmlformats.org/drawingml/2006/picture">
-            <wp:extent cx="2468880" cy="2468880"/>
-            <wp:docPr id="11" name="Picture 11"/>
+            <wp:extent cx="2194560" cy="2194560"/>
+            <wp:docPr id="13" name="Picture 13"/>
             <wp:cNvGraphicFramePr>
               <a:graphicFrameLocks noChangeAspect="1"/>
             </wp:cNvGraphicFramePr>
@@ -2776,7 +2908,7 @@
                     <pic:cNvPicPr/>
                   </pic:nvPicPr>
                   <pic:blipFill>
-                    <a:blip r:embed="rId20"/>
+                    <a:blip r:embed="rId22"/>
                     <a:stretch>
                       <a:fillRect/>
                     </a:stretch>
@@ -2784,7 +2916,7 @@
                   <pic:spPr>
                     <a:xfrm>
                       <a:off x="0" y="0"/>
-                      <a:ext cx="2468880" cy="2468880"/>
+                      <a:ext cx="2194560" cy="2194560"/>
                     </a:xfrm>
                     <a:prstGeom prst="rect"/>
                   </pic:spPr>
@@ -2808,26 +2940,6 @@
           <w:sz w:val="18"/>
         </w:rPr>
         <w:t>Oakshade at twilight, its cottages tucked in the pockets of ancient oaks.</w:t>
-      </w:r>
-    </w:p>
-    <w:p>
-      <w:pPr>
-        <w:pBdr>
-          <w:left w:val="single" w:sz="18" w:space="12" w:color="B8860B"/>
-        </w:pBdr>
-        <w:shd w:val="clear" w:color="auto" w:fill="FBF6EA"/>
-        <w:spacing w:before="30" w:after="70"/>
-        <w:ind w:left="340" w:right="340"/>
-      </w:pPr>
-      <w:r>
-        <w:rPr>
-          <w:rFonts w:ascii="Georgia" w:hAnsi="Georgia" w:cs="Georgia"/>
-          <w:b w:val="0"/>
-          <w:i w:val="0"/>
-          <w:color w:val="222222"/>
-          <w:sz w:val="21"/>
-        </w:rPr>
-        <w:t>It should feel peaceful. It almost does. But the villagers walk quickly, and their eyes keep sliding to the forest's edge, as if the trees might follow them home.</w:t>
       </w:r>
     </w:p>
     <w:p>

</xml_diff>

<commit_message>
Sessions refit for new margins/parchment; S6 teaser corrected back to Session 7 (current ruling)
Co-Authored-By: Claude Opus 4.8 <noreply@anthropic.com>
</commit_message>
<xml_diff>
--- a/sessions/session_01_gathering_of_friends.docx
+++ b/sessions/session_01_gathering_of_friends.docx
@@ -472,7 +472,7 @@
       <w:r>
         <w:drawing>
           <wp:inline xmlns:a="http://schemas.openxmlformats.org/drawingml/2006/main" xmlns:pic="http://schemas.openxmlformats.org/drawingml/2006/picture">
-            <wp:extent cx="3657600" cy="3657600"/>
+            <wp:extent cx="2926080" cy="2926080"/>
             <wp:docPr id="3" name="Picture 3"/>
             <wp:cNvGraphicFramePr>
               <a:graphicFrameLocks noChangeAspect="1"/>
@@ -493,7 +493,7 @@
                   <pic:spPr>
                     <a:xfrm>
                       <a:off x="0" y="0"/>
-                      <a:ext cx="3657600" cy="3657600"/>
+                      <a:ext cx="2926080" cy="2926080"/>
                     </a:xfrm>
                     <a:prstGeom prst="rect"/>
                   </pic:spPr>
@@ -1058,6 +1058,56 @@
     </w:p>
     <w:p>
       <w:pPr>
+        <w:pBdr>
+          <w:left w:val="single" w:sz="18" w:space="12" w:color="B8860B"/>
+        </w:pBdr>
+        <w:shd w:val="clear" w:color="auto" w:fill="FBF6EA"/>
+        <w:spacing w:before="30" w:after="70"/>
+        <w:ind w:left="340" w:right="340"/>
+      </w:pPr>
+      <w:r>
+        <w:rPr>
+          <w:rFonts w:ascii="Georgia" w:hAnsi="Georgia" w:cs="Georgia"/>
+          <w:b/>
+          <w:i w:val="0"/>
+          <w:color w:val="222222"/>
+          <w:sz w:val="21"/>
+        </w:rPr>
+        <w:t>BANG.</w:t>
+      </w:r>
+      <w:r>
+        <w:rPr>
+          <w:rFonts w:ascii="Georgia" w:hAnsi="Georgia" w:cs="Georgia"/>
+          <w:b w:val="0"/>
+          <w:i w:val="0"/>
+          <w:color w:val="222222"/>
+          <w:sz w:val="21"/>
+        </w:rPr>
+        <w:t xml:space="preserve"> The tavern door slams open hard enough to rattle the trophies on the walls. In struts a goblin boy with green skin, light green hair, sharp little teeth, and red eyes lit with pure mischief. </w:t>
+      </w:r>
+      <w:r>
+        <w:rPr>
+          <w:rFonts w:ascii="Georgia" w:hAnsi="Georgia" w:cs="Georgia"/>
+          <w:b/>
+          <w:i w:val="0"/>
+          <w:color w:val="222222"/>
+          <w:sz w:val="21"/>
+        </w:rPr>
+        <w:t>Stabby Sharpblade</w:t>
+      </w:r>
+      <w:r>
+        <w:rPr>
+          <w:rFonts w:ascii="Georgia" w:hAnsi="Georgia" w:cs="Georgia"/>
+          <w:b w:val="0"/>
+          <w:i w:val="0"/>
+          <w:color w:val="222222"/>
+          <w:sz w:val="21"/>
+        </w:rPr>
+        <w:t>, eight years old and afraid of absolutely nothing, surveys the room like a king inspecting his castle.</w:t>
+      </w:r>
+    </w:p>
+    <w:p>
+      <w:pPr>
         <w:spacing w:after="0" w:before="0"/>
       </w:pPr>
       <w:r>
@@ -1100,56 +1150,6 @@
             </a:graphic>
           </wp:anchor>
         </w:drawing>
-      </w:r>
-    </w:p>
-    <w:p>
-      <w:pPr>
-        <w:pBdr>
-          <w:left w:val="single" w:sz="18" w:space="12" w:color="B8860B"/>
-        </w:pBdr>
-        <w:shd w:val="clear" w:color="auto" w:fill="FBF6EA"/>
-        <w:spacing w:before="30" w:after="70"/>
-        <w:ind w:left="340" w:right="340"/>
-      </w:pPr>
-      <w:r>
-        <w:rPr>
-          <w:rFonts w:ascii="Georgia" w:hAnsi="Georgia" w:cs="Georgia"/>
-          <w:b/>
-          <w:i w:val="0"/>
-          <w:color w:val="222222"/>
-          <w:sz w:val="21"/>
-        </w:rPr>
-        <w:t>BANG.</w:t>
-      </w:r>
-      <w:r>
-        <w:rPr>
-          <w:rFonts w:ascii="Georgia" w:hAnsi="Georgia" w:cs="Georgia"/>
-          <w:b w:val="0"/>
-          <w:i w:val="0"/>
-          <w:color w:val="222222"/>
-          <w:sz w:val="21"/>
-        </w:rPr>
-        <w:t xml:space="preserve"> The tavern door slams open hard enough to rattle the trophies on the walls. In struts a goblin boy with green skin, light green hair, sharp little teeth, and red eyes lit with pure mischief. </w:t>
-      </w:r>
-      <w:r>
-        <w:rPr>
-          <w:rFonts w:ascii="Georgia" w:hAnsi="Georgia" w:cs="Georgia"/>
-          <w:b/>
-          <w:i w:val="0"/>
-          <w:color w:val="222222"/>
-          <w:sz w:val="21"/>
-        </w:rPr>
-        <w:t>Stabby Sharpblade</w:t>
-      </w:r>
-      <w:r>
-        <w:rPr>
-          <w:rFonts w:ascii="Georgia" w:hAnsi="Georgia" w:cs="Georgia"/>
-          <w:b w:val="0"/>
-          <w:i w:val="0"/>
-          <w:color w:val="222222"/>
-          <w:sz w:val="21"/>
-        </w:rPr>
-        <w:t>, eight years old and afraid of absolutely nothing, surveys the room like a king inspecting his castle.</w:t>
       </w:r>
     </w:p>
     <w:p>
@@ -1329,206 +1329,6 @@
     </w:p>
     <w:p>
       <w:pPr>
-        <w:pBdr>
-          <w:left w:val="single" w:sz="18" w:space="12" w:color="B8860B"/>
-        </w:pBdr>
-        <w:shd w:val="clear" w:color="auto" w:fill="FBF6EA"/>
-        <w:spacing w:before="30" w:after="70"/>
-        <w:ind w:left="340" w:right="340"/>
-      </w:pPr>
-      <w:r>
-        <w:rPr>
-          <w:rFonts w:ascii="Georgia" w:hAnsi="Georgia" w:cs="Georgia"/>
-          <w:b w:val="0"/>
-          <w:i w:val="0"/>
-          <w:color w:val="222222"/>
-          <w:sz w:val="21"/>
-        </w:rPr>
-        <w:t xml:space="preserve">Osric brings mugs and news to the new table of three. All around them the tavern murmurs: </w:t>
-      </w:r>
-      <w:r>
-        <w:rPr>
-          <w:rFonts w:ascii="Georgia" w:hAnsi="Georgia" w:cs="Georgia"/>
-          <w:b w:val="0"/>
-          <w:i/>
-          <w:color w:val="222222"/>
-          <w:sz w:val="21"/>
-        </w:rPr>
-        <w:t>old Jarek saw something glowing in the woods again... strange winds out there... the trees do not sound right... folk say the forest is waking up.</w:t>
-      </w:r>
-    </w:p>
-    <w:p>
-      <w:pPr>
-        <w:pBdr>
-          <w:left w:val="single" w:sz="18" w:space="12" w:color="B8860B"/>
-        </w:pBdr>
-        <w:shd w:val="clear" w:color="auto" w:fill="FBF6EA"/>
-        <w:spacing w:before="30" w:after="70"/>
-        <w:ind w:left="340" w:right="340"/>
-      </w:pPr>
-      <w:r>
-        <w:rPr>
-          <w:rFonts w:ascii="Georgia" w:hAnsi="Georgia" w:cs="Georgia"/>
-          <w:b/>
-          <w:i w:val="0"/>
-          <w:color w:val="222222"/>
-          <w:sz w:val="21"/>
-        </w:rPr>
-        <w:t>Osric</w:t>
-      </w:r>
-      <w:r>
-        <w:rPr>
-          <w:rFonts w:ascii="Georgia" w:hAnsi="Georgia" w:cs="Georgia"/>
-          <w:b w:val="0"/>
-          <w:i w:val="0"/>
-          <w:color w:val="222222"/>
-          <w:sz w:val="21"/>
-        </w:rPr>
-        <w:t>, leaning in low: “There has been talk of creatures in the forest. Magical ones. Folk say they do not belong here, like they wandered in from... somewhere else.”</w:t>
-      </w:r>
-    </w:p>
-    <w:p>
-      <w:pPr>
-        <w:pBdr>
-          <w:left w:val="single" w:sz="18" w:space="12" w:color="B8860B"/>
-        </w:pBdr>
-        <w:shd w:val="clear" w:color="auto" w:fill="FBF6EA"/>
-        <w:spacing w:before="30" w:after="70"/>
-        <w:ind w:left="340" w:right="340"/>
-      </w:pPr>
-      <w:r>
-        <w:rPr>
-          <w:rFonts w:ascii="Georgia" w:hAnsi="Georgia" w:cs="Georgia"/>
-          <w:b/>
-          <w:i w:val="0"/>
-          <w:color w:val="222222"/>
-          <w:sz w:val="21"/>
-        </w:rPr>
-        <w:t>Rhea</w:t>
-      </w:r>
-      <w:r>
-        <w:rPr>
-          <w:rFonts w:ascii="Georgia" w:hAnsi="Georgia" w:cs="Georgia"/>
-          <w:b w:val="0"/>
-          <w:i w:val="0"/>
-          <w:color w:val="222222"/>
-          <w:sz w:val="21"/>
-        </w:rPr>
-        <w:t>, setting down a tray: “A traveler last night swore he saw something with glowing eyes by the pond. Did not stay to get a closer look. Cannot say I blame him.”</w:t>
-      </w:r>
-    </w:p>
-    <w:p>
-      <w:pPr>
-        <w:pBdr>
-          <w:left w:val="single" w:sz="18" w:space="12" w:color="B8860B"/>
-        </w:pBdr>
-        <w:shd w:val="clear" w:color="auto" w:fill="FBF6EA"/>
-        <w:spacing w:before="30" w:after="70"/>
-        <w:ind w:left="340" w:right="340"/>
-      </w:pPr>
-      <w:r>
-        <w:rPr>
-          <w:rFonts w:ascii="Georgia" w:hAnsi="Georgia" w:cs="Georgia"/>
-          <w:b w:val="0"/>
-          <w:i w:val="0"/>
-          <w:color w:val="222222"/>
-          <w:sz w:val="21"/>
-        </w:rPr>
-        <w:t xml:space="preserve">Before the three can trade theories, a shadow falls across their table. </w:t>
-      </w:r>
-      <w:r>
-        <w:rPr>
-          <w:rFonts w:ascii="Georgia" w:hAnsi="Georgia" w:cs="Georgia"/>
-          <w:b/>
-          <w:i w:val="0"/>
-          <w:color w:val="222222"/>
-          <w:sz w:val="21"/>
-        </w:rPr>
-        <w:t>Bren</w:t>
-      </w:r>
-      <w:r>
-        <w:rPr>
-          <w:rFonts w:ascii="Georgia" w:hAnsi="Georgia" w:cs="Georgia"/>
-          <w:b w:val="0"/>
-          <w:i w:val="0"/>
-          <w:color w:val="222222"/>
-          <w:sz w:val="21"/>
-        </w:rPr>
-        <w:t>, a burly local several drinks past sensible, cracks his knuckles and grins down at them.</w:t>
-      </w:r>
-    </w:p>
-    <w:p>
-      <w:pPr>
-        <w:pBdr>
-          <w:left w:val="single" w:sz="18" w:space="12" w:color="B8860B"/>
-        </w:pBdr>
-        <w:shd w:val="clear" w:color="auto" w:fill="FBF6EA"/>
-        <w:spacing w:before="30" w:after="70"/>
-        <w:ind w:left="340" w:right="340"/>
-      </w:pPr>
-      <w:r>
-        <w:rPr>
-          <w:rFonts w:ascii="Georgia" w:hAnsi="Georgia" w:cs="Georgia"/>
-          <w:b/>
-          <w:i w:val="0"/>
-          <w:color w:val="222222"/>
-          <w:sz w:val="21"/>
-        </w:rPr>
-        <w:t>Bren:</w:t>
-      </w:r>
-      <w:r>
-        <w:rPr>
-          <w:rFonts w:ascii="Georgia" w:hAnsi="Georgia" w:cs="Georgia"/>
-          <w:b w:val="0"/>
-          <w:i w:val="0"/>
-          <w:color w:val="222222"/>
-          <w:sz w:val="21"/>
-        </w:rPr>
-        <w:t xml:space="preserve"> “Oi! You lot look like you think you are tough. How about you prove it? A little friendly brawl, eh?”</w:t>
-      </w:r>
-    </w:p>
-    <w:p>
-      <w:pPr>
-        <w:pBdr>
-          <w:left w:val="single" w:sz="18" w:space="12" w:color="5B2A86"/>
-        </w:pBdr>
-        <w:shd w:val="clear" w:color="auto" w:fill="F4F0FA"/>
-        <w:spacing w:before="30" w:after="70"/>
-        <w:ind w:left="340" w:right="340"/>
-      </w:pPr>
-      <w:r>
-        <w:rPr>
-          <w:rFonts w:ascii="Georgia" w:hAnsi="Georgia" w:cs="Georgia"/>
-          <w:b w:val="0"/>
-          <w:i w:val="0"/>
-          <w:color w:val="222222"/>
-          <w:sz w:val="19"/>
-        </w:rPr>
-        <w:t xml:space="preserve">▶ </w:t>
-      </w:r>
-      <w:r>
-        <w:rPr>
-          <w:rFonts w:ascii="Georgia" w:hAnsi="Georgia" w:cs="Georgia"/>
-          <w:b/>
-          <w:i w:val="0"/>
-          <w:color w:val="222222"/>
-          <w:sz w:val="19"/>
-        </w:rPr>
-        <w:t>The brawl.</w:t>
-      </w:r>
-      <w:r>
-        <w:rPr>
-          <w:rFonts w:ascii="Georgia" w:hAnsi="Georgia" w:cs="Georgia"/>
-          <w:b w:val="0"/>
-          <w:i w:val="0"/>
-          <w:color w:val="222222"/>
-          <w:sz w:val="19"/>
-        </w:rPr>
-        <w:t xml:space="preserve"> Bren and two friends, fists, chairs, and one regrettable mug. Strictly non lethal. The three strangers fight together for the first time, and win.</w:t>
-      </w:r>
-    </w:p>
-    <w:p>
-      <w:pPr>
         <w:spacing w:after="0" w:before="0"/>
       </w:pPr>
       <w:r>
@@ -1571,6 +1371,206 @@
             </a:graphic>
           </wp:anchor>
         </w:drawing>
+      </w:r>
+    </w:p>
+    <w:p>
+      <w:pPr>
+        <w:pBdr>
+          <w:left w:val="single" w:sz="18" w:space="12" w:color="B8860B"/>
+        </w:pBdr>
+        <w:shd w:val="clear" w:color="auto" w:fill="FBF6EA"/>
+        <w:spacing w:before="30" w:after="70"/>
+        <w:ind w:left="340" w:right="340"/>
+      </w:pPr>
+      <w:r>
+        <w:rPr>
+          <w:rFonts w:ascii="Georgia" w:hAnsi="Georgia" w:cs="Georgia"/>
+          <w:b w:val="0"/>
+          <w:i w:val="0"/>
+          <w:color w:val="222222"/>
+          <w:sz w:val="21"/>
+        </w:rPr>
+        <w:t xml:space="preserve">Osric brings mugs and news to the new table of three. All around them the tavern murmurs: </w:t>
+      </w:r>
+      <w:r>
+        <w:rPr>
+          <w:rFonts w:ascii="Georgia" w:hAnsi="Georgia" w:cs="Georgia"/>
+          <w:b w:val="0"/>
+          <w:i/>
+          <w:color w:val="222222"/>
+          <w:sz w:val="21"/>
+        </w:rPr>
+        <w:t>old Jarek saw something glowing in the woods again... strange winds out there... the trees do not sound right... folk say the forest is waking up.</w:t>
+      </w:r>
+    </w:p>
+    <w:p>
+      <w:pPr>
+        <w:pBdr>
+          <w:left w:val="single" w:sz="18" w:space="12" w:color="B8860B"/>
+        </w:pBdr>
+        <w:shd w:val="clear" w:color="auto" w:fill="FBF6EA"/>
+        <w:spacing w:before="30" w:after="70"/>
+        <w:ind w:left="340" w:right="340"/>
+      </w:pPr>
+      <w:r>
+        <w:rPr>
+          <w:rFonts w:ascii="Georgia" w:hAnsi="Georgia" w:cs="Georgia"/>
+          <w:b/>
+          <w:i w:val="0"/>
+          <w:color w:val="222222"/>
+          <w:sz w:val="21"/>
+        </w:rPr>
+        <w:t>Osric</w:t>
+      </w:r>
+      <w:r>
+        <w:rPr>
+          <w:rFonts w:ascii="Georgia" w:hAnsi="Georgia" w:cs="Georgia"/>
+          <w:b w:val="0"/>
+          <w:i w:val="0"/>
+          <w:color w:val="222222"/>
+          <w:sz w:val="21"/>
+        </w:rPr>
+        <w:t>, leaning in low: “There has been talk of creatures in the forest. Magical ones. Folk say they do not belong here, like they wandered in from... somewhere else.”</w:t>
+      </w:r>
+    </w:p>
+    <w:p>
+      <w:pPr>
+        <w:pBdr>
+          <w:left w:val="single" w:sz="18" w:space="12" w:color="B8860B"/>
+        </w:pBdr>
+        <w:shd w:val="clear" w:color="auto" w:fill="FBF6EA"/>
+        <w:spacing w:before="30" w:after="70"/>
+        <w:ind w:left="340" w:right="340"/>
+      </w:pPr>
+      <w:r>
+        <w:rPr>
+          <w:rFonts w:ascii="Georgia" w:hAnsi="Georgia" w:cs="Georgia"/>
+          <w:b/>
+          <w:i w:val="0"/>
+          <w:color w:val="222222"/>
+          <w:sz w:val="21"/>
+        </w:rPr>
+        <w:t>Rhea</w:t>
+      </w:r>
+      <w:r>
+        <w:rPr>
+          <w:rFonts w:ascii="Georgia" w:hAnsi="Georgia" w:cs="Georgia"/>
+          <w:b w:val="0"/>
+          <w:i w:val="0"/>
+          <w:color w:val="222222"/>
+          <w:sz w:val="21"/>
+        </w:rPr>
+        <w:t>, setting down a tray: “A traveler last night swore he saw something with glowing eyes by the pond. Did not stay to get a closer look. Cannot say I blame him.”</w:t>
+      </w:r>
+    </w:p>
+    <w:p>
+      <w:pPr>
+        <w:pBdr>
+          <w:left w:val="single" w:sz="18" w:space="12" w:color="B8860B"/>
+        </w:pBdr>
+        <w:shd w:val="clear" w:color="auto" w:fill="FBF6EA"/>
+        <w:spacing w:before="30" w:after="70"/>
+        <w:ind w:left="340" w:right="340"/>
+      </w:pPr>
+      <w:r>
+        <w:rPr>
+          <w:rFonts w:ascii="Georgia" w:hAnsi="Georgia" w:cs="Georgia"/>
+          <w:b w:val="0"/>
+          <w:i w:val="0"/>
+          <w:color w:val="222222"/>
+          <w:sz w:val="21"/>
+        </w:rPr>
+        <w:t xml:space="preserve">Before the three can trade theories, a shadow falls across their table. </w:t>
+      </w:r>
+      <w:r>
+        <w:rPr>
+          <w:rFonts w:ascii="Georgia" w:hAnsi="Georgia" w:cs="Georgia"/>
+          <w:b/>
+          <w:i w:val="0"/>
+          <w:color w:val="222222"/>
+          <w:sz w:val="21"/>
+        </w:rPr>
+        <w:t>Bren</w:t>
+      </w:r>
+      <w:r>
+        <w:rPr>
+          <w:rFonts w:ascii="Georgia" w:hAnsi="Georgia" w:cs="Georgia"/>
+          <w:b w:val="0"/>
+          <w:i w:val="0"/>
+          <w:color w:val="222222"/>
+          <w:sz w:val="21"/>
+        </w:rPr>
+        <w:t>, a burly local several drinks past sensible, cracks his knuckles and grins down at them.</w:t>
+      </w:r>
+    </w:p>
+    <w:p>
+      <w:pPr>
+        <w:pBdr>
+          <w:left w:val="single" w:sz="18" w:space="12" w:color="B8860B"/>
+        </w:pBdr>
+        <w:shd w:val="clear" w:color="auto" w:fill="FBF6EA"/>
+        <w:spacing w:before="30" w:after="70"/>
+        <w:ind w:left="340" w:right="340"/>
+      </w:pPr>
+      <w:r>
+        <w:rPr>
+          <w:rFonts w:ascii="Georgia" w:hAnsi="Georgia" w:cs="Georgia"/>
+          <w:b/>
+          <w:i w:val="0"/>
+          <w:color w:val="222222"/>
+          <w:sz w:val="21"/>
+        </w:rPr>
+        <w:t>Bren:</w:t>
+      </w:r>
+      <w:r>
+        <w:rPr>
+          <w:rFonts w:ascii="Georgia" w:hAnsi="Georgia" w:cs="Georgia"/>
+          <w:b w:val="0"/>
+          <w:i w:val="0"/>
+          <w:color w:val="222222"/>
+          <w:sz w:val="21"/>
+        </w:rPr>
+        <w:t xml:space="preserve"> “Oi! You lot look like you think you are tough. How about you prove it? A little friendly brawl, eh?”</w:t>
+      </w:r>
+    </w:p>
+    <w:p>
+      <w:pPr>
+        <w:pBdr>
+          <w:left w:val="single" w:sz="18" w:space="12" w:color="5B2A86"/>
+        </w:pBdr>
+        <w:shd w:val="clear" w:color="auto" w:fill="F4F0FA"/>
+        <w:spacing w:before="30" w:after="70"/>
+        <w:ind w:left="340" w:right="340"/>
+      </w:pPr>
+      <w:r>
+        <w:rPr>
+          <w:rFonts w:ascii="Georgia" w:hAnsi="Georgia" w:cs="Georgia"/>
+          <w:b w:val="0"/>
+          <w:i w:val="0"/>
+          <w:color w:val="222222"/>
+          <w:sz w:val="19"/>
+        </w:rPr>
+        <w:t xml:space="preserve">▶ </w:t>
+      </w:r>
+      <w:r>
+        <w:rPr>
+          <w:rFonts w:ascii="Georgia" w:hAnsi="Georgia" w:cs="Georgia"/>
+          <w:b/>
+          <w:i w:val="0"/>
+          <w:color w:val="222222"/>
+          <w:sz w:val="19"/>
+        </w:rPr>
+        <w:t>The brawl.</w:t>
+      </w:r>
+      <w:r>
+        <w:rPr>
+          <w:rFonts w:ascii="Georgia" w:hAnsi="Georgia" w:cs="Georgia"/>
+          <w:b w:val="0"/>
+          <w:i w:val="0"/>
+          <w:color w:val="222222"/>
+          <w:sz w:val="19"/>
+        </w:rPr>
+        <w:t xml:space="preserve"> Bren and two friends, fists, chairs, and one regrettable mug. Strictly non lethal. The three strangers fight together for the first time, and win.</w:t>
       </w:r>
     </w:p>
     <w:p>
@@ -2068,136 +2068,6 @@
     </w:p>
     <w:p>
       <w:pPr>
-        <w:pBdr>
-          <w:left w:val="single" w:sz="18" w:space="12" w:color="B8860B"/>
-        </w:pBdr>
-        <w:shd w:val="clear" w:color="auto" w:fill="FBF6EA"/>
-        <w:spacing w:before="30" w:after="70"/>
-        <w:ind w:left="340" w:right="340"/>
-      </w:pPr>
-      <w:r>
-        <w:rPr>
-          <w:rFonts w:ascii="Georgia" w:hAnsi="Georgia" w:cs="Georgia"/>
-          <w:b w:val="0"/>
-          <w:i w:val="0"/>
-          <w:color w:val="222222"/>
-          <w:sz w:val="21"/>
-        </w:rPr>
-        <w:t>The trees open into a wide clearing where five towering stones stand in a rough ring, mossy and carved with runes too old to read. The air above them ripples like heat over a summer road. And perched atop the tallest stone, silhouetted against the sky, stands a bird.</w:t>
-      </w:r>
-    </w:p>
-    <w:p>
-      <w:pPr>
-        <w:pBdr>
-          <w:left w:val="single" w:sz="18" w:space="12" w:color="B8860B"/>
-        </w:pBdr>
-        <w:shd w:val="clear" w:color="auto" w:fill="FBF6EA"/>
-        <w:spacing w:before="30" w:after="70"/>
-        <w:ind w:left="340" w:right="340"/>
-      </w:pPr>
-      <w:r>
-        <w:rPr>
-          <w:rFonts w:ascii="Georgia" w:hAnsi="Georgia" w:cs="Georgia"/>
-          <w:b w:val="0"/>
-          <w:i w:val="0"/>
-          <w:color w:val="222222"/>
-          <w:sz w:val="21"/>
-        </w:rPr>
-        <w:t xml:space="preserve">It is a large, sturdy duck. It is holding a leek like a sword. Its eyes glow with a pale light, and the wind in the clearing moves when it moves, swirling leaves in slow spirals around the stones. A voice arrives in your minds, sharp as a whistle: a telepathic </w:t>
-      </w:r>
-      <w:r>
-        <w:rPr>
-          <w:rFonts w:ascii="Georgia" w:hAnsi="Georgia" w:cs="Georgia"/>
-          <w:b w:val="0"/>
-          <w:i/>
-          <w:color w:val="222222"/>
-          <w:sz w:val="21"/>
-        </w:rPr>
-        <w:t>quack</w:t>
-      </w:r>
-      <w:r>
-        <w:rPr>
-          <w:rFonts w:ascii="Georgia" w:hAnsi="Georgia" w:cs="Georgia"/>
-          <w:b w:val="0"/>
-          <w:i w:val="0"/>
-          <w:color w:val="222222"/>
-          <w:sz w:val="21"/>
-        </w:rPr>
-        <w:t>.</w:t>
-      </w:r>
-    </w:p>
-    <w:p>
-      <w:pPr>
-        <w:pBdr>
-          <w:left w:val="single" w:sz="18" w:space="12" w:color="B8860B"/>
-        </w:pBdr>
-        <w:shd w:val="clear" w:color="auto" w:fill="FBF6EA"/>
-        <w:spacing w:before="30" w:after="70"/>
-        <w:ind w:left="340" w:right="340"/>
-      </w:pPr>
-      <w:r>
-        <w:rPr>
-          <w:rFonts w:ascii="Georgia" w:hAnsi="Georgia" w:cs="Georgia"/>
-          <w:b/>
-          <w:i w:val="0"/>
-          <w:color w:val="222222"/>
-          <w:sz w:val="21"/>
-        </w:rPr>
-        <w:t>Duckleaf:</w:t>
-      </w:r>
-      <w:r>
-        <w:rPr>
-          <w:rFonts w:ascii="Georgia" w:hAnsi="Georgia" w:cs="Georgia"/>
-          <w:b w:val="0"/>
-          <w:i w:val="0"/>
-          <w:color w:val="222222"/>
-          <w:sz w:val="21"/>
-        </w:rPr>
-        <w:t xml:space="preserve"> “Intruders! Leave this place... or face the winds!”</w:t>
-      </w:r>
-    </w:p>
-    <w:p>
-      <w:pPr>
-        <w:pBdr>
-          <w:left w:val="single" w:sz="18" w:space="12" w:color="5B2A86"/>
-        </w:pBdr>
-        <w:shd w:val="clear" w:color="auto" w:fill="F4F0FA"/>
-        <w:spacing w:before="30" w:after="70"/>
-        <w:ind w:left="340" w:right="340"/>
-      </w:pPr>
-      <w:r>
-        <w:rPr>
-          <w:rFonts w:ascii="Georgia" w:hAnsi="Georgia" w:cs="Georgia"/>
-          <w:b w:val="0"/>
-          <w:i w:val="0"/>
-          <w:color w:val="222222"/>
-          <w:sz w:val="19"/>
-        </w:rPr>
-        <w:t xml:space="preserve">▶ Intelligence (Arcana) DC 14: the stones are amplifying elemental air energy; the creature is drawing power from the </w:t>
-      </w:r>
-      <w:r>
-        <w:rPr>
-          <w:rFonts w:ascii="Georgia" w:hAnsi="Georgia" w:cs="Georgia"/>
-          <w:b/>
-          <w:i w:val="0"/>
-          <w:color w:val="222222"/>
-          <w:sz w:val="19"/>
-        </w:rPr>
-        <w:t>Elemental Plane of Air</w:t>
-      </w:r>
-      <w:r>
-        <w:rPr>
-          <w:rFonts w:ascii="Georgia" w:hAnsi="Georgia" w:cs="Georgia"/>
-          <w:b w:val="0"/>
-          <w:i w:val="0"/>
-          <w:color w:val="222222"/>
-          <w:sz w:val="19"/>
-        </w:rPr>
-        <w:t>. Disrupting a stone weakens its wind step.</w:t>
-      </w:r>
-    </w:p>
-    <w:p>
-      <w:pPr>
         <w:spacing w:after="0" w:before="0"/>
       </w:pPr>
       <w:r>
@@ -2240,6 +2110,136 @@
             </a:graphic>
           </wp:anchor>
         </w:drawing>
+      </w:r>
+    </w:p>
+    <w:p>
+      <w:pPr>
+        <w:pBdr>
+          <w:left w:val="single" w:sz="18" w:space="12" w:color="B8860B"/>
+        </w:pBdr>
+        <w:shd w:val="clear" w:color="auto" w:fill="FBF6EA"/>
+        <w:spacing w:before="30" w:after="70"/>
+        <w:ind w:left="340" w:right="340"/>
+      </w:pPr>
+      <w:r>
+        <w:rPr>
+          <w:rFonts w:ascii="Georgia" w:hAnsi="Georgia" w:cs="Georgia"/>
+          <w:b w:val="0"/>
+          <w:i w:val="0"/>
+          <w:color w:val="222222"/>
+          <w:sz w:val="21"/>
+        </w:rPr>
+        <w:t>The trees open into a wide clearing where five towering stones stand in a rough ring, mossy and carved with runes too old to read. The air above them ripples like heat over a summer road. And perched atop the tallest stone, silhouetted against the sky, stands a bird.</w:t>
+      </w:r>
+    </w:p>
+    <w:p>
+      <w:pPr>
+        <w:pBdr>
+          <w:left w:val="single" w:sz="18" w:space="12" w:color="B8860B"/>
+        </w:pBdr>
+        <w:shd w:val="clear" w:color="auto" w:fill="FBF6EA"/>
+        <w:spacing w:before="30" w:after="70"/>
+        <w:ind w:left="340" w:right="340"/>
+      </w:pPr>
+      <w:r>
+        <w:rPr>
+          <w:rFonts w:ascii="Georgia" w:hAnsi="Georgia" w:cs="Georgia"/>
+          <w:b w:val="0"/>
+          <w:i w:val="0"/>
+          <w:color w:val="222222"/>
+          <w:sz w:val="21"/>
+        </w:rPr>
+        <w:t xml:space="preserve">It is a large, sturdy duck. It is holding a leek like a sword. Its eyes glow with a pale light, and the wind in the clearing moves when it moves, swirling leaves in slow spirals around the stones. A voice arrives in your minds, sharp as a whistle: a telepathic </w:t>
+      </w:r>
+      <w:r>
+        <w:rPr>
+          <w:rFonts w:ascii="Georgia" w:hAnsi="Georgia" w:cs="Georgia"/>
+          <w:b w:val="0"/>
+          <w:i/>
+          <w:color w:val="222222"/>
+          <w:sz w:val="21"/>
+        </w:rPr>
+        <w:t>quack</w:t>
+      </w:r>
+      <w:r>
+        <w:rPr>
+          <w:rFonts w:ascii="Georgia" w:hAnsi="Georgia" w:cs="Georgia"/>
+          <w:b w:val="0"/>
+          <w:i w:val="0"/>
+          <w:color w:val="222222"/>
+          <w:sz w:val="21"/>
+        </w:rPr>
+        <w:t>.</w:t>
+      </w:r>
+    </w:p>
+    <w:p>
+      <w:pPr>
+        <w:pBdr>
+          <w:left w:val="single" w:sz="18" w:space="12" w:color="B8860B"/>
+        </w:pBdr>
+        <w:shd w:val="clear" w:color="auto" w:fill="FBF6EA"/>
+        <w:spacing w:before="30" w:after="70"/>
+        <w:ind w:left="340" w:right="340"/>
+      </w:pPr>
+      <w:r>
+        <w:rPr>
+          <w:rFonts w:ascii="Georgia" w:hAnsi="Georgia" w:cs="Georgia"/>
+          <w:b/>
+          <w:i w:val="0"/>
+          <w:color w:val="222222"/>
+          <w:sz w:val="21"/>
+        </w:rPr>
+        <w:t>Duckleaf:</w:t>
+      </w:r>
+      <w:r>
+        <w:rPr>
+          <w:rFonts w:ascii="Georgia" w:hAnsi="Georgia" w:cs="Georgia"/>
+          <w:b w:val="0"/>
+          <w:i w:val="0"/>
+          <w:color w:val="222222"/>
+          <w:sz w:val="21"/>
+        </w:rPr>
+        <w:t xml:space="preserve"> “Intruders! Leave this place... or face the winds!”</w:t>
+      </w:r>
+    </w:p>
+    <w:p>
+      <w:pPr>
+        <w:pBdr>
+          <w:left w:val="single" w:sz="18" w:space="12" w:color="5B2A86"/>
+        </w:pBdr>
+        <w:shd w:val="clear" w:color="auto" w:fill="F4F0FA"/>
+        <w:spacing w:before="30" w:after="70"/>
+        <w:ind w:left="340" w:right="340"/>
+      </w:pPr>
+      <w:r>
+        <w:rPr>
+          <w:rFonts w:ascii="Georgia" w:hAnsi="Georgia" w:cs="Georgia"/>
+          <w:b w:val="0"/>
+          <w:i w:val="0"/>
+          <w:color w:val="222222"/>
+          <w:sz w:val="19"/>
+        </w:rPr>
+        <w:t xml:space="preserve">▶ Intelligence (Arcana) DC 14: the stones are amplifying elemental air energy; the creature is drawing power from the </w:t>
+      </w:r>
+      <w:r>
+        <w:rPr>
+          <w:rFonts w:ascii="Georgia" w:hAnsi="Georgia" w:cs="Georgia"/>
+          <w:b/>
+          <w:i w:val="0"/>
+          <w:color w:val="222222"/>
+          <w:sz w:val="19"/>
+        </w:rPr>
+        <w:t>Elemental Plane of Air</w:t>
+      </w:r>
+      <w:r>
+        <w:rPr>
+          <w:rFonts w:ascii="Georgia" w:hAnsi="Georgia" w:cs="Georgia"/>
+          <w:b w:val="0"/>
+          <w:i w:val="0"/>
+          <w:color w:val="222222"/>
+          <w:sz w:val="19"/>
+        </w:rPr>
+        <w:t>. Disrupting a stone weakens its wind step.</w:t>
       </w:r>
     </w:p>
     <w:p>

</xml_diff>

<commit_message>
Set-piece and encounter-notes restoration pass, Sessions 1-3, 5, 6
Seven-Eyes full-page card, storm and capsize cards, essence-roll card
(blind d12 at the table), Song of Unremembering / Lay a Ribbon /
Pumpkin Row cards, Stormwatch puzzle card, and full encounter notes
restored from the pre-rebuild originals across all five sessions.
Ghost-type emergence canon written into Session 6.

Co-Authored-By: Claude Opus 4.8 <noreply@anthropic.com>
</commit_message>
<xml_diff>
--- a/sessions/session_01_gathering_of_friends.docx
+++ b/sessions/session_01_gathering_of_friends.docx
@@ -1525,7 +1525,7 @@
           <w:color w:val="222222"/>
           <w:sz w:val="19"/>
         </w:rPr>
-        <w:t xml:space="preserve"> Bren and two friends, fists, chairs, and one regrettable mug. Strictly non lethal. The three strangers fight together for the first time, and win.</w:t>
+        <w:t xml:space="preserve"> Bren (AC 12, HP 8, unarmed strike +3 for 1d4 + 1) and two friends (AC 11, HP 6, unarmed +3 for 1d4): fists, chairs, and one regrettable mug, strictly non lethal. They rely on brute force, ganging up on one or two heroes at a time, and Osric steps in if things get too hot. The three strangers fight together for the first time, and win.</w:t>
       </w:r>
     </w:p>
     <w:p>
@@ -1787,7 +1787,7 @@
       <w:r>
         <w:drawing>
           <wp:inline xmlns:a="http://schemas.openxmlformats.org/drawingml/2006/main" xmlns:pic="http://schemas.openxmlformats.org/drawingml/2006/picture">
-            <wp:extent cx="5303520" cy="2983230"/>
+            <wp:extent cx="5029200" cy="2828925"/>
             <wp:docPr id="8" name="Picture 8"/>
             <wp:cNvGraphicFramePr>
               <a:graphicFrameLocks noChangeAspect="1"/>
@@ -1808,7 +1808,7 @@
                   <pic:spPr>
                     <a:xfrm>
                       <a:off x="0" y="0"/>
-                      <a:ext cx="5303520" cy="2983230"/>
+                      <a:ext cx="5029200" cy="2828925"/>
                     </a:xfrm>
                     <a:prstGeom prst="rect"/>
                   </pic:spPr>
@@ -1911,7 +1911,27 @@
           <w:color w:val="222222"/>
           <w:sz w:val="19"/>
         </w:rPr>
-        <w:t>▶ Wisdom (Animal Handling) DC 12 to befriend. The party offered food and gentle patience, and succeeded.</w:t>
+        <w:t xml:space="preserve">▶ </w:t>
+      </w:r>
+      <w:r>
+        <w:rPr>
+          <w:rFonts w:ascii="Georgia" w:hAnsi="Georgia" w:cs="Georgia"/>
+          <w:b/>
+          <w:i w:val="0"/>
+          <w:color w:val="222222"/>
+          <w:sz w:val="19"/>
+        </w:rPr>
+        <w:t>Meeting Lickgloom.</w:t>
+      </w:r>
+      <w:r>
+        <w:rPr>
+          <w:rFonts w:ascii="Georgia" w:hAnsi="Georgia" w:cs="Georgia"/>
+          <w:b w:val="0"/>
+          <w:i w:val="0"/>
+          <w:color w:val="222222"/>
+          <w:sz w:val="19"/>
+        </w:rPr>
+        <w:t xml:space="preserve"> Wisdom (Insight) DC 10: curious and playful, not a threat. Wisdom (Animal Handling) DC 12 to befriend with food and patience; aggression sends it fleeing into the pond. Intelligence (Arcana) DC 14: creature and pond both hum with Feywild energy. The party offered bread, and succeeded.</w:t>
       </w:r>
     </w:p>
     <w:p>
@@ -2242,7 +2262,27 @@
           <w:color w:val="222222"/>
           <w:sz w:val="19"/>
         </w:rPr>
-        <w:t xml:space="preserve">▶ Intelligence (Arcana) DC 14: the stones are amplifying elemental air energy; the creature is drawing power from the </w:t>
+        <w:t xml:space="preserve">▶ </w:t>
+      </w:r>
+      <w:r>
+        <w:rPr>
+          <w:rFonts w:ascii="Georgia" w:hAnsi="Georgia" w:cs="Georgia"/>
+          <w:b/>
+          <w:i w:val="0"/>
+          <w:color w:val="222222"/>
+          <w:sz w:val="19"/>
+        </w:rPr>
+        <w:t>The stone circle.</w:t>
+      </w:r>
+      <w:r>
+        <w:rPr>
+          <w:rFonts w:ascii="Georgia" w:hAnsi="Georgia" w:cs="Georgia"/>
+          <w:b w:val="0"/>
+          <w:i w:val="0"/>
+          <w:color w:val="222222"/>
+          <w:sz w:val="19"/>
+        </w:rPr>
+        <w:t xml:space="preserve"> Intelligence (Arcana) or Wisdom (Nature) DC 14: the five stones are amplifying elemental air energy; the creature draws its power from the </w:t>
       </w:r>
       <w:r>
         <w:rPr>
@@ -2262,7 +2302,47 @@
           <w:color w:val="222222"/>
           <w:sz w:val="19"/>
         </w:rPr>
-        <w:t>. Disrupting a stone weakens its wind step.</w:t>
+        <w:t>. Damaging or disrupting one stone breaks that connection: Duckleaf loses its Winged Leap for the rest of the battle, and it defends the stones fiercely once it realizes what the heroes are doing.</w:t>
+      </w:r>
+    </w:p>
+    <w:p>
+      <w:pPr>
+        <w:pBdr>
+          <w:left w:val="single" w:sz="18" w:space="12" w:color="5B2A86"/>
+        </w:pBdr>
+        <w:shd w:val="clear" w:color="auto" w:fill="F4F0FA"/>
+        <w:spacing w:before="30" w:after="70"/>
+        <w:ind w:left="340" w:right="340"/>
+      </w:pPr>
+      <w:r>
+        <w:rPr>
+          <w:rFonts w:ascii="Georgia" w:hAnsi="Georgia" w:cs="Georgia"/>
+          <w:b w:val="0"/>
+          <w:i w:val="0"/>
+          <w:color w:val="222222"/>
+          <w:sz w:val="19"/>
+        </w:rPr>
+        <w:t xml:space="preserve">▶ </w:t>
+      </w:r>
+      <w:r>
+        <w:rPr>
+          <w:rFonts w:ascii="Georgia" w:hAnsi="Georgia" w:cs="Georgia"/>
+          <w:b/>
+          <w:i w:val="0"/>
+          <w:color w:val="222222"/>
+          <w:sz w:val="19"/>
+        </w:rPr>
+        <w:t>Duckleaf's tactics.</w:t>
+      </w:r>
+      <w:r>
+        <w:rPr>
+          <w:rFonts w:ascii="Georgia" w:hAnsi="Georgia" w:cs="Georgia"/>
+          <w:b w:val="0"/>
+          <w:i w:val="0"/>
+          <w:color w:val="222222"/>
+          <w:sz w:val="19"/>
+        </w:rPr>
+        <w:t xml:space="preserve"> Wisdom (Perception) DC 12 reads its style: it opens with Aerial Slash from range, uses Winged Leap to skip away from melee without provoking, and saves its Quack of Fury (15 feet, Wisdom DC 14 or frightened) for when the party bunches up.</w:t>
       </w:r>
     </w:p>
     <w:p>
@@ -2549,6 +2629,86 @@
     <w:p>
       <w:pPr>
         <w:pBdr>
+          <w:left w:val="single" w:sz="18" w:space="12" w:color="5B2A86"/>
+        </w:pBdr>
+        <w:shd w:val="clear" w:color="auto" w:fill="F4F0FA"/>
+        <w:spacing w:before="30" w:after="70"/>
+        <w:ind w:left="340" w:right="340"/>
+      </w:pPr>
+      <w:r>
+        <w:rPr>
+          <w:rFonts w:ascii="Georgia" w:hAnsi="Georgia" w:cs="Georgia"/>
+          <w:b w:val="0"/>
+          <w:i w:val="0"/>
+          <w:color w:val="222222"/>
+          <w:sz w:val="19"/>
+        </w:rPr>
+        <w:t xml:space="preserve">▶ </w:t>
+      </w:r>
+      <w:r>
+        <w:rPr>
+          <w:rFonts w:ascii="Georgia" w:hAnsi="Georgia" w:cs="Georgia"/>
+          <w:b/>
+          <w:i w:val="0"/>
+          <w:color w:val="222222"/>
+          <w:sz w:val="19"/>
+        </w:rPr>
+        <w:t>The guardian's test.</w:t>
+      </w:r>
+      <w:r>
+        <w:rPr>
+          <w:rFonts w:ascii="Georgia" w:hAnsi="Georgia" w:cs="Georgia"/>
+          <w:b w:val="0"/>
+          <w:i w:val="0"/>
+          <w:color w:val="222222"/>
+          <w:sz w:val="19"/>
+        </w:rPr>
+        <w:t xml:space="preserve"> Cognifin, CR 3 (appendix). Intelligence (Arcana) or Wisdom (Nature) DC 14: it draws its strength from the pond itself, and disturbing the water's surface (a spell, a splash, a well-thrown rock) breaks its focus, silencing its whirlpools and tidal waves for a round.</w:t>
+      </w:r>
+    </w:p>
+    <w:p>
+      <w:pPr>
+        <w:pBdr>
+          <w:left w:val="single" w:sz="18" w:space="12" w:color="5B2A86"/>
+        </w:pBdr>
+        <w:shd w:val="clear" w:color="auto" w:fill="F4F0FA"/>
+        <w:spacing w:before="30" w:after="70"/>
+        <w:ind w:left="340" w:right="340"/>
+      </w:pPr>
+      <w:r>
+        <w:rPr>
+          <w:rFonts w:ascii="Georgia" w:hAnsi="Georgia" w:cs="Georgia"/>
+          <w:b w:val="0"/>
+          <w:i w:val="0"/>
+          <w:color w:val="222222"/>
+          <w:sz w:val="19"/>
+        </w:rPr>
+        <w:t xml:space="preserve">▶ </w:t>
+      </w:r>
+      <w:r>
+        <w:rPr>
+          <w:rFonts w:ascii="Georgia" w:hAnsi="Georgia" w:cs="Georgia"/>
+          <w:b/>
+          <w:i w:val="0"/>
+          <w:color w:val="222222"/>
+          <w:sz w:val="19"/>
+        </w:rPr>
+        <w:t>Tactics.</w:t>
+      </w:r>
+      <w:r>
+        <w:rPr>
+          <w:rFonts w:ascii="Georgia" w:hAnsi="Georgia" w:cs="Georgia"/>
+          <w:b w:val="0"/>
+          <w:i w:val="0"/>
+          <w:color w:val="222222"/>
+          <w:sz w:val="19"/>
+        </w:rPr>
+        <w:t xml:space="preserve"> It opens with Water Pulse to knock the closest hero prone, peppers the back line with Headache Blasts, and looses its Confusion Pulse when the party groups up; between turns its legendary waters pull heroes into whirlpools or shove them back with small tidal waves, while Psychic Shield turns away the worst blows.</w:t>
+      </w:r>
+    </w:p>
+    <w:p>
+      <w:pPr>
+        <w:pBdr>
           <w:left w:val="single" w:sz="18" w:space="12" w:color="B8860B"/>
         </w:pBdr>
         <w:shd w:val="clear" w:color="auto" w:fill="FBF6EA"/>
@@ -2639,7 +2799,6 @@
     <w:p>
       <w:pPr>
         <w:keepNext/>
-        <w:pageBreakBefore/>
         <w:spacing w:before="400" w:after="120"/>
         <w:pBdr>
           <w:bottom w:val="single" w:sz="6" w:space="4" w:color="B8860B"/>
@@ -2727,7 +2886,67 @@
           <w:color w:val="222222"/>
           <w:sz w:val="19"/>
         </w:rPr>
-        <w:t xml:space="preserve">▶ Dexterity (Acrobatics) DC 12 across the root falls; Wisdom (Perception) DC 13 to hold the path in fog. Then: two </w:t>
+        <w:t xml:space="preserve">▶ </w:t>
+      </w:r>
+      <w:r>
+        <w:rPr>
+          <w:rFonts w:ascii="Georgia" w:hAnsi="Georgia" w:cs="Georgia"/>
+          <w:b/>
+          <w:i w:val="0"/>
+          <w:color w:val="222222"/>
+          <w:sz w:val="19"/>
+        </w:rPr>
+        <w:t>Road hazards.</w:t>
+      </w:r>
+      <w:r>
+        <w:rPr>
+          <w:rFonts w:ascii="Georgia" w:hAnsi="Georgia" w:cs="Georgia"/>
+          <w:b w:val="0"/>
+          <w:i w:val="0"/>
+          <w:color w:val="222222"/>
+          <w:sz w:val="19"/>
+        </w:rPr>
+        <w:t xml:space="preserve"> Dexterity (Acrobatics) DC 12 across the erupted roots, 1d4 bludgeoning on a stumble; Wisdom (Perception) DC 13 to hold the path in fog, and a party that strays gets ambushed on ground of the Stalkers' choosing.</w:t>
+      </w:r>
+    </w:p>
+    <w:p>
+      <w:pPr>
+        <w:pBdr>
+          <w:left w:val="single" w:sz="18" w:space="12" w:color="5B2A86"/>
+        </w:pBdr>
+        <w:shd w:val="clear" w:color="auto" w:fill="F4F0FA"/>
+        <w:spacing w:before="30" w:after="70"/>
+        <w:ind w:left="340" w:right="340"/>
+      </w:pPr>
+      <w:r>
+        <w:rPr>
+          <w:rFonts w:ascii="Georgia" w:hAnsi="Georgia" w:cs="Georgia"/>
+          <w:b w:val="0"/>
+          <w:i w:val="0"/>
+          <w:color w:val="222222"/>
+          <w:sz w:val="19"/>
+        </w:rPr>
+        <w:t xml:space="preserve">▶ </w:t>
+      </w:r>
+      <w:r>
+        <w:rPr>
+          <w:rFonts w:ascii="Georgia" w:hAnsi="Georgia" w:cs="Georgia"/>
+          <w:b/>
+          <w:i w:val="0"/>
+          <w:color w:val="222222"/>
+          <w:sz w:val="19"/>
+        </w:rPr>
+        <w:t>The ambush.</w:t>
+      </w:r>
+      <w:r>
+        <w:rPr>
+          <w:rFonts w:ascii="Georgia" w:hAnsi="Georgia" w:cs="Georgia"/>
+          <w:b w:val="0"/>
+          <w:i w:val="0"/>
+          <w:color w:val="222222"/>
+          <w:sz w:val="19"/>
+        </w:rPr>
+        <w:t xml:space="preserve"> Two </w:t>
       </w:r>
       <w:r>
         <w:rPr>
@@ -2747,7 +2966,7 @@
           <w:color w:val="222222"/>
           <w:sz w:val="19"/>
         </w:rPr>
-        <w:t>, ambushing from the white.</w:t>
+        <w:t xml:space="preserve"> (appendix). Each wraps itself in Fog Cloak to strike from heavy obscurement, and their Howl of the Mist rolls in from every direction at once, hunting for frightened, scattered prey.</w:t>
       </w:r>
     </w:p>
     <w:p>

</xml_diff>

<commit_message>
Playability audit pass: all six sessions verified DM-runnable
Six concurrent per-session audits against the pre-rebuild originals:
- choices restored as choices (companion adoption, quest hooks, the
  dice game's losing branch, brawl escalation)
- failure outcomes and defeat/retreat conditions on every check and
  fight; hint ladders on every puzzle and clue chain
- final-battle mechanics made concrete (bell-ringing, three-phrase
  banishment); S6 investigation dead end repaired
- lost content back (Nina, shop inventories and prices, XP awards,
  short rests, foreshadows); originals' own stat defects fixed
  (Mist Stalker rebuilt, CRs, durations, 2024 terms, Floraberry
  house-rule alignment)
- one [DM CHECK] outstanding: whose grave the S6 rite restored

Full book republished (10 PDFs).

Co-Authored-By: Claude Opus 4.8 <noreply@anthropic.com>
</commit_message>
<xml_diff>
--- a/sessions/session_01_gathering_of_friends.docx
+++ b/sessions/session_01_gathering_of_friends.docx
@@ -568,6 +568,126 @@
     </w:p>
     <w:p>
       <w:pPr>
+        <w:pBdr>
+          <w:left w:val="single" w:sz="18" w:space="12" w:color="5B2A86"/>
+        </w:pBdr>
+        <w:shd w:val="clear" w:color="auto" w:fill="F4F0FA"/>
+        <w:spacing w:before="30" w:after="70"/>
+        <w:ind w:left="340" w:right="340"/>
+      </w:pPr>
+      <w:r>
+        <w:rPr>
+          <w:rFonts w:ascii="Georgia" w:hAnsi="Georgia" w:cs="Georgia"/>
+          <w:b w:val="0"/>
+          <w:i w:val="0"/>
+          <w:color w:val="222222"/>
+          <w:sz w:val="19"/>
+        </w:rPr>
+        <w:t xml:space="preserve">▶ </w:t>
+      </w:r>
+      <w:r>
+        <w:rPr>
+          <w:rFonts w:ascii="Georgia" w:hAnsi="Georgia" w:cs="Georgia"/>
+          <w:b/>
+          <w:i w:val="0"/>
+          <w:color w:val="222222"/>
+          <w:sz w:val="19"/>
+        </w:rPr>
+        <w:t>Eldridge Village.</w:t>
+      </w:r>
+      <w:r>
+        <w:rPr>
+          <w:rFonts w:ascii="Georgia" w:hAnsi="Georgia" w:cs="Georgia"/>
+          <w:b w:val="0"/>
+          <w:i w:val="0"/>
+          <w:color w:val="222222"/>
+          <w:sz w:val="19"/>
+        </w:rPr>
+        <w:t xml:space="preserve"> Small but lively. Besides the Gilded Acorn, heroes can visit </w:t>
+      </w:r>
+      <w:r>
+        <w:rPr>
+          <w:rFonts w:ascii="Georgia" w:hAnsi="Georgia" w:cs="Georgia"/>
+          <w:b/>
+          <w:i w:val="0"/>
+          <w:color w:val="222222"/>
+          <w:sz w:val="19"/>
+        </w:rPr>
+        <w:t>Garrick's Forge</w:t>
+      </w:r>
+      <w:r>
+        <w:rPr>
+          <w:rFonts w:ascii="Georgia" w:hAnsi="Georgia" w:cs="Georgia"/>
+          <w:b w:val="0"/>
+          <w:i w:val="0"/>
+          <w:color w:val="222222"/>
+          <w:sz w:val="19"/>
+        </w:rPr>
+        <w:t xml:space="preserve"> (blacksmith), </w:t>
+      </w:r>
+      <w:r>
+        <w:rPr>
+          <w:rFonts w:ascii="Georgia" w:hAnsi="Georgia" w:cs="Georgia"/>
+          <w:b/>
+          <w:i w:val="0"/>
+          <w:color w:val="222222"/>
+          <w:sz w:val="19"/>
+        </w:rPr>
+        <w:t>Evelyn's Remedies</w:t>
+      </w:r>
+      <w:r>
+        <w:rPr>
+          <w:rFonts w:ascii="Georgia" w:hAnsi="Georgia" w:cs="Georgia"/>
+          <w:b w:val="0"/>
+          <w:i w:val="0"/>
+          <w:color w:val="222222"/>
+          <w:sz w:val="19"/>
+        </w:rPr>
+        <w:t xml:space="preserve"> (herbalist), </w:t>
+      </w:r>
+      <w:r>
+        <w:rPr>
+          <w:rFonts w:ascii="Georgia" w:hAnsi="Georgia" w:cs="Georgia"/>
+          <w:b/>
+          <w:i w:val="0"/>
+          <w:color w:val="222222"/>
+          <w:sz w:val="19"/>
+        </w:rPr>
+        <w:t>The Wandering Trinket</w:t>
+      </w:r>
+      <w:r>
+        <w:rPr>
+          <w:rFonts w:ascii="Georgia" w:hAnsi="Georgia" w:cs="Georgia"/>
+          <w:b w:val="0"/>
+          <w:i w:val="0"/>
+          <w:color w:val="222222"/>
+          <w:sz w:val="19"/>
+        </w:rPr>
+        <w:t xml:space="preserve"> (general store), and the </w:t>
+      </w:r>
+      <w:r>
+        <w:rPr>
+          <w:rFonts w:ascii="Georgia" w:hAnsi="Georgia" w:cs="Georgia"/>
+          <w:b/>
+          <w:i w:val="0"/>
+          <w:color w:val="222222"/>
+          <w:sz w:val="19"/>
+        </w:rPr>
+        <w:t>Weary Wanderer Inn</w:t>
+      </w:r>
+      <w:r>
+        <w:rPr>
+          <w:rFonts w:ascii="Georgia" w:hAnsi="Georgia" w:cs="Georgia"/>
+          <w:b w:val="0"/>
+          <w:i w:val="0"/>
+          <w:color w:val="222222"/>
+          <w:sz w:val="19"/>
+        </w:rPr>
+        <w:t>. Osric and Rhea are the rumor sources; both point toward the Forest of Whispers.</w:t>
+      </w:r>
+    </w:p>
+    <w:p>
+      <w:pPr>
         <w:keepNext/>
         <w:spacing w:before="220" w:after="60"/>
       </w:pPr>
@@ -1525,7 +1645,7 @@
           <w:color w:val="222222"/>
           <w:sz w:val="19"/>
         </w:rPr>
-        <w:t xml:space="preserve"> Bren (AC 12, HP 8, unarmed strike +3 for 1d4 + 1) and two friends (AC 11, HP 6, unarmed +3 for 1d4): fists, chairs, and one regrettable mug, strictly non lethal. They rely on brute force, ganging up on one or two heroes at a time, and Osric steps in if things get too hot. The three strangers fight together for the first time, and win.</w:t>
+        <w:t xml:space="preserve"> Bren (AC 12, HP 8, unarmed strike +3 for 1d4 + 1) and two friends (AC 11, HP 6, unarmed +3 for 1d4): fists, chairs, and one regrettable mug, strictly non lethal. Heroes who try to wave Bren off only make him louder; soon he and his friends are standing over the table, and the fight comes to them. They rely on brute force, ganging up on one or two heroes at a time, and Osric steps in if things get too hot. Any hero knocked down wakes a minute later with a bruised ear and a mug of cider on the house. The three strangers fight together for the first time, and win.</w:t>
       </w:r>
     </w:p>
     <w:p>
@@ -1755,7 +1875,7 @@
           <w:color w:val="222222"/>
           <w:sz w:val="19"/>
         </w:rPr>
-        <w:t>▶ Wisdom (Perception) DC 12 to spot a glimmering light moving in the reeds.</w:t>
+        <w:t>▶ Wisdom (Perception) DC 12 to spot a glimmering light moving in the reeds; on a failure the heroes hear only rustling reeds and frogs, and Lickgloom shows itself when they reach the water's edge.</w:t>
       </w:r>
     </w:p>
     <w:p>
@@ -1931,7 +2051,7 @@
           <w:color w:val="222222"/>
           <w:sz w:val="19"/>
         </w:rPr>
-        <w:t xml:space="preserve"> Wisdom (Insight) DC 10: curious and playful, not a threat. Wisdom (Animal Handling) DC 12 to befriend with food and patience; aggression sends it fleeing into the pond. Intelligence (Arcana) DC 14: creature and pond both hum with Feywild energy. The party offered bread, and succeeded.</w:t>
+        <w:t xml:space="preserve"> Wisdom (Insight) DC 10: curious and playful, not a threat. Wisdom (Animal Handling) DC 12 to befriend with food and patience; on a failure, or at any aggression, it darts into the pond and hides. Intelligence (Arcana) DC 14: creature and pond both hum with Feywild energy; the boundary between planes is worn thin here. If it flees, searching the bank finds wildflowers blooming out of season and strange ripples (same Arcana check to read them), and quiet patience plus a snack coaxes it back out. The party offered bread, and succeeded.</w:t>
       </w:r>
     </w:p>
     <w:p>
@@ -1986,8 +2106,47 @@
     </w:p>
     <w:p>
       <w:pPr>
+        <w:pBdr>
+          <w:left w:val="single" w:sz="18" w:space="12" w:color="5B2A86"/>
+        </w:pBdr>
+        <w:shd w:val="clear" w:color="auto" w:fill="F4F0FA"/>
+        <w:spacing w:before="30" w:after="70"/>
+        <w:ind w:left="340" w:right="340"/>
+      </w:pPr>
+      <w:r>
+        <w:rPr>
+          <w:rFonts w:ascii="Georgia" w:hAnsi="Georgia" w:cs="Georgia"/>
+          <w:b w:val="0"/>
+          <w:i w:val="0"/>
+          <w:color w:val="222222"/>
+          <w:sz w:val="19"/>
+        </w:rPr>
+        <w:t xml:space="preserve">▶ </w:t>
+      </w:r>
+      <w:r>
+        <w:rPr>
+          <w:rFonts w:ascii="Georgia" w:hAnsi="Georgia" w:cs="Georgia"/>
+          <w:b/>
+          <w:i w:val="0"/>
+          <w:color w:val="222222"/>
+          <w:sz w:val="19"/>
+        </w:rPr>
+        <w:t>Lickgloom, companion.</w:t>
+      </w:r>
+      <w:r>
+        <w:rPr>
+          <w:rFonts w:ascii="Georgia" w:hAnsi="Georgia" w:cs="Georgia"/>
+          <w:b w:val="0"/>
+          <w:i w:val="0"/>
+          <w:color w:val="222222"/>
+          <w:sz w:val="19"/>
+        </w:rPr>
+        <w:t xml:space="preserve"> Traveling with the party, Lickgloom can fetch small objects with its 10 foot tongue, and once per scene its tasting tongue grants one hero advantage on a Wisdom (Perception) or Intelligence (Investigation) check. Statistics in the appendix.</w:t>
+      </w:r>
+    </w:p>
+    <w:p>
+      <w:pPr>
         <w:keepNext/>
-        <w:pageBreakBefore/>
         <w:spacing w:before="400" w:after="120"/>
         <w:pBdr>
           <w:bottom w:val="single" w:sz="6" w:space="4" w:color="B8860B"/>
@@ -2092,6 +2251,11 @@
           <w:sz w:val="18"/>
         </w:rPr>
         <w:t>Beneath the eaves of the Forest of Whispers, where the starlight comes through in coins and slivers.</w:t>
+      </w:r>
+    </w:p>
+    <w:p>
+      <w:r>
+        <w:br w:type="page"/>
       </w:r>
     </w:p>
     <w:p>
@@ -2302,7 +2466,7 @@
           <w:color w:val="222222"/>
           <w:sz w:val="19"/>
         </w:rPr>
-        <w:t>. Damaging or disrupting one stone breaks that connection: Duckleaf loses its Winged Leap for the rest of the battle, and it defends the stones fiercely once it realizes what the heroes are doing.</w:t>
+        <w:t>. Damaging or disrupting one stone breaks that connection: Duckleaf loses its Winged Leap for the rest of the battle, and it defends the stones fiercely once it realizes what the heroes are doing. If the players are stuck, ladder the hints: first, wind visibly streams from the stones to the duck each time it leaps; then, any stray hit on a stone makes Duckleaf shriek and rush to defend it.</w:t>
       </w:r>
     </w:p>
     <w:p>
@@ -2342,7 +2506,7 @@
           <w:color w:val="222222"/>
           <w:sz w:val="19"/>
         </w:rPr>
-        <w:t xml:space="preserve"> Wisdom (Perception) DC 12 reads its style: it opens with Aerial Slash from range, uses Winged Leap to skip away from melee without provoking, and saves its Quack of Fury (15 feet, Wisdom DC 14 or frightened) for when the party bunches up.</w:t>
+        <w:t xml:space="preserve"> Wisdom (Perception) DC 12 reads its style: it opens with Aerial Slash from range, uses Winged Leap to skip away from melee without provoking, and saves its Quack of Fury (15 feet, Wisdom DC 14 or frightened) for when the party bunches up. It is a guardian, not a hunter: heroes who heed the warning and withdraw are allowed to leave, and if the fight turns badly it lets them retreat into the trees rather than pursue beyond the stones.</w:t>
       </w:r>
     </w:p>
     <w:p>
@@ -2493,6 +2657,46 @@
           <w:sz w:val="21"/>
         </w:rPr>
         <w:t>, quietly: “That came from somewhere else. Something is leaking into our world.”</w:t>
+      </w:r>
+    </w:p>
+    <w:p>
+      <w:pPr>
+        <w:pBdr>
+          <w:left w:val="single" w:sz="18" w:space="12" w:color="5B2A86"/>
+        </w:pBdr>
+        <w:shd w:val="clear" w:color="auto" w:fill="F4F0FA"/>
+        <w:spacing w:before="30" w:after="70"/>
+        <w:ind w:left="340" w:right="340"/>
+      </w:pPr>
+      <w:r>
+        <w:rPr>
+          <w:rFonts w:ascii="Georgia" w:hAnsi="Georgia" w:cs="Georgia"/>
+          <w:b w:val="0"/>
+          <w:i w:val="0"/>
+          <w:color w:val="222222"/>
+          <w:sz w:val="19"/>
+        </w:rPr>
+        <w:t xml:space="preserve">▶ </w:t>
+      </w:r>
+      <w:r>
+        <w:rPr>
+          <w:rFonts w:ascii="Georgia" w:hAnsi="Georgia" w:cs="Georgia"/>
+          <w:b/>
+          <w:i w:val="0"/>
+          <w:color w:val="222222"/>
+          <w:sz w:val="19"/>
+        </w:rPr>
+        <w:t>The motes.</w:t>
+      </w:r>
+      <w:r>
+        <w:rPr>
+          <w:rFonts w:ascii="Georgia" w:hAnsi="Georgia" w:cs="Georgia"/>
+          <w:b w:val="0"/>
+          <w:i w:val="0"/>
+          <w:color w:val="222222"/>
+          <w:sz w:val="19"/>
+        </w:rPr>
+        <w:t xml:space="preserve"> Intelligence (Arcana) DC 14: each mote is a residue of another plane, left behind when a planar creature falls. Similar motes will rise from every such creature the party defeats; the pattern is the session's biggest clue to the doors opening between worlds.</w:t>
       </w:r>
     </w:p>
     <w:p>
@@ -2663,7 +2867,7 @@
           <w:color w:val="222222"/>
           <w:sz w:val="19"/>
         </w:rPr>
-        <w:t xml:space="preserve"> Cognifin, CR 3 (appendix). Intelligence (Arcana) or Wisdom (Nature) DC 14: it draws its strength from the pond itself, and disturbing the water's surface (a spell, a splash, a well-thrown rock) breaks its focus, silencing its whirlpools and tidal waves for a round.</w:t>
+        <w:t xml:space="preserve"> Cognifin, CR 3 (appendix). Intelligence (Arcana) or Wisdom (Nature) DC 14: it draws its strength from the pond itself, and disturbing the water's surface (a spell, a splash, a well-thrown rock) breaks its focus, silencing its whirlpools and tidal waves for a round. Wisdom (Perception) DC 13: small whirlpools form and fade wherever it drifts, a telegraph of the water control to come.</w:t>
       </w:r>
     </w:p>
     <w:p>
@@ -2703,7 +2907,7 @@
           <w:color w:val="222222"/>
           <w:sz w:val="19"/>
         </w:rPr>
-        <w:t xml:space="preserve"> It opens with Water Pulse to knock the closest hero prone, peppers the back line with Headache Blasts, and looses its Confusion Pulse when the party groups up; between turns its legendary waters pull heroes into whirlpools or shove them back with small tidal waves, while Psychic Shield turns away the worst blows.</w:t>
+        <w:t xml:space="preserve"> It opens with Water Pulse to knock the closest hero prone, peppers the back line with Headache Blasts, and looses its Confusion Pulse when the party groups up; between turns its legendary waters pull heroes into whirlpools or shove them back with small tidal waves, while Psychic Shield turns away the worst blows. The test is stern but never lethal: a hero who drops is washed gently to the bank, unconscious but stable, and a party that falls or yields wakes at the grove's edge, free to try again once rested.</w:t>
       </w:r>
     </w:p>
     <w:p>
@@ -2799,6 +3003,7 @@
     <w:p>
       <w:pPr>
         <w:keepNext/>
+        <w:pageBreakBefore/>
         <w:spacing w:before="400" w:after="120"/>
         <w:pBdr>
           <w:bottom w:val="single" w:sz="6" w:space="4" w:color="B8860B"/>
@@ -2966,7 +3171,7 @@
           <w:color w:val="222222"/>
           <w:sz w:val="19"/>
         </w:rPr>
-        <w:t xml:space="preserve"> (appendix). Each wraps itself in Fog Cloak to strike from heavy obscurement, and their Howl of the Mist rolls in from every direction at once, hunting for frightened, scattered prey.</w:t>
+        <w:t xml:space="preserve"> (appendix). Each wraps itself in Fog Cloak to strike from heavy obscurement, and their Howl of the Mist rolls in from every direction at once, hunting for frightened, scattered prey. They will not leave their fog: heroes who regain the road and keep moving escape them, and a strong wind or a gust of magic that thins the mist steals their cover and their nerve.</w:t>
       </w:r>
     </w:p>
     <w:p>
@@ -3177,7 +3382,7 @@
           <w:color w:val="222222"/>
           <w:sz w:val="21"/>
         </w:rPr>
-        <w:t xml:space="preserve">In the warm little </w:t>
+        <w:t xml:space="preserve">Next door, </w:t>
       </w:r>
       <w:r>
         <w:rPr>
@@ -3187,7 +3392,7 @@
           <w:color w:val="222222"/>
           <w:sz w:val="21"/>
         </w:rPr>
-        <w:t>Old Oak Tavern</w:t>
+        <w:t>Nina the herbalist</w:t>
       </w:r>
       <w:r>
         <w:rPr>
@@ -3197,8 +3402,42 @@
           <w:color w:val="222222"/>
           <w:sz w:val="21"/>
         </w:rPr>
-        <w:t xml:space="preserve">, the keeper </w:t>
-      </w:r>
+        <w:t xml:space="preserve"> watches from the doorway of a little shop whose windows are crowded with dried herbs and potion bottles, the air around it sweet with lavender and sage. “There is magic in the air, stronger than usual,” she tells the party softly. “I can feel it in the plants and the water. And I have seen creatures near the village that are not in any of my books.”</w:t>
+      </w:r>
+    </w:p>
+    <w:p>
+      <w:pPr>
+        <w:keepNext/>
+        <w:pBdr>
+          <w:top w:val="double" w:sz="12" w:space="4" w:color="1F7A78"/>
+          <w:left w:val="double" w:sz="12" w:space="10" w:color="1F7A78"/>
+          <w:right w:val="double" w:sz="12" w:space="10" w:color="1F7A78"/>
+        </w:pBdr>
+        <w:shd w:val="clear" w:color="auto" w:fill="EAF4F3"/>
+        <w:spacing w:before="280" w:after="60"/>
+        <w:ind w:left="400" w:right="400"/>
+        <w:jc w:val="center"/>
+      </w:pPr>
+      <w:r>
+        <w:rPr>
+          <w:rFonts w:ascii="Georgia" w:hAnsi="Georgia" w:cs="Georgia"/>
+          <w:b/>
+          <w:color w:val="1F7A78"/>
+          <w:sz w:val="27"/>
+        </w:rPr>
+        <w:t>✦  Provisions in Oakshade Village  ✦</w:t>
+      </w:r>
+    </w:p>
+    <w:p>
+      <w:pPr>
+        <w:pBdr>
+          <w:left w:val="double" w:sz="12" w:space="10" w:color="1F7A78"/>
+          <w:right w:val="double" w:sz="12" w:space="10" w:color="1F7A78"/>
+        </w:pBdr>
+        <w:shd w:val="clear" w:color="auto" w:fill="EAF4F3"/>
+        <w:spacing w:before="0" w:after="0"/>
+        <w:ind w:left="400" w:right="400"/>
+      </w:pPr>
       <w:r>
         <w:rPr>
           <w:rFonts w:ascii="Georgia" w:hAnsi="Georgia" w:cs="Georgia"/>
@@ -3207,7 +3446,7 @@
           <w:color w:val="222222"/>
           <w:sz w:val="21"/>
         </w:rPr>
-        <w:t>Alwen</w:t>
+        <w:t>Merwin's Forge.</w:t>
       </w:r>
       <w:r>
         <w:rPr>
@@ -3217,17 +3456,17 @@
           <w:color w:val="222222"/>
           <w:sz w:val="21"/>
         </w:rPr>
-        <w:t xml:space="preserve"> sets down bowls of hot stew unasked. “Well now, travelers! Made it just in time for dinner. Take a seat, and I will bring you a bowl.” Around the fire, villagers whisper of a glowing fox darting through the trees, and of old Merwin muttering that </w:t>
-      </w:r>
-      <w:r>
-        <w:rPr>
-          <w:rFonts w:ascii="Georgia" w:hAnsi="Georgia" w:cs="Georgia"/>
-          <w:b w:val="0"/>
-          <w:i/>
+        <w:t xml:space="preserve"> Simple weapons (spear, shortsword, handaxe), arrows and bolts, chain shirts and shields at standard prices. Special: Merwin will silver a weapon for </w:t>
+      </w:r>
+      <w:r>
+        <w:rPr>
+          <w:rFonts w:ascii="Georgia" w:hAnsi="Georgia" w:cs="Georgia"/>
+          <w:b/>
+          <w:i w:val="0"/>
           <w:color w:val="222222"/>
           <w:sz w:val="21"/>
         </w:rPr>
-        <w:t>the planes are bleeding together</w:t>
+        <w:t>100 gp</w:t>
       </w:r>
       <w:r>
         <w:rPr>
@@ -3237,22 +3476,170 @@
           <w:color w:val="222222"/>
           <w:sz w:val="21"/>
         </w:rPr>
-        <w:t>.</w:t>
+        <w:t>, good against certain fey and shadowy things.</w:t>
       </w:r>
     </w:p>
     <w:p>
       <w:pPr>
-        <w:keepNext/>
-        <w:spacing w:before="220" w:after="60"/>
+        <w:pBdr>
+          <w:left w:val="double" w:sz="12" w:space="10" w:color="1F7A78"/>
+          <w:right w:val="double" w:sz="12" w:space="10" w:color="1F7A78"/>
+        </w:pBdr>
+        <w:shd w:val="clear" w:color="auto" w:fill="EAF4F3"/>
+        <w:spacing w:before="0" w:after="0"/>
+        <w:ind w:left="400" w:right="400"/>
       </w:pPr>
       <w:r>
         <w:rPr>
           <w:rFonts w:ascii="Georgia" w:hAnsi="Georgia" w:cs="Georgia"/>
           <w:b/>
-          <w:color w:val="A0522D"/>
-          <w:sz w:val="26"/>
-        </w:rPr>
-        <w:t>The Missing Villagers</w:t>
+          <w:i w:val="0"/>
+          <w:color w:val="222222"/>
+          <w:sz w:val="21"/>
+        </w:rPr>
+        <w:t>Nina's Herbs and Remedies.</w:t>
+      </w:r>
+      <w:r>
+        <w:rPr>
+          <w:rFonts w:ascii="Georgia" w:hAnsi="Georgia" w:cs="Georgia"/>
+          <w:b w:val="0"/>
+          <w:i w:val="0"/>
+          <w:color w:val="222222"/>
+          <w:sz w:val="21"/>
+        </w:rPr>
+        <w:t xml:space="preserve"> Potion of Healing </w:t>
+      </w:r>
+      <w:r>
+        <w:rPr>
+          <w:rFonts w:ascii="Georgia" w:hAnsi="Georgia" w:cs="Georgia"/>
+          <w:b/>
+          <w:i w:val="0"/>
+          <w:color w:val="222222"/>
+          <w:sz w:val="21"/>
+        </w:rPr>
+        <w:t>50 gp</w:t>
+      </w:r>
+      <w:r>
+        <w:rPr>
+          <w:rFonts w:ascii="Georgia" w:hAnsi="Georgia" w:cs="Georgia"/>
+          <w:b w:val="0"/>
+          <w:i w:val="0"/>
+          <w:color w:val="222222"/>
+          <w:sz w:val="21"/>
+        </w:rPr>
+        <w:t xml:space="preserve">, antitoxin </w:t>
+      </w:r>
+      <w:r>
+        <w:rPr>
+          <w:rFonts w:ascii="Georgia" w:hAnsi="Georgia" w:cs="Georgia"/>
+          <w:b/>
+          <w:i w:val="0"/>
+          <w:color w:val="222222"/>
+          <w:sz w:val="21"/>
+        </w:rPr>
+        <w:t>25 gp</w:t>
+      </w:r>
+      <w:r>
+        <w:rPr>
+          <w:rFonts w:ascii="Georgia" w:hAnsi="Georgia" w:cs="Georgia"/>
+          <w:b w:val="0"/>
+          <w:i w:val="0"/>
+          <w:color w:val="222222"/>
+          <w:sz w:val="21"/>
+        </w:rPr>
+        <w:t xml:space="preserve">, herbal salves </w:t>
+      </w:r>
+      <w:r>
+        <w:rPr>
+          <w:rFonts w:ascii="Georgia" w:hAnsi="Georgia" w:cs="Georgia"/>
+          <w:b/>
+          <w:i w:val="0"/>
+          <w:color w:val="222222"/>
+          <w:sz w:val="21"/>
+        </w:rPr>
+        <w:t>5 gp</w:t>
+      </w:r>
+      <w:r>
+        <w:rPr>
+          <w:rFonts w:ascii="Georgia" w:hAnsi="Georgia" w:cs="Georgia"/>
+          <w:b w:val="0"/>
+          <w:i w:val="0"/>
+          <w:color w:val="222222"/>
+          <w:sz w:val="21"/>
+        </w:rPr>
+        <w:t xml:space="preserve">. Special: </w:t>
+      </w:r>
+      <w:r>
+        <w:rPr>
+          <w:rFonts w:ascii="Georgia" w:hAnsi="Georgia" w:cs="Georgia"/>
+          <w:b/>
+          <w:i w:val="0"/>
+          <w:color w:val="222222"/>
+          <w:sz w:val="21"/>
+        </w:rPr>
+        <w:t>Moonroot</w:t>
+      </w:r>
+      <w:r>
+        <w:rPr>
+          <w:rFonts w:ascii="Georgia" w:hAnsi="Georgia" w:cs="Georgia"/>
+          <w:b w:val="0"/>
+          <w:i w:val="0"/>
+          <w:color w:val="222222"/>
+          <w:sz w:val="21"/>
+        </w:rPr>
+        <w:t>, 75 gp, a rare herb Nina can brew into a potion that grants advantage on saving throws against being charmed.</w:t>
+      </w:r>
+    </w:p>
+    <w:p>
+      <w:pPr>
+        <w:pBdr>
+          <w:bottom w:val="double" w:sz="12" w:space="4" w:color="1F7A78"/>
+          <w:left w:val="double" w:sz="12" w:space="10" w:color="1F7A78"/>
+          <w:right w:val="double" w:sz="12" w:space="10" w:color="1F7A78"/>
+        </w:pBdr>
+        <w:shd w:val="clear" w:color="auto" w:fill="EAF4F3"/>
+        <w:spacing w:before="0" w:after="280"/>
+        <w:ind w:left="400" w:right="400"/>
+      </w:pPr>
+      <w:r>
+        <w:rPr>
+          <w:rFonts w:ascii="Georgia" w:hAnsi="Georgia" w:cs="Georgia"/>
+          <w:b/>
+          <w:i w:val="0"/>
+          <w:color w:val="222222"/>
+          <w:sz w:val="21"/>
+        </w:rPr>
+        <w:t>The Old Oak Tavern.</w:t>
+      </w:r>
+      <w:r>
+        <w:rPr>
+          <w:rFonts w:ascii="Georgia" w:hAnsi="Georgia" w:cs="Georgia"/>
+          <w:b w:val="0"/>
+          <w:i w:val="0"/>
+          <w:color w:val="222222"/>
+          <w:sz w:val="21"/>
+        </w:rPr>
+        <w:t xml:space="preserve"> Hot stew, fresh bread, and cider; a warm room for the night is </w:t>
+      </w:r>
+      <w:r>
+        <w:rPr>
+          <w:rFonts w:ascii="Georgia" w:hAnsi="Georgia" w:cs="Georgia"/>
+          <w:b/>
+          <w:i w:val="0"/>
+          <w:color w:val="222222"/>
+          <w:sz w:val="21"/>
+        </w:rPr>
+        <w:t>5 silver</w:t>
+      </w:r>
+      <w:r>
+        <w:rPr>
+          <w:rFonts w:ascii="Georgia" w:hAnsi="Georgia" w:cs="Georgia"/>
+          <w:b w:val="0"/>
+          <w:i w:val="0"/>
+          <w:color w:val="222222"/>
+          <w:sz w:val="21"/>
+        </w:rPr>
+        <w:t xml:space="preserve"> per person. A night here is a long rest.</w:t>
       </w:r>
     </w:p>
     <w:p>
@@ -3272,7 +3659,82 @@
           <w:color w:val="222222"/>
           <w:sz w:val="21"/>
         </w:rPr>
-        <w:t>As the party finishes eating, Merwin comes to their table, and the smith's steadiness in his face has a crack of worry in it.</w:t>
+        <w:t xml:space="preserve">In the warm little </w:t>
+      </w:r>
+      <w:r>
+        <w:rPr>
+          <w:rFonts w:ascii="Georgia" w:hAnsi="Georgia" w:cs="Georgia"/>
+          <w:b/>
+          <w:i w:val="0"/>
+          <w:color w:val="222222"/>
+          <w:sz w:val="21"/>
+        </w:rPr>
+        <w:t>Old Oak Tavern</w:t>
+      </w:r>
+      <w:r>
+        <w:rPr>
+          <w:rFonts w:ascii="Georgia" w:hAnsi="Georgia" w:cs="Georgia"/>
+          <w:b w:val="0"/>
+          <w:i w:val="0"/>
+          <w:color w:val="222222"/>
+          <w:sz w:val="21"/>
+        </w:rPr>
+        <w:t xml:space="preserve">, the keeper </w:t>
+      </w:r>
+      <w:r>
+        <w:rPr>
+          <w:rFonts w:ascii="Georgia" w:hAnsi="Georgia" w:cs="Georgia"/>
+          <w:b/>
+          <w:i w:val="0"/>
+          <w:color w:val="222222"/>
+          <w:sz w:val="21"/>
+        </w:rPr>
+        <w:t>Alwen</w:t>
+      </w:r>
+      <w:r>
+        <w:rPr>
+          <w:rFonts w:ascii="Georgia" w:hAnsi="Georgia" w:cs="Georgia"/>
+          <w:b w:val="0"/>
+          <w:i w:val="0"/>
+          <w:color w:val="222222"/>
+          <w:sz w:val="21"/>
+        </w:rPr>
+        <w:t xml:space="preserve"> sets down bowls of hot stew unasked. “Well now, travelers! Made it just in time for dinner. Take a seat, and I will bring you a bowl.” Around the fire, villagers whisper of a glowing fox darting through the trees, and of old Merwin muttering that </w:t>
+      </w:r>
+      <w:r>
+        <w:rPr>
+          <w:rFonts w:ascii="Georgia" w:hAnsi="Georgia" w:cs="Georgia"/>
+          <w:b w:val="0"/>
+          <w:i/>
+          <w:color w:val="222222"/>
+          <w:sz w:val="21"/>
+        </w:rPr>
+        <w:t>the planes are bleeding together</w:t>
+      </w:r>
+      <w:r>
+        <w:rPr>
+          <w:rFonts w:ascii="Georgia" w:hAnsi="Georgia" w:cs="Georgia"/>
+          <w:b w:val="0"/>
+          <w:i w:val="0"/>
+          <w:color w:val="222222"/>
+          <w:sz w:val="21"/>
+        </w:rPr>
+        <w:t>.</w:t>
+      </w:r>
+    </w:p>
+    <w:p>
+      <w:pPr>
+        <w:keepNext/>
+        <w:spacing w:before="220" w:after="60"/>
+      </w:pPr>
+      <w:r>
+        <w:rPr>
+          <w:rFonts w:ascii="Georgia" w:hAnsi="Georgia" w:cs="Georgia"/>
+          <w:b/>
+          <w:color w:val="A0522D"/>
+          <w:sz w:val="26"/>
+        </w:rPr>
+        <w:t>The Missing Villagers</w:t>
       </w:r>
     </w:p>
     <w:p>
@@ -3287,22 +3749,12 @@
       <w:r>
         <w:rPr>
           <w:rFonts w:ascii="Georgia" w:hAnsi="Georgia" w:cs="Georgia"/>
-          <w:b/>
-          <w:i w:val="0"/>
-          <w:color w:val="222222"/>
-          <w:sz w:val="21"/>
-        </w:rPr>
-        <w:t>Merwin:</w:t>
-      </w:r>
-      <w:r>
-        <w:rPr>
-          <w:rFonts w:ascii="Georgia" w:hAnsi="Georgia" w:cs="Georgia"/>
           <w:b w:val="0"/>
           <w:i w:val="0"/>
           <w:color w:val="222222"/>
           <w:sz w:val="21"/>
         </w:rPr>
-        <w:t xml:space="preserve"> “There is something I did not mention earlier. A few of our young folk went into the forest to gather herbs, days ago now. They have not come back. I have sent search parties and found nothing. If you are willing to look, you will have fifty gold and my gratitude, and Oakshade's with it.”</w:t>
+        <w:t>As the party finishes eating, Merwin comes to their table, and the smith's steadiness in his face has a crack of worry in it.</w:t>
       </w:r>
     </w:p>
     <w:p>
@@ -3317,11 +3769,41 @@
       <w:r>
         <w:rPr>
           <w:rFonts w:ascii="Georgia" w:hAnsi="Georgia" w:cs="Georgia"/>
+          <w:b/>
+          <w:i w:val="0"/>
+          <w:color w:val="222222"/>
+          <w:sz w:val="21"/>
+        </w:rPr>
+        <w:t>Merwin:</w:t>
+      </w:r>
+      <w:r>
+        <w:rPr>
+          <w:rFonts w:ascii="Georgia" w:hAnsi="Georgia" w:cs="Georgia"/>
           <w:b w:val="0"/>
           <w:i w:val="0"/>
           <w:color w:val="222222"/>
           <w:sz w:val="21"/>
         </w:rPr>
+        <w:t xml:space="preserve"> “There is something I did not mention earlier. A few of our young folk went into the forest to gather herbs, days ago now. They have not come back. I have sent search parties and found nothing. If you are willing to look, you will have fifty gold and my gratitude, and Oakshade's with it.”</w:t>
+      </w:r>
+    </w:p>
+    <w:p>
+      <w:pPr>
+        <w:pBdr>
+          <w:left w:val="single" w:sz="18" w:space="12" w:color="B8860B"/>
+        </w:pBdr>
+        <w:shd w:val="clear" w:color="auto" w:fill="FBF6EA"/>
+        <w:spacing w:before="30" w:after="70"/>
+        <w:ind w:left="340" w:right="340"/>
+      </w:pPr>
+      <w:r>
+        <w:rPr>
+          <w:rFonts w:ascii="Georgia" w:hAnsi="Georgia" w:cs="Georgia"/>
+          <w:b w:val="0"/>
+          <w:i w:val="0"/>
+          <w:color w:val="222222"/>
+          <w:sz w:val="21"/>
+        </w:rPr>
         <w:t>The party trades one look and agrees on the spot. But the search will wait for daylight. Tonight there are warm rooms above the tavern, and for the first time since three strangers collided at the Gilded Acorn, the new friends sleep under one roof: a gnome far from the deep places, a goblin far from his clan, a boy whose father watched these same stars, and one small fey creature dreaming, whatever fey creatures dream.</w:t>
       </w:r>
     </w:p>
@@ -3334,7 +3816,7 @@
       <w:r>
         <w:drawing>
           <wp:inline xmlns:a="http://schemas.openxmlformats.org/drawingml/2006/main" xmlns:pic="http://schemas.openxmlformats.org/drawingml/2006/picture">
-            <wp:extent cx="5303520" cy="3532227"/>
+            <wp:extent cx="5259083" cy="4206239"/>
             <wp:docPr id="13" name="Picture 13"/>
             <wp:cNvGraphicFramePr>
               <a:graphicFrameLocks noChangeAspect="1"/>
@@ -3355,7 +3837,7 @@
                   <pic:spPr>
                     <a:xfrm>
                       <a:off x="0" y="0"/>
-                      <a:ext cx="5303520" cy="3532227"/>
+                      <a:ext cx="5259083" cy="4206239"/>
                     </a:xfrm>
                     <a:prstGeom prst="rect"/>
                   </pic:spPr>
@@ -3521,7 +4003,7 @@
           <w:color w:val="222222"/>
           <w:sz w:val="18"/>
         </w:rPr>
-        <w:t>. AC 13 (natural armor), HP 27 (5d6 + 10), Speed 30 ft.</w:t>
+        <w:t xml:space="preserve"> (200 XP). AC 13 (natural armor), HP 27 (5d6 + 10), Speed 30 ft.</w:t>
       </w:r>
     </w:p>
     <w:p>
@@ -3711,7 +4193,7 @@
           <w:color w:val="222222"/>
           <w:sz w:val="18"/>
         </w:rPr>
-        <w:t>. AC 15, HP 52 (8d8 + 16), Speed 30 ft., fly 30 ft.</w:t>
+        <w:t xml:space="preserve"> (1,100 XP). AC 15, HP 52 (8d8 + 16), Speed 30 ft., fly 30 ft.</w:t>
       </w:r>
     </w:p>
     <w:p>
@@ -3841,7 +4323,7 @@
           <w:color w:val="222222"/>
           <w:sz w:val="18"/>
         </w:rPr>
-        <w:t xml:space="preserve"> 15 ft., DC 14 Wisdom save or frightened 1 minute.</w:t>
+        <w:t xml:space="preserve"> 15 ft., DC 14 Wisdom save or frightened 1 minute (repeat the save at the end of each turn).</w:t>
       </w:r>
     </w:p>
     <w:p>
@@ -3931,7 +4413,7 @@
           <w:color w:val="222222"/>
           <w:sz w:val="18"/>
         </w:rPr>
-        <w:t>. AC 14, HP 45 (6d8 + 18), fly 30 ft. (hover).</w:t>
+        <w:t xml:space="preserve"> (700 XP). AC 14, HP 45 (6d8 + 18), fly 30 ft. (hover).</w:t>
       </w:r>
     </w:p>
     <w:p>
@@ -4061,7 +4543,7 @@
           <w:color w:val="222222"/>
           <w:sz w:val="18"/>
         </w:rPr>
-        <w:t xml:space="preserve"> 15 ft. radius, DC 13 Wisdom save or confused 1 minute.</w:t>
+        <w:t xml:space="preserve"> 15 ft. radius, DC 13 Wisdom save or confused (as the confusion spell) 1 minute; repeat the save at the end of each turn.</w:t>
       </w:r>
     </w:p>
     <w:p>
@@ -4181,7 +4663,7 @@
           <w:color w:val="222222"/>
           <w:sz w:val="18"/>
         </w:rPr>
-        <w:t>. AC 13, HP 39, Speed 40 ft.</w:t>
+        <w:t xml:space="preserve"> (450 XP). AC 13, HP 39 (6d8 + 12), Speed 40 ft.</w:t>
       </w:r>
     </w:p>
     <w:p>
@@ -4196,22 +4678,12 @@
       <w:r>
         <w:rPr>
           <w:rFonts w:ascii="Georgia" w:hAnsi="Georgia" w:cs="Georgia"/>
-          <w:b/>
-          <w:i w:val="0"/>
-          <w:color w:val="222222"/>
-          <w:sz w:val="18"/>
-        </w:rPr>
-        <w:t>Claw and Bite.</w:t>
-      </w:r>
-      <w:r>
-        <w:rPr>
-          <w:rFonts w:ascii="Georgia" w:hAnsi="Georgia" w:cs="Georgia"/>
           <w:b w:val="0"/>
           <w:i w:val="0"/>
           <w:color w:val="222222"/>
           <w:sz w:val="18"/>
         </w:rPr>
-        <w:t xml:space="preserve"> Pack hunters that strike from heavy fog.</w:t>
+        <w:t>STR 14, DEX 16, CON 14, INT 6, WIS 12, CHA 8. Skills Perception +3, Stealth +5. Darkvision 60 ft.</w:t>
       </w:r>
     </w:p>
     <w:p>
@@ -4231,7 +4703,7 @@
           <w:color w:val="222222"/>
           <w:sz w:val="18"/>
         </w:rPr>
-        <w:t>Fog Cloak.</w:t>
+        <w:t>Multiattack.</w:t>
       </w:r>
       <w:r>
         <w:rPr>
@@ -4241,7 +4713,7 @@
           <w:color w:val="222222"/>
           <w:sz w:val="18"/>
         </w:rPr>
-        <w:t xml:space="preserve"> Wraps itself in mist, heavily obscured for 1 round.</w:t>
+        <w:t xml:space="preserve"> One bite and one claw.</w:t>
       </w:r>
     </w:p>
     <w:p>
@@ -4261,7 +4733,7 @@
           <w:color w:val="222222"/>
           <w:sz w:val="18"/>
         </w:rPr>
-        <w:t>Howl of the Mist.</w:t>
+        <w:t>Bite.</w:t>
       </w:r>
       <w:r>
         <w:rPr>
@@ -4271,7 +4743,87 @@
           <w:color w:val="222222"/>
           <w:sz w:val="18"/>
         </w:rPr>
-        <w:t xml:space="preserve"> Frightens prey within 30 ft. (Wisdom save).</w:t>
+        <w:t xml:space="preserve"> +5, reach 5 ft., 1d8 + 3 piercing. </w:t>
+      </w:r>
+      <w:r>
+        <w:rPr>
+          <w:rFonts w:ascii="Georgia" w:hAnsi="Georgia" w:cs="Georgia"/>
+          <w:b/>
+          <w:i w:val="0"/>
+          <w:color w:val="222222"/>
+          <w:sz w:val="18"/>
+        </w:rPr>
+        <w:t>Claw.</w:t>
+      </w:r>
+      <w:r>
+        <w:rPr>
+          <w:rFonts w:ascii="Georgia" w:hAnsi="Georgia" w:cs="Georgia"/>
+          <w:b w:val="0"/>
+          <w:i w:val="0"/>
+          <w:color w:val="222222"/>
+          <w:sz w:val="18"/>
+        </w:rPr>
+        <w:t xml:space="preserve"> +5, reach 5 ft., 2d4 + 3 slashing.</w:t>
+      </w:r>
+    </w:p>
+    <w:p>
+      <w:pPr>
+        <w:pBdr>
+          <w:left w:val="single" w:sz="18" w:space="12" w:color="8B2020"/>
+        </w:pBdr>
+        <w:shd w:val="clear" w:color="auto" w:fill="FCF6F6"/>
+        <w:spacing w:before="30" w:after="70"/>
+        <w:ind w:left="340" w:right="340"/>
+      </w:pPr>
+      <w:r>
+        <w:rPr>
+          <w:rFonts w:ascii="Georgia" w:hAnsi="Georgia" w:cs="Georgia"/>
+          <w:b/>
+          <w:i w:val="0"/>
+          <w:color w:val="222222"/>
+          <w:sz w:val="18"/>
+        </w:rPr>
+        <w:t>Fog Cloak (Bonus Action).</w:t>
+      </w:r>
+      <w:r>
+        <w:rPr>
+          <w:rFonts w:ascii="Georgia" w:hAnsi="Georgia" w:cs="Georgia"/>
+          <w:b w:val="0"/>
+          <w:i w:val="0"/>
+          <w:color w:val="222222"/>
+          <w:sz w:val="18"/>
+        </w:rPr>
+        <w:t xml:space="preserve"> Wraps itself in mist: heavily obscured until the start of its next turn.</w:t>
+      </w:r>
+    </w:p>
+    <w:p>
+      <w:pPr>
+        <w:pBdr>
+          <w:left w:val="single" w:sz="18" w:space="12" w:color="8B2020"/>
+        </w:pBdr>
+        <w:shd w:val="clear" w:color="auto" w:fill="FCF6F6"/>
+        <w:spacing w:before="30" w:after="70"/>
+        <w:ind w:left="340" w:right="340"/>
+      </w:pPr>
+      <w:r>
+        <w:rPr>
+          <w:rFonts w:ascii="Georgia" w:hAnsi="Georgia" w:cs="Georgia"/>
+          <w:b/>
+          <w:i w:val="0"/>
+          <w:color w:val="222222"/>
+          <w:sz w:val="18"/>
+        </w:rPr>
+        <w:t>Howl of the Mist (Recharge 5-6).</w:t>
+      </w:r>
+      <w:r>
+        <w:rPr>
+          <w:rFonts w:ascii="Georgia" w:hAnsi="Georgia" w:cs="Georgia"/>
+          <w:b w:val="0"/>
+          <w:i w:val="0"/>
+          <w:color w:val="222222"/>
+          <w:sz w:val="18"/>
+        </w:rPr>
+        <w:t xml:space="preserve"> Each enemy within 30 ft.: DC 13 Wisdom save or frightened until the end of the stalker's next turn.</w:t>
       </w:r>
     </w:p>
     <w:sectPr>

</xml_diff>

<commit_message>
Every session now ends like Session 7: DM run sheet + card bestiary
- New engine blocks replicating the S7 appendix anatomy: appendix_title,
  fight_header, enemy_cards (crimson-banner two-up cards, never split),
  tactics line, and a gold reward_card sibling
- Sessions 1-6 endings converted: 2-page DM run sheets (shape of the
  session, fights at a glance, resource picture, spotlights and seeds,
  foreshadow tracker) + bestiary appendices grouped by encounter in
  play order, every number transcribed from the audited stat boxes
- Bosses get solo full-width cards; allies (Lickgloom, the companion
  choice) marked with teal banners
- In-session gold reward cards: The Gifts of Faelan (S4), The Relics
  of Wraithpine (S6)
- Full republish; geometry sweep reports zero issues book-wide

Co-Authored-By: Claude Opus 4.8 <noreply@anthropic.com>
</commit_message>
<xml_diff>
--- a/sessions/session_01_gathering_of_friends.docx
+++ b/sessions/session_01_gathering_of_friends.docx
@@ -286,7 +286,7 @@
           <w:color w:val="222222"/>
           <w:sz w:val="19"/>
         </w:rPr>
-        <w:t>. Full creature statistics for every session live in the compendium; a compact appendix closes each session.</w:t>
+        <w:t>. Full creature statistics for every session live in the compendium; a DM run sheet and bestiary close each session.</w:t>
       </w:r>
     </w:p>
     <w:p>
@@ -3921,6 +3921,52 @@
       <w:pPr>
         <w:keepNext/>
         <w:pageBreakBefore/>
+        <w:spacing w:before="200" w:after="40"/>
+        <w:jc w:val="center"/>
+      </w:pPr>
+      <w:r>
+        <w:rPr>
+          <w:rFonts w:ascii="Georgia" w:hAnsi="Georgia" w:cs="Georgia"/>
+          <w:b/>
+          <w:color w:val="B8860B"/>
+          <w:sz w:val="21"/>
+        </w:rPr>
+        <w:t>APPENDIX</w:t>
+      </w:r>
+    </w:p>
+    <w:p>
+      <w:pPr>
+        <w:keepNext/>
+        <w:spacing w:after="40"/>
+        <w:jc w:val="center"/>
+      </w:pPr>
+      <w:r>
+        <w:rPr>
+          <w:rFonts w:ascii="Georgia" w:hAnsi="Georgia" w:cs="Georgia"/>
+          <w:b/>
+          <w:color w:val="8B2020"/>
+          <w:sz w:val="32"/>
+        </w:rPr>
+        <w:t>DM Run Sheet: The Day at a Glance</w:t>
+      </w:r>
+    </w:p>
+    <w:p>
+      <w:pPr>
+        <w:spacing w:after="200"/>
+        <w:jc w:val="center"/>
+      </w:pPr>
+      <w:r>
+        <w:rPr>
+          <w:rFonts w:ascii="Georgia" w:hAnsi="Georgia" w:cs="Georgia"/>
+          <w:color w:val="A0522D"/>
+          <w:sz w:val="21"/>
+        </w:rPr>
+        <w:t>Every DC, dial, and spotlight, in play order. Keep this page at your elbow.</w:t>
+      </w:r>
+    </w:p>
+    <w:p>
+      <w:pPr>
+        <w:keepNext/>
         <w:spacing w:before="400" w:after="120"/>
         <w:pBdr>
           <w:bottom w:val="single" w:sz="6" w:space="4" w:color="B8860B"/>
@@ -3933,7 +3979,7 @@
           <w:color w:val="B8860B"/>
           <w:sz w:val="32"/>
         </w:rPr>
-        <w:t>Appendix: Creatures of Session One</w:t>
+        <w:t>The Shape of the Session</w:t>
       </w:r>
     </w:p>
     <w:p>
@@ -3948,37 +3994,148 @@
           <w:color w:val="222222"/>
           <w:sz w:val="21"/>
         </w:rPr>
-        <w:t>Compact statistics for the table. The full bestiary, with lore and pictures, lives in the compendium.</w:t>
+        <w:t>▶ Four parts, four fights, one friend. P1 the Gilded Acorn (roleplay: three meetings, Osric and Rhea's rumors) → FIGHT 1, the brawl. P2 the Whispering Pond: Lickgloom (Perception DC 12 to spot it; Insight DC 10: playful, not a threat; Animal Handling DC 12 plus a snack = a companion). P3 the Forest of Whispers: FIGHT 2, Duckleaf at the stone circle → the first mote (Arcana DC 14) → FIGHT 3, Cognifin's test at the grove → the second mote. P4 the foggy road (roots: Acrobatics DC 12, 1d4 on a stumble; path: Perception DC 13 or ambushed on the Stalkers' ground): FIGHT 4, the Mist Stalkers → two fey motes → Oakshade (roleplay: Merwin, Nina, the shops) → the hook (missing villagers, 50 gp) → LONG REST at the Old Oak Tavern. Natural break point: the pond.</w:t>
       </w:r>
     </w:p>
     <w:p>
       <w:pPr>
         <w:keepNext/>
+        <w:spacing w:before="400" w:after="120"/>
         <w:pBdr>
-          <w:left w:val="single" w:sz="18" w:space="12" w:color="8B2020"/>
+          <w:bottom w:val="single" w:sz="6" w:space="4" w:color="B8860B"/>
         </w:pBdr>
-        <w:shd w:val="clear" w:color="auto" w:fill="FCF6F6"/>
-        <w:spacing w:before="30" w:after="70"/>
-        <w:ind w:left="340" w:right="340"/>
       </w:pPr>
       <w:r>
         <w:rPr>
           <w:rFonts w:ascii="Georgia" w:hAnsi="Georgia" w:cs="Georgia"/>
           <w:b/>
-          <w:color w:val="8B2020"/>
-          <w:sz w:val="22"/>
+          <w:color w:val="B8860B"/>
+          <w:sz w:val="32"/>
         </w:rPr>
-        <w:t>Lickgloom</w:t>
+        <w:t>Fights at a Glance</w:t>
       </w:r>
     </w:p>
     <w:p>
       <w:pPr>
+        <w:spacing w:after="80"/>
+      </w:pPr>
+      <w:r>
+        <w:rPr>
+          <w:rFonts w:ascii="Georgia" w:hAnsi="Georgia" w:cs="Georgia"/>
+          <w:b/>
+          <w:i w:val="0"/>
+          <w:color w:val="222222"/>
+          <w:sz w:val="21"/>
+        </w:rPr>
+        <w:t>FIGHT 1: The Bar Brawl</w:t>
+      </w:r>
+      <w:r>
+        <w:rPr>
+          <w:rFonts w:ascii="Georgia" w:hAnsi="Georgia" w:cs="Georgia"/>
+          <w:b w:val="0"/>
+          <w:i w:val="0"/>
+          <w:color w:val="222222"/>
+          <w:sz w:val="21"/>
+        </w:rPr>
+        <w:t xml:space="preserve"> (Easy; strictly non lethal). Bren (AC 12, HP 8, fists +3, 1d4 + 1) + 2x Regulars (AC 11, HP 6, fists +3, 1d4): brute force, ganging up on one or two heroes with fists, chairs, and one regrettable mug. Osric steps in if it gets too hot; a downed hero wakes in a minute with cider on the house.</w:t>
+      </w:r>
+    </w:p>
+    <w:p>
+      <w:pPr>
+        <w:spacing w:after="80"/>
+      </w:pPr>
+      <w:r>
+        <w:rPr>
+          <w:rFonts w:ascii="Georgia" w:hAnsi="Georgia" w:cs="Georgia"/>
+          <w:b/>
+          <w:i w:val="0"/>
+          <w:color w:val="222222"/>
+          <w:sz w:val="21"/>
+        </w:rPr>
+        <w:t>FIGHT 2: The Stone Circle</w:t>
+      </w:r>
+      <w:r>
+        <w:rPr>
+          <w:rFonts w:ascii="Georgia" w:hAnsi="Georgia" w:cs="Georgia"/>
+          <w:b w:val="0"/>
+          <w:i w:val="0"/>
+          <w:color w:val="222222"/>
+          <w:sz w:val="21"/>
+        </w:rPr>
+        <w:t xml:space="preserve"> (Hard; the stones are the puzzle). Duckleaf (AC 15, HP 52, fly 30 ft; RESISTS slashing &amp; bludgeoning): opens Aerial Slash +5 (3d6 + 3) at range, Winged Leap skips 30 ft out of melee without provoking, saves Quack of Fury (rech 5-6; 15 ft, DC 14 Wis, frightened) for a bunched party. THE RULE: disrupt one circle stone (Arcana or Nature DC 14 to see why) and Winged Leap is gone for the fight; ladder the hints if they stall. THE OUT: it is a guardian, not a hunter; heroes who withdraw are allowed to leave.</w:t>
+      </w:r>
+    </w:p>
+    <w:p>
+      <w:pPr>
+        <w:spacing w:after="80"/>
+      </w:pPr>
+      <w:r>
+        <w:rPr>
+          <w:rFonts w:ascii="Georgia" w:hAnsi="Georgia" w:cs="Georgia"/>
+          <w:b/>
+          <w:i w:val="0"/>
+          <w:color w:val="222222"/>
+          <w:sz w:val="21"/>
+        </w:rPr>
+        <w:t>FIGHT 3: The Grove</w:t>
+      </w:r>
+      <w:r>
+        <w:rPr>
+          <w:rFonts w:ascii="Georgia" w:hAnsi="Georgia" w:cs="Georgia"/>
+          <w:b w:val="0"/>
+          <w:i w:val="0"/>
+          <w:color w:val="222222"/>
+          <w:sz w:val="21"/>
+        </w:rPr>
+        <w:t xml:space="preserve"> (Medium; stern, never lethal). Cognifin (AC 14, HP 45, hover; RESISTS cold &amp; psychic; Psychic Shield reaction +2 AC): Water Pulse +4 (2d6 + 2, DC 12 Str or prone) on the closest hero, Headache Blast +4 (2d6 + 2 psychic) on the back line, Confusion Pulse (rech 5-6; 15 ft, DC 13 Wis) when they bunch; legendary waters between turns (whirlpool: DC 12 Str, restrained / tidal wave: 2d4, push 5 ft). THE RULE: disturbing the pond's surface (spell, splash, thrown rock) silences the legendary waters for a round. THE OUT: a dropped hero washes gently to the bank, stable; a beaten party wakes at the grove's edge, free to try again once rested.</w:t>
+      </w:r>
+    </w:p>
+    <w:p>
+      <w:pPr>
+        <w:spacing w:after="80"/>
+      </w:pPr>
+      <w:r>
+        <w:rPr>
+          <w:rFonts w:ascii="Georgia" w:hAnsi="Georgia" w:cs="Georgia"/>
+          <w:b/>
+          <w:i w:val="0"/>
+          <w:color w:val="222222"/>
+          <w:sz w:val="21"/>
+        </w:rPr>
+        <w:t>FIGHT 4: The Foggy Road</w:t>
+      </w:r>
+      <w:r>
+        <w:rPr>
+          <w:rFonts w:ascii="Georgia" w:hAnsi="Georgia" w:cs="Georgia"/>
+          <w:b w:val="0"/>
+          <w:i w:val="0"/>
+          <w:color w:val="222222"/>
+          <w:sz w:val="21"/>
+        </w:rPr>
+        <w:t xml:space="preserve"> (Medium; fear is the weapon). 2x Mist Stalker (AC 13, HP 39, Speed 40 ft; Stealth +5): Fog Cloak (bonus action) for heavy obscurement, then bite +5 (1d8 + 3) and claw +5 (2d4 + 3); Howl of the Mist (rech 5-6; 30 ft, DC 13 Wis, frightened) rolls in from every direction at once. THE RULE: they will not leave their fog; a strong wind or a gust of magic thins the mist and steals their cover and their nerve. THE OUT: heroes who regain the road and keep moving escape them.</w:t>
+      </w:r>
+    </w:p>
+    <w:p>
+      <w:pPr>
+        <w:keepNext/>
+        <w:spacing w:before="400" w:after="120"/>
         <w:pBdr>
-          <w:left w:val="single" w:sz="18" w:space="12" w:color="8B2020"/>
+          <w:bottom w:val="single" w:sz="6" w:space="4" w:color="B8860B"/>
         </w:pBdr>
-        <w:shd w:val="clear" w:color="auto" w:fill="FCF6F6"/>
-        <w:spacing w:before="30" w:after="70"/>
-        <w:ind w:left="340" w:right="340"/>
+      </w:pPr>
+      <w:r>
+        <w:rPr>
+          <w:rFonts w:ascii="Georgia" w:hAnsi="Georgia" w:cs="Georgia"/>
+          <w:b/>
+          <w:color w:val="B8860B"/>
+          <w:sz w:val="32"/>
+        </w:rPr>
+        <w:t>The Resource Picture</w:t>
+      </w:r>
+    </w:p>
+    <w:p>
+      <w:pPr>
+        <w:spacing w:after="80"/>
       </w:pPr>
       <w:r>
         <w:rPr>
@@ -3986,19 +4143,42 @@
           <w:b w:val="0"/>
           <w:i w:val="0"/>
           <w:color w:val="222222"/>
-          <w:sz w:val="18"/>
+          <w:sz w:val="21"/>
         </w:rPr>
-        <w:t xml:space="preserve">Small fey (Feywild), neutral. </w:t>
+        <w:t>▶ Level 3, fresh, and no rest until Oakshade: the brawl costs nothing but pride, so the real spend is the forest. Duckleaf and Cognifin land back to back; watch Stabby's focus and Ursa's slots between them, and remember Cognifin's test cannot kill (a fallen hero washes ashore, stable). The Mist Stalkers hunt a tired party at dusk, and the frightened condition is the real drain in every fight, so celebrate the saves. The night at the Old Oak Tavern (5 silver a head) is a full long rest, and Oakshade sells the restock: Potion of Healing 50 gp, antitoxin 25 gp, Moonroot 75 gp, a silvered weapon for 100 gp, with Merwin's 50 gp bounty there to pay for it.</w:t>
       </w:r>
+    </w:p>
+    <w:p>
+      <w:pPr>
+        <w:keepNext/>
+        <w:spacing w:before="400" w:after="120"/>
+        <w:pBdr>
+          <w:bottom w:val="single" w:sz="6" w:space="4" w:color="B8860B"/>
+        </w:pBdr>
+      </w:pPr>
+      <w:r>
+        <w:rPr>
+          <w:rFonts w:ascii="Georgia" w:hAnsi="Georgia" w:cs="Georgia"/>
+          <w:b/>
+          <w:color w:val="B8860B"/>
+          <w:sz w:val="32"/>
+        </w:rPr>
+        <w:t>Spotlights &amp; Seeds: every kid shines, every door gets planted</w:t>
+      </w:r>
+    </w:p>
+    <w:p>
+      <w:pPr>
+        <w:spacing w:after="80"/>
+      </w:pPr>
       <w:r>
         <w:rPr>
           <w:rFonts w:ascii="Georgia" w:hAnsi="Georgia" w:cs="Georgia"/>
           <w:b/>
           <w:i w:val="0"/>
           <w:color w:val="222222"/>
-          <w:sz w:val="18"/>
+          <w:sz w:val="21"/>
         </w:rPr>
-        <w:t>CR 1</w:t>
+        <w:t>Lilly:</w:t>
       </w:r>
       <w:r>
         <w:rPr>
@@ -4006,19 +4186,82 @@
           <w:b w:val="0"/>
           <w:i w:val="0"/>
           <w:color w:val="222222"/>
-          <w:sz w:val="18"/>
+          <w:sz w:val="21"/>
         </w:rPr>
-        <w:t xml:space="preserve"> (200 XP). AC 13 (natural armor), HP 27 (5d6 + 10), Speed 30 ft.</w:t>
+        <w:t xml:space="preserve"> her arrival opens the whole chronicle: the Essence Sphere and the name Ursa Catchum (Door: wake Pikachu) → the brawl: gadgets that spark and startle → the Duckleaf duel: she reads the rippling stones and shouts the secret (“the circle is feeding it!”) → after the mote, the session's thesis is hers: “Something is leaking into our world.”</w:t>
       </w:r>
     </w:p>
     <w:p>
       <w:pPr>
+        <w:spacing w:after="80"/>
+      </w:pPr>
+      <w:r>
+        <w:rPr>
+          <w:rFonts w:ascii="Georgia" w:hAnsi="Georgia" w:cs="Georgia"/>
+          <w:b/>
+          <w:i w:val="0"/>
+          <w:color w:val="222222"/>
+          <w:sz w:val="21"/>
+        </w:rPr>
+        <w:t>Stabby:</w:t>
+      </w:r>
+      <w:r>
+        <w:rPr>
+          <w:rFonts w:ascii="Georgia" w:hAnsi="Georgia" w:cs="Georgia"/>
+          <w:b w:val="0"/>
+          <w:i w:val="0"/>
+          <w:color w:val="222222"/>
+          <w:sz w:val="21"/>
+        </w:rPr>
+        <w:t xml:space="preserve"> the BANG of the tavern door is his overture → the brawl is his stage: he fights like a rumor, everywhere and nowhere → faster than Duckleaf's wind, laughing on Cognifin's slick stones → seeds: the Bloodfang Clan and Master Kaelon in his introduction (Door: the clan catches up with him in Session 2).</w:t>
+      </w:r>
+    </w:p>
+    <w:p>
+      <w:pPr>
+        <w:spacing w:after="80"/>
+      </w:pPr>
+      <w:r>
+        <w:rPr>
+          <w:rFonts w:ascii="Georgia" w:hAnsi="Georgia" w:cs="Georgia"/>
+          <w:b/>
+          <w:i w:val="0"/>
+          <w:color w:val="222222"/>
+          <w:sz w:val="21"/>
+        </w:rPr>
+        <w:t>Ursa:</w:t>
+      </w:r>
+      <w:r>
+        <w:rPr>
+          <w:rFonts w:ascii="Georgia" w:hAnsi="Georgia" w:cs="Georgia"/>
+          <w:b w:val="0"/>
+          <w:i w:val="0"/>
+          <w:color w:val="222222"/>
+          <w:sz w:val="21"/>
+        </w:rPr>
+        <w:t xml:space="preserve"> a stranger asking for him BY NAME pulls him in from the fields → one piece of bread wins the party its first friend → his starlight finds Duckleaf wherever it lands → seeds: Ash Catchum's disappearance and the three enchanted potatoes (Door: his father's trail), and the stars that have been waiting for this evening.</w:t>
+      </w:r>
+    </w:p>
+    <w:p>
+      <w:pPr>
+        <w:keepNext/>
+        <w:spacing w:before="400" w:after="120"/>
         <w:pBdr>
-          <w:left w:val="single" w:sz="18" w:space="12" w:color="8B2020"/>
+          <w:bottom w:val="single" w:sz="6" w:space="4" w:color="B8860B"/>
         </w:pBdr>
-        <w:shd w:val="clear" w:color="auto" w:fill="FCF6F6"/>
-        <w:spacing w:before="30" w:after="70"/>
-        <w:ind w:left="340" w:right="340"/>
+      </w:pPr>
+      <w:r>
+        <w:rPr>
+          <w:rFonts w:ascii="Georgia" w:hAnsi="Georgia" w:cs="Georgia"/>
+          <w:b/>
+          <w:color w:val="B8860B"/>
+          <w:sz w:val="32"/>
+        </w:rPr>
+        <w:t>Foreshadow Tracker: say it, then say it again</w:t>
+      </w:r>
+    </w:p>
+    <w:p>
+      <w:pPr>
+        <w:spacing w:after="80"/>
       </w:pPr>
       <w:r>
         <w:rPr>
@@ -4026,809 +4269,3390 @@
           <w:b w:val="0"/>
           <w:i w:val="0"/>
           <w:color w:val="222222"/>
-          <w:sz w:val="18"/>
+          <w:sz w:val="21"/>
         </w:rPr>
-        <w:t>STR 14, DEX 12, CON 14, INT 6, WIS 10, CHA 8. Saves Dex +3; Skills Perception +2, Stealth +4.</w:t>
+        <w:t>▶ The tells, in order. Tavern hum x3 (Jarek's glow, strange winds, “the forest is waking up”) • Osric: “like they wandered in from... somewhere else” • Rhea: glowing eyes by the pond • wildflowers bloom out of season wherever Lickgloom walks • the MOTES, one per fallen planar creature: green wind (Duckleaf) → blue water (Cognifin) → twin fey glimmers (the Stalkers); Arcana DC 14 names the pattern • Merwin: “the planes are bleeding together” • the missing villagers: Session 2 walks in the door.</w:t>
       </w:r>
     </w:p>
     <w:p>
       <w:pPr>
-        <w:pBdr>
-          <w:left w:val="single" w:sz="18" w:space="12" w:color="8B2020"/>
-        </w:pBdr>
-        <w:shd w:val="clear" w:color="auto" w:fill="FCF6F6"/>
-        <w:spacing w:before="30" w:after="70"/>
-        <w:ind w:left="340" w:right="340"/>
-      </w:pPr>
-      <w:r>
-        <w:rPr>
-          <w:rFonts w:ascii="Georgia" w:hAnsi="Georgia" w:cs="Georgia"/>
-          <w:b w:val="0"/>
-          <w:i w:val="0"/>
-          <w:color w:val="222222"/>
-          <w:sz w:val="18"/>
-        </w:rPr>
-        <w:t>Resistances acid, poison. Darkvision 60 ft. Understands Common; telepathic impressions.</w:t>
-      </w:r>
-    </w:p>
-    <w:p>
-      <w:pPr>
-        <w:pBdr>
-          <w:left w:val="single" w:sz="18" w:space="12" w:color="8B2020"/>
-        </w:pBdr>
-        <w:shd w:val="clear" w:color="auto" w:fill="FCF6F6"/>
-        <w:spacing w:before="30" w:after="70"/>
-        <w:ind w:left="340" w:right="340"/>
+        <w:keepNext/>
+        <w:pageBreakBefore/>
+        <w:spacing w:before="200" w:after="40"/>
+        <w:jc w:val="center"/>
       </w:pPr>
       <w:r>
         <w:rPr>
           <w:rFonts w:ascii="Georgia" w:hAnsi="Georgia" w:cs="Georgia"/>
           <w:b/>
-          <w:i w:val="0"/>
-          <w:color w:val="222222"/>
-          <w:sz w:val="18"/>
+          <w:color w:val="B8860B"/>
+          <w:sz w:val="21"/>
         </w:rPr>
-        <w:t>Tongue Whip.</w:t>
-      </w:r>
-      <w:r>
-        <w:rPr>
-          <w:rFonts w:ascii="Georgia" w:hAnsi="Georgia" w:cs="Georgia"/>
-          <w:b w:val="0"/>
-          <w:i w:val="0"/>
-          <w:color w:val="222222"/>
-          <w:sz w:val="18"/>
-        </w:rPr>
-        <w:t xml:space="preserve"> +4, reach 10 ft., 1d6 + 2 bludgeoning; DC 12 Strength save or grappled.</w:t>
-      </w:r>
-    </w:p>
-    <w:p>
-      <w:pPr>
-        <w:pBdr>
-          <w:left w:val="single" w:sz="18" w:space="12" w:color="8B2020"/>
-        </w:pBdr>
-        <w:shd w:val="clear" w:color="auto" w:fill="FCF6F6"/>
-        <w:spacing w:before="30" w:after="70"/>
-        <w:ind w:left="340" w:right="340"/>
-      </w:pPr>
-      <w:r>
-        <w:rPr>
-          <w:rFonts w:ascii="Georgia" w:hAnsi="Georgia" w:cs="Georgia"/>
-          <w:b/>
-          <w:i w:val="0"/>
-          <w:color w:val="222222"/>
-          <w:sz w:val="18"/>
-        </w:rPr>
-        <w:t>Sticky Lick (Recharge 5-6).</w:t>
-      </w:r>
-      <w:r>
-        <w:rPr>
-          <w:rFonts w:ascii="Georgia" w:hAnsi="Georgia" w:cs="Georgia"/>
-          <w:b w:val="0"/>
-          <w:i w:val="0"/>
-          <w:color w:val="222222"/>
-          <w:sz w:val="18"/>
-        </w:rPr>
-        <w:t xml:space="preserve"> DC 13 Dexterity save or a small item is snatched.</w:t>
-      </w:r>
-    </w:p>
-    <w:p>
-      <w:pPr>
-        <w:pBdr>
-          <w:left w:val="single" w:sz="18" w:space="12" w:color="8B2020"/>
-        </w:pBdr>
-        <w:shd w:val="clear" w:color="auto" w:fill="FCF6F6"/>
-        <w:spacing w:before="30" w:after="70"/>
-        <w:ind w:left="340" w:right="340"/>
-      </w:pPr>
-      <w:r>
-        <w:rPr>
-          <w:rFonts w:ascii="Georgia" w:hAnsi="Georgia" w:cs="Georgia"/>
-          <w:b/>
-          <w:i w:val="0"/>
-          <w:color w:val="222222"/>
-          <w:sz w:val="18"/>
-        </w:rPr>
-        <w:t>Lick Attack.</w:t>
-      </w:r>
-      <w:r>
-        <w:rPr>
-          <w:rFonts w:ascii="Georgia" w:hAnsi="Georgia" w:cs="Georgia"/>
-          <w:b w:val="0"/>
-          <w:i w:val="0"/>
-          <w:color w:val="222222"/>
-          <w:sz w:val="18"/>
-        </w:rPr>
-        <w:t xml:space="preserve"> +4, 1d8 + 2 bludgeoning; DC 12 Constitution save or stunned one turn.</w:t>
+        <w:t>APPENDIX</w:t>
       </w:r>
     </w:p>
     <w:p>
       <w:pPr>
         <w:keepNext/>
-        <w:pBdr>
-          <w:left w:val="single" w:sz="18" w:space="12" w:color="8B2020"/>
-        </w:pBdr>
-        <w:shd w:val="clear" w:color="auto" w:fill="FCF6F6"/>
-        <w:spacing w:before="30" w:after="70"/>
-        <w:ind w:left="340" w:right="340"/>
+        <w:spacing w:after="40"/>
+        <w:jc w:val="center"/>
       </w:pPr>
       <w:r>
         <w:rPr>
           <w:rFonts w:ascii="Georgia" w:hAnsi="Georgia" w:cs="Georgia"/>
           <w:b/>
           <w:color w:val="8B2020"/>
-          <w:sz w:val="22"/>
+          <w:sz w:val="32"/>
         </w:rPr>
-        <w:t>Duckleaf</w:t>
+        <w:t>Bestiary: Enemy Stat Blocks</w:t>
       </w:r>
     </w:p>
     <w:p>
       <w:pPr>
-        <w:pBdr>
-          <w:left w:val="single" w:sz="18" w:space="12" w:color="8B2020"/>
-        </w:pBdr>
-        <w:shd w:val="clear" w:color="auto" w:fill="FCF6F6"/>
-        <w:spacing w:before="30" w:after="70"/>
-        <w:ind w:left="340" w:right="340"/>
+        <w:spacing w:after="200"/>
+        <w:jc w:val="center"/>
       </w:pPr>
       <w:r>
         <w:rPr>
           <w:rFonts w:ascii="Georgia" w:hAnsi="Georgia" w:cs="Georgia"/>
-          <w:b w:val="0"/>
-          <w:i w:val="0"/>
-          <w:color w:val="222222"/>
-          <w:sz w:val="18"/>
+          <w:color w:val="A0522D"/>
+          <w:sz w:val="21"/>
         </w:rPr>
-        <w:t xml:space="preserve">Small beast (Elemental Air), neutral. </w:t>
-      </w:r>
-      <w:r>
-        <w:rPr>
-          <w:rFonts w:ascii="Georgia" w:hAnsi="Georgia" w:cs="Georgia"/>
-          <w:b/>
-          <w:i w:val="0"/>
-          <w:color w:val="222222"/>
-          <w:sz w:val="18"/>
-        </w:rPr>
-        <w:t>CR 4</w:t>
-      </w:r>
-      <w:r>
-        <w:rPr>
-          <w:rFonts w:ascii="Georgia" w:hAnsi="Georgia" w:cs="Georgia"/>
-          <w:b w:val="0"/>
-          <w:i w:val="0"/>
-          <w:color w:val="222222"/>
-          <w:sz w:val="18"/>
-        </w:rPr>
-        <w:t xml:space="preserve"> (1,100 XP). AC 15, HP 52 (8d8 + 16), Speed 30 ft., fly 30 ft.</w:t>
-      </w:r>
-    </w:p>
-    <w:p>
-      <w:pPr>
-        <w:pBdr>
-          <w:left w:val="single" w:sz="18" w:space="12" w:color="8B2020"/>
-        </w:pBdr>
-        <w:shd w:val="clear" w:color="auto" w:fill="FCF6F6"/>
-        <w:spacing w:before="30" w:after="70"/>
-        <w:ind w:left="340" w:right="340"/>
-      </w:pPr>
-      <w:r>
-        <w:rPr>
-          <w:rFonts w:ascii="Georgia" w:hAnsi="Georgia" w:cs="Georgia"/>
-          <w:b w:val="0"/>
-          <w:i w:val="0"/>
-          <w:color w:val="222222"/>
-          <w:sz w:val="18"/>
-        </w:rPr>
-        <w:t>STR 14, DEX 16, CON 14, INT 10, WIS 12, CHA 10. Saves Dex +5, Wis +3; Acrobatics +5, Perception +3.</w:t>
-      </w:r>
-    </w:p>
-    <w:p>
-      <w:pPr>
-        <w:pBdr>
-          <w:left w:val="single" w:sz="18" w:space="12" w:color="8B2020"/>
-        </w:pBdr>
-        <w:shd w:val="clear" w:color="auto" w:fill="FCF6F6"/>
-        <w:spacing w:before="30" w:after="70"/>
-        <w:ind w:left="340" w:right="340"/>
-      </w:pPr>
-      <w:r>
-        <w:rPr>
-          <w:rFonts w:ascii="Georgia" w:hAnsi="Georgia" w:cs="Georgia"/>
-          <w:b w:val="0"/>
-          <w:i w:val="0"/>
-          <w:color w:val="222222"/>
-          <w:sz w:val="18"/>
-        </w:rPr>
-        <w:t>Resistances slashing, bludgeoning (wind sheath). Darkvision 60 ft. Telepathy 30 ft. (quacks).</w:t>
-      </w:r>
-    </w:p>
-    <w:p>
-      <w:pPr>
-        <w:pBdr>
-          <w:left w:val="single" w:sz="18" w:space="12" w:color="8B2020"/>
-        </w:pBdr>
-        <w:shd w:val="clear" w:color="auto" w:fill="FCF6F6"/>
-        <w:spacing w:before="30" w:after="70"/>
-        <w:ind w:left="340" w:right="340"/>
-      </w:pPr>
-      <w:r>
-        <w:rPr>
-          <w:rFonts w:ascii="Georgia" w:hAnsi="Georgia" w:cs="Georgia"/>
-          <w:b/>
-          <w:i w:val="0"/>
-          <w:color w:val="222222"/>
-          <w:sz w:val="18"/>
-        </w:rPr>
-        <w:t>Leek Strike.</w:t>
-      </w:r>
-      <w:r>
-        <w:rPr>
-          <w:rFonts w:ascii="Georgia" w:hAnsi="Georgia" w:cs="Georgia"/>
-          <w:b w:val="0"/>
-          <w:i w:val="0"/>
-          <w:color w:val="222222"/>
-          <w:sz w:val="18"/>
-        </w:rPr>
-        <w:t xml:space="preserve"> +6, reach 5 ft., 2d8 + 4 slashing.</w:t>
-      </w:r>
-    </w:p>
-    <w:p>
-      <w:pPr>
-        <w:pBdr>
-          <w:left w:val="single" w:sz="18" w:space="12" w:color="8B2020"/>
-        </w:pBdr>
-        <w:shd w:val="clear" w:color="auto" w:fill="FCF6F6"/>
-        <w:spacing w:before="30" w:after="70"/>
-        <w:ind w:left="340" w:right="340"/>
-      </w:pPr>
-      <w:r>
-        <w:rPr>
-          <w:rFonts w:ascii="Georgia" w:hAnsi="Georgia" w:cs="Georgia"/>
-          <w:b/>
-          <w:i w:val="0"/>
-          <w:color w:val="222222"/>
-          <w:sz w:val="18"/>
-        </w:rPr>
-        <w:t>Aerial Slash.</w:t>
-      </w:r>
-      <w:r>
-        <w:rPr>
-          <w:rFonts w:ascii="Georgia" w:hAnsi="Georgia" w:cs="Georgia"/>
-          <w:b w:val="0"/>
-          <w:i w:val="0"/>
-          <w:color w:val="222222"/>
-          <w:sz w:val="18"/>
-        </w:rPr>
-        <w:t xml:space="preserve"> +5, range 20/60 ft., 3d6 + 3 slashing.</w:t>
-      </w:r>
-    </w:p>
-    <w:p>
-      <w:pPr>
-        <w:pBdr>
-          <w:left w:val="single" w:sz="18" w:space="12" w:color="8B2020"/>
-        </w:pBdr>
-        <w:shd w:val="clear" w:color="auto" w:fill="FCF6F6"/>
-        <w:spacing w:before="30" w:after="70"/>
-        <w:ind w:left="340" w:right="340"/>
-      </w:pPr>
-      <w:r>
-        <w:rPr>
-          <w:rFonts w:ascii="Georgia" w:hAnsi="Georgia" w:cs="Georgia"/>
-          <w:b/>
-          <w:i w:val="0"/>
-          <w:color w:val="222222"/>
-          <w:sz w:val="18"/>
-        </w:rPr>
-        <w:t>Quack of Fury (Recharge 5-6).</w:t>
-      </w:r>
-      <w:r>
-        <w:rPr>
-          <w:rFonts w:ascii="Georgia" w:hAnsi="Georgia" w:cs="Georgia"/>
-          <w:b w:val="0"/>
-          <w:i w:val="0"/>
-          <w:color w:val="222222"/>
-          <w:sz w:val="18"/>
-        </w:rPr>
-        <w:t xml:space="preserve"> 15 ft., DC 14 Wisdom save or frightened 1 minute (repeat the save at the end of each turn).</w:t>
-      </w:r>
-    </w:p>
-    <w:p>
-      <w:pPr>
-        <w:pBdr>
-          <w:left w:val="single" w:sz="18" w:space="12" w:color="8B2020"/>
-        </w:pBdr>
-        <w:shd w:val="clear" w:color="auto" w:fill="FCF6F6"/>
-        <w:spacing w:before="30" w:after="70"/>
-        <w:ind w:left="340" w:right="340"/>
-      </w:pPr>
-      <w:r>
-        <w:rPr>
-          <w:rFonts w:ascii="Georgia" w:hAnsi="Georgia" w:cs="Georgia"/>
-          <w:b/>
-          <w:i w:val="0"/>
-          <w:color w:val="222222"/>
-          <w:sz w:val="18"/>
-        </w:rPr>
-        <w:t>Winged Leap.</w:t>
-      </w:r>
-      <w:r>
-        <w:rPr>
-          <w:rFonts w:ascii="Georgia" w:hAnsi="Georgia" w:cs="Georgia"/>
-          <w:b w:val="0"/>
-          <w:i w:val="0"/>
-          <w:color w:val="222222"/>
-          <w:sz w:val="18"/>
-        </w:rPr>
-        <w:t xml:space="preserve"> Leaps 30 ft. without provoking; lost if a circle stone is disrupted.</w:t>
+        <w:t>All four encounters of Session 1, in the order the party meets them, plus one friend made along the way.</w:t>
       </w:r>
     </w:p>
     <w:p>
       <w:pPr>
         <w:keepNext/>
-        <w:pBdr>
-          <w:left w:val="single" w:sz="18" w:space="12" w:color="8B2020"/>
-        </w:pBdr>
-        <w:shd w:val="clear" w:color="auto" w:fill="FCF6F6"/>
-        <w:spacing w:before="30" w:after="70"/>
-        <w:ind w:left="340" w:right="340"/>
+        <w:spacing w:before="320" w:after="20"/>
+        <w:jc w:val="center"/>
       </w:pPr>
       <w:r>
         <w:rPr>
           <w:rFonts w:ascii="Georgia" w:hAnsi="Georgia" w:cs="Georgia"/>
           <w:b/>
           <w:color w:val="8B2020"/>
-          <w:sz w:val="22"/>
+          <w:sz w:val="26"/>
         </w:rPr>
-        <w:t>Cognifin</w:t>
-      </w:r>
-    </w:p>
-    <w:p>
-      <w:pPr>
-        <w:pBdr>
-          <w:left w:val="single" w:sz="18" w:space="12" w:color="8B2020"/>
-        </w:pBdr>
-        <w:shd w:val="clear" w:color="auto" w:fill="FCF6F6"/>
-        <w:spacing w:before="30" w:after="70"/>
-        <w:ind w:left="340" w:right="340"/>
-      </w:pPr>
-      <w:r>
-        <w:rPr>
-          <w:rFonts w:ascii="Georgia" w:hAnsi="Georgia" w:cs="Georgia"/>
-          <w:b w:val="0"/>
-          <w:i w:val="0"/>
-          <w:color w:val="222222"/>
-          <w:sz w:val="18"/>
-        </w:rPr>
-        <w:t xml:space="preserve">Small beast (Elemental Water), neutral guardian. </w:t>
-      </w:r>
-      <w:r>
-        <w:rPr>
-          <w:rFonts w:ascii="Georgia" w:hAnsi="Georgia" w:cs="Georgia"/>
-          <w:b/>
-          <w:i w:val="0"/>
-          <w:color w:val="222222"/>
-          <w:sz w:val="18"/>
-        </w:rPr>
-        <w:t>CR 3</w:t>
-      </w:r>
-      <w:r>
-        <w:rPr>
-          <w:rFonts w:ascii="Georgia" w:hAnsi="Georgia" w:cs="Georgia"/>
-          <w:b w:val="0"/>
-          <w:i w:val="0"/>
-          <w:color w:val="222222"/>
-          <w:sz w:val="18"/>
-        </w:rPr>
-        <w:t xml:space="preserve"> (700 XP). AC 14, HP 45 (6d8 + 18), fly 30 ft. (hover).</w:t>
-      </w:r>
-    </w:p>
-    <w:p>
-      <w:pPr>
-        <w:pBdr>
-          <w:left w:val="single" w:sz="18" w:space="12" w:color="8B2020"/>
-        </w:pBdr>
-        <w:shd w:val="clear" w:color="auto" w:fill="FCF6F6"/>
-        <w:spacing w:before="30" w:after="70"/>
-        <w:ind w:left="340" w:right="340"/>
-      </w:pPr>
-      <w:r>
-        <w:rPr>
-          <w:rFonts w:ascii="Georgia" w:hAnsi="Georgia" w:cs="Georgia"/>
-          <w:b w:val="0"/>
-          <w:i w:val="0"/>
-          <w:color w:val="222222"/>
-          <w:sz w:val="18"/>
-        </w:rPr>
-        <w:t>STR 10, DEX 14, CON 16, INT 10, WIS 14, CHA 12. Saves Dex +4, Wis +4; Perception +4, Arcana +2.</w:t>
-      </w:r>
-    </w:p>
-    <w:p>
-      <w:pPr>
-        <w:pBdr>
-          <w:left w:val="single" w:sz="18" w:space="12" w:color="8B2020"/>
-        </w:pBdr>
-        <w:shd w:val="clear" w:color="auto" w:fill="FCF6F6"/>
-        <w:spacing w:before="30" w:after="70"/>
-        <w:ind w:left="340" w:right="340"/>
-      </w:pPr>
-      <w:r>
-        <w:rPr>
-          <w:rFonts w:ascii="Georgia" w:hAnsi="Georgia" w:cs="Georgia"/>
-          <w:b w:val="0"/>
-          <w:i w:val="0"/>
-          <w:color w:val="222222"/>
-          <w:sz w:val="18"/>
-        </w:rPr>
-        <w:t>Resistances cold, psychic. Darkvision 60 ft. Telepathy 60 ft. (images and feelings).</w:t>
-      </w:r>
-    </w:p>
-    <w:p>
-      <w:pPr>
-        <w:pBdr>
-          <w:left w:val="single" w:sz="18" w:space="12" w:color="8B2020"/>
-        </w:pBdr>
-        <w:shd w:val="clear" w:color="auto" w:fill="FCF6F6"/>
-        <w:spacing w:before="30" w:after="70"/>
-        <w:ind w:left="340" w:right="340"/>
-      </w:pPr>
-      <w:r>
-        <w:rPr>
-          <w:rFonts w:ascii="Georgia" w:hAnsi="Georgia" w:cs="Georgia"/>
-          <w:b/>
-          <w:i w:val="0"/>
-          <w:color w:val="222222"/>
-          <w:sz w:val="18"/>
-        </w:rPr>
-        <w:t>Headache Blast.</w:t>
-      </w:r>
-      <w:r>
-        <w:rPr>
-          <w:rFonts w:ascii="Georgia" w:hAnsi="Georgia" w:cs="Georgia"/>
-          <w:b w:val="0"/>
-          <w:i w:val="0"/>
-          <w:color w:val="222222"/>
-          <w:sz w:val="18"/>
-        </w:rPr>
-        <w:t xml:space="preserve"> +4, range 30 ft., 2d6 + 2 psychic.</w:t>
-      </w:r>
-    </w:p>
-    <w:p>
-      <w:pPr>
-        <w:pBdr>
-          <w:left w:val="single" w:sz="18" w:space="12" w:color="8B2020"/>
-        </w:pBdr>
-        <w:shd w:val="clear" w:color="auto" w:fill="FCF6F6"/>
-        <w:spacing w:before="30" w:after="70"/>
-        <w:ind w:left="340" w:right="340"/>
-      </w:pPr>
-      <w:r>
-        <w:rPr>
-          <w:rFonts w:ascii="Georgia" w:hAnsi="Georgia" w:cs="Georgia"/>
-          <w:b/>
-          <w:i w:val="0"/>
-          <w:color w:val="222222"/>
-          <w:sz w:val="18"/>
-        </w:rPr>
-        <w:t>Water Pulse.</w:t>
-      </w:r>
-      <w:r>
-        <w:rPr>
-          <w:rFonts w:ascii="Georgia" w:hAnsi="Georgia" w:cs="Georgia"/>
-          <w:b w:val="0"/>
-          <w:i w:val="0"/>
-          <w:color w:val="222222"/>
-          <w:sz w:val="18"/>
-        </w:rPr>
-        <w:t xml:space="preserve"> +4, range 30 ft., 2d6 + 2 bludgeoning; DC 12 Strength save or prone.</w:t>
-      </w:r>
-    </w:p>
-    <w:p>
-      <w:pPr>
-        <w:pBdr>
-          <w:left w:val="single" w:sz="18" w:space="12" w:color="8B2020"/>
-        </w:pBdr>
-        <w:shd w:val="clear" w:color="auto" w:fill="FCF6F6"/>
-        <w:spacing w:before="30" w:after="70"/>
-        <w:ind w:left="340" w:right="340"/>
-      </w:pPr>
-      <w:r>
-        <w:rPr>
-          <w:rFonts w:ascii="Georgia" w:hAnsi="Georgia" w:cs="Georgia"/>
-          <w:b/>
-          <w:i w:val="0"/>
-          <w:color w:val="222222"/>
-          <w:sz w:val="18"/>
-        </w:rPr>
-        <w:t>Confusion Pulse (Recharge 5-6).</w:t>
-      </w:r>
-      <w:r>
-        <w:rPr>
-          <w:rFonts w:ascii="Georgia" w:hAnsi="Georgia" w:cs="Georgia"/>
-          <w:b w:val="0"/>
-          <w:i w:val="0"/>
-          <w:color w:val="222222"/>
-          <w:sz w:val="18"/>
-        </w:rPr>
-        <w:t xml:space="preserve"> 15 ft. radius, DC 13 Wisdom save or confused (as the confusion spell) 1 minute; repeat the save at the end of each turn.</w:t>
-      </w:r>
-    </w:p>
-    <w:p>
-      <w:pPr>
-        <w:pBdr>
-          <w:left w:val="single" w:sz="18" w:space="12" w:color="8B2020"/>
-        </w:pBdr>
-        <w:shd w:val="clear" w:color="auto" w:fill="FCF6F6"/>
-        <w:spacing w:before="30" w:after="70"/>
-        <w:ind w:left="340" w:right="340"/>
-      </w:pPr>
-      <w:r>
-        <w:rPr>
-          <w:rFonts w:ascii="Georgia" w:hAnsi="Georgia" w:cs="Georgia"/>
-          <w:b/>
-          <w:i w:val="0"/>
-          <w:color w:val="222222"/>
-          <w:sz w:val="18"/>
-        </w:rPr>
-        <w:t>Psychic Shield.</w:t>
-      </w:r>
-      <w:r>
-        <w:rPr>
-          <w:rFonts w:ascii="Georgia" w:hAnsi="Georgia" w:cs="Georgia"/>
-          <w:b w:val="0"/>
-          <w:i w:val="0"/>
-          <w:color w:val="222222"/>
-          <w:sz w:val="18"/>
-        </w:rPr>
-        <w:t xml:space="preserve"> Reaction: +2 AC until its next turn.</w:t>
-      </w:r>
-    </w:p>
-    <w:p>
-      <w:pPr>
-        <w:pBdr>
-          <w:left w:val="single" w:sz="18" w:space="12" w:color="8B2020"/>
-        </w:pBdr>
-        <w:shd w:val="clear" w:color="auto" w:fill="FCF6F6"/>
-        <w:spacing w:before="30" w:after="70"/>
-        <w:ind w:left="340" w:right="340"/>
-      </w:pPr>
-      <w:r>
-        <w:rPr>
-          <w:rFonts w:ascii="Georgia" w:hAnsi="Georgia" w:cs="Georgia"/>
-          <w:b/>
-          <w:i w:val="0"/>
-          <w:color w:val="222222"/>
-          <w:sz w:val="18"/>
-        </w:rPr>
-        <w:t>Waters of the Grove (Legendary).</w:t>
-      </w:r>
-      <w:r>
-        <w:rPr>
-          <w:rFonts w:ascii="Georgia" w:hAnsi="Georgia" w:cs="Georgia"/>
-          <w:b w:val="0"/>
-          <w:i w:val="0"/>
-          <w:color w:val="222222"/>
-          <w:sz w:val="18"/>
-        </w:rPr>
-        <w:t xml:space="preserve"> Whirlpool (restrain, DC 12 Str) or tidal wave (2d4, push 5 ft.).</w:t>
+        <w:t>ENEMIES, Fight 1: The Bar Brawl</w:t>
       </w:r>
     </w:p>
     <w:p>
       <w:pPr>
         <w:keepNext/>
-        <w:pBdr>
-          <w:left w:val="single" w:sz="18" w:space="12" w:color="8B2020"/>
-        </w:pBdr>
-        <w:shd w:val="clear" w:color="auto" w:fill="FCF6F6"/>
-        <w:spacing w:before="30" w:after="70"/>
-        <w:ind w:left="340" w:right="340"/>
+        <w:spacing w:after="120"/>
+        <w:jc w:val="center"/>
+      </w:pPr>
+      <w:r>
+        <w:rPr>
+          <w:rFonts w:ascii="Georgia" w:hAnsi="Georgia" w:cs="Georgia"/>
+          <w:color w:val="888888"/>
+          <w:sz w:val="18"/>
+        </w:rPr>
+        <w:t>The Gilded Acorn ✦ Difficulty: Easy ✦ 1x Bren + 2x Regulars</w:t>
+      </w:r>
+    </w:p>
+    <w:tbl>
+      <w:tblPr>
+        <w:tblW w:type="auto" w:w="0"/>
+        <w:jc w:val="center"/>
+        <w:tblLayout w:type="fixed"/>
+        <w:tblLook w:firstColumn="1" w:firstRow="1" w:lastColumn="0" w:lastRow="0" w:noHBand="0" w:noVBand="1" w:val="04A0"/>
+        <w:tblCellMar>
+          <w:left w:w="110" w:type="dxa"/>
+          <w:right w:w="110" w:type="dxa"/>
+          <w:top w:w="60" w:type="dxa"/>
+          <w:bottom w:w="80" w:type="dxa"/>
+        </w:tblCellMar>
+        <w:tblBorders>
+          <w:top w:val="single" w:sz="8" w:space="0" w:color="8B2020"/>
+          <w:left w:val="single" w:sz="8" w:space="0" w:color="8B2020"/>
+          <w:bottom w:val="single" w:sz="8" w:space="0" w:color="8B2020"/>
+          <w:right w:val="single" w:sz="8" w:space="0" w:color="8B2020"/>
+          <w:insideH w:val="single" w:sz="8" w:space="0" w:color="8B2020"/>
+          <w:insideV w:val="single" w:sz="8" w:space="0" w:color="8B2020"/>
+        </w:tblBorders>
+      </w:tblPr>
+      <w:tblGrid>
+        <w:gridCol w:w="9360"/>
+      </w:tblGrid>
+      <w:tr>
+        <w:trPr>
+          <w:cantSplit/>
+        </w:trPr>
+        <w:tc>
+          <w:tcPr>
+            <w:tcW w:type="dxa" w:w="9072"/>
+          </w:tcPr>
+          <w:p>
+            <w:pPr>
+              <w:shd w:val="clear" w:color="auto" w:fill="8B2020"/>
+              <w:spacing w:before="0" w:after="20"/>
+            </w:pPr>
+            <w:r>
+              <w:rPr>
+                <w:rFonts w:ascii="Georgia" w:hAnsi="Georgia" w:cs="Georgia"/>
+                <w:b/>
+                <w:color w:val="FFFFFF"/>
+                <w:sz w:val="22"/>
+              </w:rPr>
+              <w:t>BREN, THE ROWDY LOCAL</w:t>
+            </w:r>
+          </w:p>
+          <w:p>
+            <w:pPr>
+              <w:spacing w:after="40"/>
+            </w:pPr>
+            <w:r>
+              <w:rPr>
+                <w:rFonts w:ascii="Georgia" w:hAnsi="Georgia" w:cs="Georgia"/>
+                <w:i/>
+                <w:color w:val="8B2020"/>
+                <w:sz w:val="16"/>
+              </w:rPr>
+              <w:t>Medium humanoid ✦ bandit stats, softened for a friendly brawl</w:t>
+            </w:r>
+          </w:p>
+          <w:p>
+            <w:pPr>
+              <w:spacing w:after="20"/>
+            </w:pPr>
+            <w:r>
+              <w:rPr>
+                <w:rFonts w:ascii="Georgia" w:hAnsi="Georgia" w:cs="Georgia"/>
+                <w:b/>
+                <w:i w:val="0"/>
+                <w:color w:val="222222"/>
+                <w:sz w:val="15"/>
+              </w:rPr>
+              <w:t>AC</w:t>
+            </w:r>
+            <w:r>
+              <w:rPr>
+                <w:rFonts w:ascii="Georgia" w:hAnsi="Georgia" w:cs="Georgia"/>
+                <w:b w:val="0"/>
+                <w:i w:val="0"/>
+                <w:color w:val="222222"/>
+                <w:sz w:val="15"/>
+              </w:rPr>
+              <w:t xml:space="preserve"> 12  </w:t>
+            </w:r>
+            <w:r>
+              <w:rPr>
+                <w:rFonts w:ascii="Georgia" w:hAnsi="Georgia" w:cs="Georgia"/>
+                <w:b/>
+                <w:i w:val="0"/>
+                <w:color w:val="222222"/>
+                <w:sz w:val="15"/>
+              </w:rPr>
+              <w:t>HP</w:t>
+            </w:r>
+            <w:r>
+              <w:rPr>
+                <w:rFonts w:ascii="Georgia" w:hAnsi="Georgia" w:cs="Georgia"/>
+                <w:b w:val="0"/>
+                <w:i w:val="0"/>
+                <w:color w:val="222222"/>
+                <w:sz w:val="15"/>
+              </w:rPr>
+              <w:t xml:space="preserve"> 8  </w:t>
+            </w:r>
+            <w:r>
+              <w:rPr>
+                <w:rFonts w:ascii="Georgia" w:hAnsi="Georgia" w:cs="Georgia"/>
+                <w:b/>
+                <w:i w:val="0"/>
+                <w:color w:val="222222"/>
+                <w:sz w:val="15"/>
+              </w:rPr>
+              <w:t>Speed</w:t>
+            </w:r>
+            <w:r>
+              <w:rPr>
+                <w:rFonts w:ascii="Georgia" w:hAnsi="Georgia" w:cs="Georgia"/>
+                <w:b w:val="0"/>
+                <w:i w:val="0"/>
+                <w:color w:val="222222"/>
+                <w:sz w:val="15"/>
+              </w:rPr>
+              <w:t xml:space="preserve"> 30 ft</w:t>
+            </w:r>
+          </w:p>
+          <w:p>
+            <w:pPr>
+              <w:keepNext/>
+              <w:spacing w:before="60" w:after="20"/>
+            </w:pPr>
+            <w:r>
+              <w:rPr>
+                <w:rFonts w:ascii="Georgia" w:hAnsi="Georgia" w:cs="Georgia"/>
+                <w:b/>
+                <w:color w:val="8B2020"/>
+                <w:sz w:val="16"/>
+              </w:rPr>
+              <w:t>Traits</w:t>
+            </w:r>
+          </w:p>
+          <w:p>
+            <w:pPr>
+              <w:spacing w:after="20"/>
+            </w:pPr>
+            <w:r>
+              <w:rPr>
+                <w:rFonts w:ascii="Georgia" w:hAnsi="Georgia" w:cs="Georgia"/>
+                <w:b/>
+                <w:i/>
+                <w:color w:val="222222"/>
+                <w:sz w:val="15"/>
+              </w:rPr>
+              <w:t xml:space="preserve">Non Lethal Brawler. </w:t>
+            </w:r>
+            <w:r>
+              <w:rPr>
+                <w:rFonts w:ascii="Georgia" w:hAnsi="Georgia" w:cs="Georgia"/>
+                <w:b w:val="0"/>
+                <w:i w:val="0"/>
+                <w:color w:val="222222"/>
+                <w:sz w:val="15"/>
+              </w:rPr>
+              <w:t>All of Bren's damage is non lethal. A hero reduced to 0 HP wakes a minute later with a bruised ear and a mug of cider on the house.</w:t>
+            </w:r>
+          </w:p>
+          <w:p>
+            <w:pPr>
+              <w:keepNext/>
+              <w:spacing w:before="60" w:after="20"/>
+            </w:pPr>
+            <w:r>
+              <w:rPr>
+                <w:rFonts w:ascii="Georgia" w:hAnsi="Georgia" w:cs="Georgia"/>
+                <w:b/>
+                <w:color w:val="8B2020"/>
+                <w:sz w:val="16"/>
+              </w:rPr>
+              <w:t>Actions</w:t>
+            </w:r>
+          </w:p>
+          <w:p>
+            <w:pPr>
+              <w:spacing w:after="20"/>
+            </w:pPr>
+            <w:r>
+              <w:rPr>
+                <w:rFonts w:ascii="Georgia" w:hAnsi="Georgia" w:cs="Georgia"/>
+                <w:b/>
+                <w:i/>
+                <w:color w:val="222222"/>
+                <w:sz w:val="15"/>
+              </w:rPr>
+              <w:t xml:space="preserve">Unarmed Strike. </w:t>
+            </w:r>
+            <w:r>
+              <w:rPr>
+                <w:rFonts w:ascii="Georgia" w:hAnsi="Georgia" w:cs="Georgia"/>
+                <w:b w:val="0"/>
+                <w:i/>
+                <w:color w:val="222222"/>
+                <w:sz w:val="15"/>
+              </w:rPr>
+              <w:t>Melee Attack:</w:t>
+            </w:r>
+            <w:r>
+              <w:rPr>
+                <w:rFonts w:ascii="Georgia" w:hAnsi="Georgia" w:cs="Georgia"/>
+                <w:b w:val="0"/>
+                <w:i w:val="0"/>
+                <w:color w:val="222222"/>
+                <w:sz w:val="15"/>
+              </w:rPr>
+              <w:t xml:space="preserve"> +3 to hit, reach 5 ft. </w:t>
+            </w:r>
+            <w:r>
+              <w:rPr>
+                <w:rFonts w:ascii="Georgia" w:hAnsi="Georgia" w:cs="Georgia"/>
+                <w:b w:val="0"/>
+                <w:i/>
+                <w:color w:val="222222"/>
+                <w:sz w:val="15"/>
+              </w:rPr>
+              <w:t>Hit:</w:t>
+            </w:r>
+            <w:r>
+              <w:rPr>
+                <w:rFonts w:ascii="Georgia" w:hAnsi="Georgia" w:cs="Georgia"/>
+                <w:b w:val="0"/>
+                <w:i w:val="0"/>
+                <w:color w:val="222222"/>
+                <w:sz w:val="15"/>
+              </w:rPr>
+              <w:t xml:space="preserve"> 1d4 + 1 bludgeoning damage (a fist, a chair, or one regrettable mug).</w:t>
+            </w:r>
+          </w:p>
+        </w:tc>
+      </w:tr>
+    </w:tbl>
+    <w:p>
+      <w:pPr>
+        <w:spacing w:after="40"/>
+      </w:pPr>
+    </w:p>
+    <w:tbl>
+      <w:tblPr>
+        <w:tblW w:type="auto" w:w="0"/>
+        <w:jc w:val="center"/>
+        <w:tblLayout w:type="fixed"/>
+        <w:tblLook w:firstColumn="1" w:firstRow="1" w:lastColumn="0" w:lastRow="0" w:noHBand="0" w:noVBand="1" w:val="04A0"/>
+        <w:tblCellMar>
+          <w:left w:w="110" w:type="dxa"/>
+          <w:right w:w="110" w:type="dxa"/>
+          <w:top w:w="60" w:type="dxa"/>
+          <w:bottom w:w="80" w:type="dxa"/>
+        </w:tblCellMar>
+        <w:tblBorders>
+          <w:top w:val="single" w:sz="8" w:space="0" w:color="8B2020"/>
+          <w:left w:val="single" w:sz="8" w:space="0" w:color="8B2020"/>
+          <w:bottom w:val="single" w:sz="8" w:space="0" w:color="8B2020"/>
+          <w:right w:val="single" w:sz="8" w:space="0" w:color="8B2020"/>
+          <w:insideH w:val="single" w:sz="8" w:space="0" w:color="8B2020"/>
+          <w:insideV w:val="single" w:sz="8" w:space="0" w:color="8B2020"/>
+        </w:tblBorders>
+      </w:tblPr>
+      <w:tblGrid>
+        <w:gridCol w:w="9360"/>
+      </w:tblGrid>
+      <w:tr>
+        <w:trPr>
+          <w:cantSplit/>
+        </w:trPr>
+        <w:tc>
+          <w:tcPr>
+            <w:tcW w:type="dxa" w:w="9072"/>
+          </w:tcPr>
+          <w:p>
+            <w:pPr>
+              <w:shd w:val="clear" w:color="auto" w:fill="8B2020"/>
+              <w:spacing w:before="0" w:after="20"/>
+            </w:pPr>
+            <w:r>
+              <w:rPr>
+                <w:rFonts w:ascii="Georgia" w:hAnsi="Georgia" w:cs="Georgia"/>
+                <w:b/>
+                <w:color w:val="FFFFFF"/>
+                <w:sz w:val="22"/>
+              </w:rPr>
+              <w:t>TAVERN REGULAR</w:t>
+            </w:r>
+          </w:p>
+          <w:p>
+            <w:pPr>
+              <w:spacing w:after="40"/>
+            </w:pPr>
+            <w:r>
+              <w:rPr>
+                <w:rFonts w:ascii="Georgia" w:hAnsi="Georgia" w:cs="Georgia"/>
+                <w:i/>
+                <w:color w:val="8B2020"/>
+                <w:sz w:val="16"/>
+              </w:rPr>
+              <w:t>Medium humanoid ✦ bandit stats, softened ✦ 2 in the brawl</w:t>
+            </w:r>
+          </w:p>
+          <w:p>
+            <w:pPr>
+              <w:spacing w:after="20"/>
+            </w:pPr>
+            <w:r>
+              <w:rPr>
+                <w:rFonts w:ascii="Georgia" w:hAnsi="Georgia" w:cs="Georgia"/>
+                <w:b/>
+                <w:i w:val="0"/>
+                <w:color w:val="222222"/>
+                <w:sz w:val="15"/>
+              </w:rPr>
+              <w:t>AC</w:t>
+            </w:r>
+            <w:r>
+              <w:rPr>
+                <w:rFonts w:ascii="Georgia" w:hAnsi="Georgia" w:cs="Georgia"/>
+                <w:b w:val="0"/>
+                <w:i w:val="0"/>
+                <w:color w:val="222222"/>
+                <w:sz w:val="15"/>
+              </w:rPr>
+              <w:t xml:space="preserve"> 11  </w:t>
+            </w:r>
+            <w:r>
+              <w:rPr>
+                <w:rFonts w:ascii="Georgia" w:hAnsi="Georgia" w:cs="Georgia"/>
+                <w:b/>
+                <w:i w:val="0"/>
+                <w:color w:val="222222"/>
+                <w:sz w:val="15"/>
+              </w:rPr>
+              <w:t>HP</w:t>
+            </w:r>
+            <w:r>
+              <w:rPr>
+                <w:rFonts w:ascii="Georgia" w:hAnsi="Georgia" w:cs="Georgia"/>
+                <w:b w:val="0"/>
+                <w:i w:val="0"/>
+                <w:color w:val="222222"/>
+                <w:sz w:val="15"/>
+              </w:rPr>
+              <w:t xml:space="preserve"> 6  </w:t>
+            </w:r>
+            <w:r>
+              <w:rPr>
+                <w:rFonts w:ascii="Georgia" w:hAnsi="Georgia" w:cs="Georgia"/>
+                <w:b/>
+                <w:i w:val="0"/>
+                <w:color w:val="222222"/>
+                <w:sz w:val="15"/>
+              </w:rPr>
+              <w:t>Speed</w:t>
+            </w:r>
+            <w:r>
+              <w:rPr>
+                <w:rFonts w:ascii="Georgia" w:hAnsi="Georgia" w:cs="Georgia"/>
+                <w:b w:val="0"/>
+                <w:i w:val="0"/>
+                <w:color w:val="222222"/>
+                <w:sz w:val="15"/>
+              </w:rPr>
+              <w:t xml:space="preserve"> 30 ft</w:t>
+            </w:r>
+          </w:p>
+          <w:p>
+            <w:pPr>
+              <w:keepNext/>
+              <w:spacing w:before="60" w:after="20"/>
+            </w:pPr>
+            <w:r>
+              <w:rPr>
+                <w:rFonts w:ascii="Georgia" w:hAnsi="Georgia" w:cs="Georgia"/>
+                <w:b/>
+                <w:color w:val="8B2020"/>
+                <w:sz w:val="16"/>
+              </w:rPr>
+              <w:t>Traits</w:t>
+            </w:r>
+          </w:p>
+          <w:p>
+            <w:pPr>
+              <w:spacing w:after="20"/>
+            </w:pPr>
+            <w:r>
+              <w:rPr>
+                <w:rFonts w:ascii="Georgia" w:hAnsi="Georgia" w:cs="Georgia"/>
+                <w:b/>
+                <w:i/>
+                <w:color w:val="222222"/>
+                <w:sz w:val="15"/>
+              </w:rPr>
+              <w:t xml:space="preserve">Non Lethal Brawler. </w:t>
+            </w:r>
+            <w:r>
+              <w:rPr>
+                <w:rFonts w:ascii="Georgia" w:hAnsi="Georgia" w:cs="Georgia"/>
+                <w:b w:val="0"/>
+                <w:i w:val="0"/>
+                <w:color w:val="222222"/>
+                <w:sz w:val="15"/>
+              </w:rPr>
+              <w:t>All damage in the brawl is non lethal; a downed hero wakes a minute later, embarrassed but unhurt.</w:t>
+            </w:r>
+          </w:p>
+          <w:p>
+            <w:pPr>
+              <w:keepNext/>
+              <w:spacing w:before="60" w:after="20"/>
+            </w:pPr>
+            <w:r>
+              <w:rPr>
+                <w:rFonts w:ascii="Georgia" w:hAnsi="Georgia" w:cs="Georgia"/>
+                <w:b/>
+                <w:color w:val="8B2020"/>
+                <w:sz w:val="16"/>
+              </w:rPr>
+              <w:t>Actions</w:t>
+            </w:r>
+          </w:p>
+          <w:p>
+            <w:pPr>
+              <w:spacing w:after="20"/>
+            </w:pPr>
+            <w:r>
+              <w:rPr>
+                <w:rFonts w:ascii="Georgia" w:hAnsi="Georgia" w:cs="Georgia"/>
+                <w:b/>
+                <w:i/>
+                <w:color w:val="222222"/>
+                <w:sz w:val="15"/>
+              </w:rPr>
+              <w:t xml:space="preserve">Unarmed Strike. </w:t>
+            </w:r>
+            <w:r>
+              <w:rPr>
+                <w:rFonts w:ascii="Georgia" w:hAnsi="Georgia" w:cs="Georgia"/>
+                <w:b w:val="0"/>
+                <w:i/>
+                <w:color w:val="222222"/>
+                <w:sz w:val="15"/>
+              </w:rPr>
+              <w:t>Melee Attack:</w:t>
+            </w:r>
+            <w:r>
+              <w:rPr>
+                <w:rFonts w:ascii="Georgia" w:hAnsi="Georgia" w:cs="Georgia"/>
+                <w:b w:val="0"/>
+                <w:i w:val="0"/>
+                <w:color w:val="222222"/>
+                <w:sz w:val="15"/>
+              </w:rPr>
+              <w:t xml:space="preserve"> +3 to hit, reach 5 ft. </w:t>
+            </w:r>
+            <w:r>
+              <w:rPr>
+                <w:rFonts w:ascii="Georgia" w:hAnsi="Georgia" w:cs="Georgia"/>
+                <w:b w:val="0"/>
+                <w:i/>
+                <w:color w:val="222222"/>
+                <w:sz w:val="15"/>
+              </w:rPr>
+              <w:t>Hit:</w:t>
+            </w:r>
+            <w:r>
+              <w:rPr>
+                <w:rFonts w:ascii="Georgia" w:hAnsi="Georgia" w:cs="Georgia"/>
+                <w:b w:val="0"/>
+                <w:i w:val="0"/>
+                <w:color w:val="222222"/>
+                <w:sz w:val="15"/>
+              </w:rPr>
+              <w:t xml:space="preserve"> 1d4 bludgeoning damage.</w:t>
+            </w:r>
+          </w:p>
+        </w:tc>
+      </w:tr>
+    </w:tbl>
+    <w:p>
+      <w:pPr>
+        <w:spacing w:after="40"/>
+      </w:pPr>
+    </w:p>
+    <w:p>
+      <w:pPr>
+        <w:spacing w:before="40" w:after="160"/>
       </w:pPr>
       <w:r>
         <w:rPr>
           <w:rFonts w:ascii="Georgia" w:hAnsi="Georgia" w:cs="Georgia"/>
           <w:b/>
           <w:color w:val="8B2020"/>
-          <w:sz w:val="22"/>
-        </w:rPr>
-        <w:t>Mist Stalker</w:t>
-      </w:r>
-    </w:p>
-    <w:p>
-      <w:pPr>
-        <w:pBdr>
-          <w:left w:val="single" w:sz="18" w:space="12" w:color="8B2020"/>
-        </w:pBdr>
-        <w:shd w:val="clear" w:color="auto" w:fill="FCF6F6"/>
-        <w:spacing w:before="30" w:after="70"/>
-        <w:ind w:left="340" w:right="340"/>
-      </w:pPr>
-      <w:r>
-        <w:rPr>
-          <w:rFonts w:ascii="Georgia" w:hAnsi="Georgia" w:cs="Georgia"/>
-          <w:b w:val="0"/>
-          <w:i w:val="0"/>
-          <w:color w:val="222222"/>
           <w:sz w:val="18"/>
         </w:rPr>
-        <w:t xml:space="preserve">Medium fey (Feywild), unaligned. </w:t>
-      </w:r>
-      <w:r>
-        <w:rPr>
-          <w:rFonts w:ascii="Georgia" w:hAnsi="Georgia" w:cs="Georgia"/>
-          <w:b/>
-          <w:i w:val="0"/>
-          <w:color w:val="222222"/>
-          <w:sz w:val="18"/>
-        </w:rPr>
-        <w:t>CR 2</w:t>
+        <w:t xml:space="preserve">Tactics: </w:t>
       </w:r>
       <w:r>
         <w:rPr>
           <w:rFonts w:ascii="Georgia" w:hAnsi="Georgia" w:cs="Georgia"/>
           <w:b w:val="0"/>
-          <w:i w:val="0"/>
+          <w:i/>
           <w:color w:val="222222"/>
           <w:sz w:val="18"/>
         </w:rPr>
-        <w:t xml:space="preserve"> (450 XP). AC 13, HP 39 (6d8 + 12), Speed 40 ft.</w:t>
+        <w:t>Bren and his friends are not skilled fighters; they rely on brute force, ganging up on one or two heroes at a time. Strictly non lethal: fists, chairs, and one regrettable mug. Waving Bren off only makes him louder, so let the fight come to the table, and have Osric step in if things get too hot. The point of the scene is three strangers fighting together for the first time, and winning.</w:t>
       </w:r>
     </w:p>
     <w:p>
       <w:pPr>
-        <w:pBdr>
-          <w:left w:val="single" w:sz="18" w:space="12" w:color="8B2020"/>
-        </w:pBdr>
-        <w:shd w:val="clear" w:color="auto" w:fill="FCF6F6"/>
-        <w:spacing w:before="30" w:after="70"/>
-        <w:ind w:left="340" w:right="340"/>
-      </w:pPr>
-      <w:r>
-        <w:rPr>
-          <w:rFonts w:ascii="Georgia" w:hAnsi="Georgia" w:cs="Georgia"/>
-          <w:b w:val="0"/>
-          <w:i w:val="0"/>
-          <w:color w:val="222222"/>
-          <w:sz w:val="18"/>
-        </w:rPr>
-        <w:t>STR 14, DEX 16, CON 14, INT 6, WIS 12, CHA 8. Skills Perception +3, Stealth +5. Darkvision 60 ft.</w:t>
-      </w:r>
-    </w:p>
-    <w:p>
-      <w:pPr>
-        <w:pBdr>
-          <w:left w:val="single" w:sz="18" w:space="12" w:color="8B2020"/>
-        </w:pBdr>
-        <w:shd w:val="clear" w:color="auto" w:fill="FCF6F6"/>
-        <w:spacing w:before="30" w:after="70"/>
-        <w:ind w:left="340" w:right="340"/>
+        <w:keepNext/>
+        <w:spacing w:before="320" w:after="20"/>
+        <w:jc w:val="center"/>
       </w:pPr>
       <w:r>
         <w:rPr>
           <w:rFonts w:ascii="Georgia" w:hAnsi="Georgia" w:cs="Georgia"/>
           <w:b/>
-          <w:i w:val="0"/>
-          <w:color w:val="222222"/>
+          <w:color w:val="8B2020"/>
+          <w:sz w:val="26"/>
+        </w:rPr>
+        <w:t>ALLIES: Lickgloom</w:t>
+      </w:r>
+    </w:p>
+    <w:p>
+      <w:pPr>
+        <w:keepNext/>
+        <w:spacing w:after="120"/>
+        <w:jc w:val="center"/>
+      </w:pPr>
+      <w:r>
+        <w:rPr>
+          <w:rFonts w:ascii="Georgia" w:hAnsi="Georgia" w:cs="Georgia"/>
+          <w:color w:val="888888"/>
           <w:sz w:val="18"/>
         </w:rPr>
-        <w:t>Multiattack.</w:t>
+        <w:t>The Whispering Pond ✦ Befriended with bread and patience ✦ Fey companion</w:t>
+      </w:r>
+    </w:p>
+    <w:tbl>
+      <w:tblPr>
+        <w:tblW w:type="auto" w:w="0"/>
+        <w:jc w:val="center"/>
+        <w:tblLayout w:type="fixed"/>
+        <w:tblLook w:firstColumn="1" w:firstRow="1" w:lastColumn="0" w:lastRow="0" w:noHBand="0" w:noVBand="1" w:val="04A0"/>
+        <w:tblCellMar>
+          <w:left w:w="110" w:type="dxa"/>
+          <w:right w:w="110" w:type="dxa"/>
+          <w:top w:w="60" w:type="dxa"/>
+          <w:bottom w:w="80" w:type="dxa"/>
+        </w:tblCellMar>
+        <w:tblBorders>
+          <w:top w:val="single" w:sz="8" w:space="0" w:color="8B2020"/>
+          <w:left w:val="single" w:sz="8" w:space="0" w:color="8B2020"/>
+          <w:bottom w:val="single" w:sz="8" w:space="0" w:color="8B2020"/>
+          <w:right w:val="single" w:sz="8" w:space="0" w:color="8B2020"/>
+          <w:insideH w:val="single" w:sz="8" w:space="0" w:color="8B2020"/>
+          <w:insideV w:val="single" w:sz="8" w:space="0" w:color="8B2020"/>
+        </w:tblBorders>
+      </w:tblPr>
+      <w:tblGrid>
+        <w:gridCol w:w="9360"/>
+      </w:tblGrid>
+      <w:tr>
+        <w:trPr>
+          <w:cantSplit/>
+        </w:trPr>
+        <w:tc>
+          <w:tcPr>
+            <w:tcW w:type="dxa" w:w="9072"/>
+          </w:tcPr>
+          <w:p>
+            <w:pPr>
+              <w:shd w:val="clear" w:color="auto" w:fill="1F7A78"/>
+              <w:spacing w:before="0" w:after="20"/>
+            </w:pPr>
+            <w:r>
+              <w:rPr>
+                <w:rFonts w:ascii="Georgia" w:hAnsi="Georgia" w:cs="Georgia"/>
+                <w:b/>
+                <w:color w:val="FFFFFF"/>
+                <w:sz w:val="22"/>
+              </w:rPr>
+              <w:t>LICKGLOOM</w:t>
+            </w:r>
+          </w:p>
+          <w:p>
+            <w:pPr>
+              <w:spacing w:after="40"/>
+            </w:pPr>
+            <w:r>
+              <w:rPr>
+                <w:rFonts w:ascii="Georgia" w:hAnsi="Georgia" w:cs="Georgia"/>
+                <w:i/>
+                <w:color w:val="8B2020"/>
+                <w:sz w:val="16"/>
+              </w:rPr>
+              <w:t>Small fey (Feywild), neutral ✦ CR 1 (200 XP)</w:t>
+            </w:r>
+          </w:p>
+          <w:p>
+            <w:pPr>
+              <w:spacing w:after="60"/>
+              <w:jc w:val="center"/>
+            </w:pPr>
+            <w:r>
+              <w:drawing>
+                <wp:inline xmlns:a="http://schemas.openxmlformats.org/drawingml/2006/main" xmlns:pic="http://schemas.openxmlformats.org/drawingml/2006/picture">
+                  <wp:extent cx="2743200" cy="2743200"/>
+                  <wp:docPr id="14" name="Picture 14"/>
+                  <wp:cNvGraphicFramePr>
+                    <a:graphicFrameLocks noChangeAspect="1"/>
+                  </wp:cNvGraphicFramePr>
+                  <a:graphic>
+                    <a:graphicData uri="http://schemas.openxmlformats.org/drawingml/2006/picture">
+                      <pic:pic>
+                        <pic:nvPicPr>
+                          <pic:cNvPr id="0" name="image.jpg"/>
+                          <pic:cNvPicPr/>
+                        </pic:nvPicPr>
+                        <pic:blipFill>
+                          <a:blip r:embed="rId23"/>
+                          <a:stretch>
+                            <a:fillRect/>
+                          </a:stretch>
+                        </pic:blipFill>
+                        <pic:spPr>
+                          <a:xfrm>
+                            <a:off x="0" y="0"/>
+                            <a:ext cx="2743200" cy="2743200"/>
+                          </a:xfrm>
+                          <a:prstGeom prst="rect"/>
+                        </pic:spPr>
+                      </pic:pic>
+                    </a:graphicData>
+                  </a:graphic>
+                </wp:inline>
+              </w:drawing>
+            </w:r>
+          </w:p>
+          <w:p>
+            <w:pPr>
+              <w:spacing w:after="20"/>
+            </w:pPr>
+            <w:r>
+              <w:rPr>
+                <w:rFonts w:ascii="Georgia" w:hAnsi="Georgia" w:cs="Georgia"/>
+                <w:b/>
+                <w:i w:val="0"/>
+                <w:color w:val="222222"/>
+                <w:sz w:val="15"/>
+              </w:rPr>
+              <w:t>AC</w:t>
+            </w:r>
+            <w:r>
+              <w:rPr>
+                <w:rFonts w:ascii="Georgia" w:hAnsi="Georgia" w:cs="Georgia"/>
+                <w:b w:val="0"/>
+                <w:i w:val="0"/>
+                <w:color w:val="222222"/>
+                <w:sz w:val="15"/>
+              </w:rPr>
+              <w:t xml:space="preserve"> 13 (natural armor)  </w:t>
+            </w:r>
+            <w:r>
+              <w:rPr>
+                <w:rFonts w:ascii="Georgia" w:hAnsi="Georgia" w:cs="Georgia"/>
+                <w:b/>
+                <w:i w:val="0"/>
+                <w:color w:val="222222"/>
+                <w:sz w:val="15"/>
+              </w:rPr>
+              <w:t>HP</w:t>
+            </w:r>
+            <w:r>
+              <w:rPr>
+                <w:rFonts w:ascii="Georgia" w:hAnsi="Georgia" w:cs="Georgia"/>
+                <w:b w:val="0"/>
+                <w:i w:val="0"/>
+                <w:color w:val="222222"/>
+                <w:sz w:val="15"/>
+              </w:rPr>
+              <w:t xml:space="preserve"> 27 (5d6 + 10)  </w:t>
+            </w:r>
+            <w:r>
+              <w:rPr>
+                <w:rFonts w:ascii="Georgia" w:hAnsi="Georgia" w:cs="Georgia"/>
+                <w:b/>
+                <w:i w:val="0"/>
+                <w:color w:val="222222"/>
+                <w:sz w:val="15"/>
+              </w:rPr>
+              <w:t>Speed</w:t>
+            </w:r>
+            <w:r>
+              <w:rPr>
+                <w:rFonts w:ascii="Georgia" w:hAnsi="Georgia" w:cs="Georgia"/>
+                <w:b w:val="0"/>
+                <w:i w:val="0"/>
+                <w:color w:val="222222"/>
+                <w:sz w:val="15"/>
+              </w:rPr>
+              <w:t xml:space="preserve"> 30 ft</w:t>
+            </w:r>
+          </w:p>
+          <w:p>
+            <w:pPr>
+              <w:spacing w:after="20"/>
+            </w:pPr>
+            <w:r>
+              <w:rPr>
+                <w:rFonts w:ascii="Georgia" w:hAnsi="Georgia" w:cs="Georgia"/>
+                <w:b/>
+                <w:i w:val="0"/>
+                <w:color w:val="222222"/>
+                <w:sz w:val="15"/>
+              </w:rPr>
+              <w:t>STR</w:t>
+            </w:r>
+            <w:r>
+              <w:rPr>
+                <w:rFonts w:ascii="Georgia" w:hAnsi="Georgia" w:cs="Georgia"/>
+                <w:b w:val="0"/>
+                <w:i w:val="0"/>
+                <w:color w:val="222222"/>
+                <w:sz w:val="15"/>
+              </w:rPr>
+              <w:t xml:space="preserve"> 14  </w:t>
+            </w:r>
+            <w:r>
+              <w:rPr>
+                <w:rFonts w:ascii="Georgia" w:hAnsi="Georgia" w:cs="Georgia"/>
+                <w:b/>
+                <w:i w:val="0"/>
+                <w:color w:val="222222"/>
+                <w:sz w:val="15"/>
+              </w:rPr>
+              <w:t>DEX</w:t>
+            </w:r>
+            <w:r>
+              <w:rPr>
+                <w:rFonts w:ascii="Georgia" w:hAnsi="Georgia" w:cs="Georgia"/>
+                <w:b w:val="0"/>
+                <w:i w:val="0"/>
+                <w:color w:val="222222"/>
+                <w:sz w:val="15"/>
+              </w:rPr>
+              <w:t xml:space="preserve"> 12  </w:t>
+            </w:r>
+            <w:r>
+              <w:rPr>
+                <w:rFonts w:ascii="Georgia" w:hAnsi="Georgia" w:cs="Georgia"/>
+                <w:b/>
+                <w:i w:val="0"/>
+                <w:color w:val="222222"/>
+                <w:sz w:val="15"/>
+              </w:rPr>
+              <w:t>CON</w:t>
+            </w:r>
+            <w:r>
+              <w:rPr>
+                <w:rFonts w:ascii="Georgia" w:hAnsi="Georgia" w:cs="Georgia"/>
+                <w:b w:val="0"/>
+                <w:i w:val="0"/>
+                <w:color w:val="222222"/>
+                <w:sz w:val="15"/>
+              </w:rPr>
+              <w:t xml:space="preserve"> 14  </w:t>
+            </w:r>
+            <w:r>
+              <w:rPr>
+                <w:rFonts w:ascii="Georgia" w:hAnsi="Georgia" w:cs="Georgia"/>
+                <w:b/>
+                <w:i w:val="0"/>
+                <w:color w:val="222222"/>
+                <w:sz w:val="15"/>
+              </w:rPr>
+              <w:t>INT</w:t>
+            </w:r>
+            <w:r>
+              <w:rPr>
+                <w:rFonts w:ascii="Georgia" w:hAnsi="Georgia" w:cs="Georgia"/>
+                <w:b w:val="0"/>
+                <w:i w:val="0"/>
+                <w:color w:val="222222"/>
+                <w:sz w:val="15"/>
+              </w:rPr>
+              <w:t xml:space="preserve"> 6  </w:t>
+            </w:r>
+            <w:r>
+              <w:rPr>
+                <w:rFonts w:ascii="Georgia" w:hAnsi="Georgia" w:cs="Georgia"/>
+                <w:b/>
+                <w:i w:val="0"/>
+                <w:color w:val="222222"/>
+                <w:sz w:val="15"/>
+              </w:rPr>
+              <w:t>WIS</w:t>
+            </w:r>
+            <w:r>
+              <w:rPr>
+                <w:rFonts w:ascii="Georgia" w:hAnsi="Georgia" w:cs="Georgia"/>
+                <w:b w:val="0"/>
+                <w:i w:val="0"/>
+                <w:color w:val="222222"/>
+                <w:sz w:val="15"/>
+              </w:rPr>
+              <w:t xml:space="preserve"> 10  </w:t>
+            </w:r>
+            <w:r>
+              <w:rPr>
+                <w:rFonts w:ascii="Georgia" w:hAnsi="Georgia" w:cs="Georgia"/>
+                <w:b/>
+                <w:i w:val="0"/>
+                <w:color w:val="222222"/>
+                <w:sz w:val="15"/>
+              </w:rPr>
+              <w:t>CHA</w:t>
+            </w:r>
+            <w:r>
+              <w:rPr>
+                <w:rFonts w:ascii="Georgia" w:hAnsi="Georgia" w:cs="Georgia"/>
+                <w:b w:val="0"/>
+                <w:i w:val="0"/>
+                <w:color w:val="222222"/>
+                <w:sz w:val="15"/>
+              </w:rPr>
+              <w:t xml:space="preserve"> 8</w:t>
+            </w:r>
+          </w:p>
+          <w:p>
+            <w:pPr>
+              <w:spacing w:after="20"/>
+            </w:pPr>
+            <w:r>
+              <w:rPr>
+                <w:rFonts w:ascii="Georgia" w:hAnsi="Georgia" w:cs="Georgia"/>
+                <w:b/>
+                <w:i w:val="0"/>
+                <w:color w:val="222222"/>
+                <w:sz w:val="15"/>
+              </w:rPr>
+              <w:t>Saves</w:t>
+            </w:r>
+            <w:r>
+              <w:rPr>
+                <w:rFonts w:ascii="Georgia" w:hAnsi="Georgia" w:cs="Georgia"/>
+                <w:b w:val="0"/>
+                <w:i w:val="0"/>
+                <w:color w:val="222222"/>
+                <w:sz w:val="15"/>
+              </w:rPr>
+              <w:t xml:space="preserve"> Dex +3  </w:t>
+            </w:r>
+            <w:r>
+              <w:rPr>
+                <w:rFonts w:ascii="Georgia" w:hAnsi="Georgia" w:cs="Georgia"/>
+                <w:b/>
+                <w:i w:val="0"/>
+                <w:color w:val="222222"/>
+                <w:sz w:val="15"/>
+              </w:rPr>
+              <w:t>Skills</w:t>
+            </w:r>
+            <w:r>
+              <w:rPr>
+                <w:rFonts w:ascii="Georgia" w:hAnsi="Georgia" w:cs="Georgia"/>
+                <w:b w:val="0"/>
+                <w:i w:val="0"/>
+                <w:color w:val="222222"/>
+                <w:sz w:val="15"/>
+              </w:rPr>
+              <w:t xml:space="preserve"> Perception +2, Stealth +4</w:t>
+            </w:r>
+          </w:p>
+          <w:p>
+            <w:pPr>
+              <w:spacing w:after="20"/>
+            </w:pPr>
+            <w:r>
+              <w:rPr>
+                <w:rFonts w:ascii="Georgia" w:hAnsi="Georgia" w:cs="Georgia"/>
+                <w:b/>
+                <w:i w:val="0"/>
+                <w:color w:val="222222"/>
+                <w:sz w:val="15"/>
+              </w:rPr>
+              <w:t>Resist</w:t>
+            </w:r>
+            <w:r>
+              <w:rPr>
+                <w:rFonts w:ascii="Georgia" w:hAnsi="Georgia" w:cs="Georgia"/>
+                <w:b w:val="0"/>
+                <w:i w:val="0"/>
+                <w:color w:val="222222"/>
+                <w:sz w:val="15"/>
+              </w:rPr>
+              <w:t xml:space="preserve"> acid, poison</w:t>
+            </w:r>
+          </w:p>
+          <w:p>
+            <w:pPr>
+              <w:spacing w:after="20"/>
+            </w:pPr>
+            <w:r>
+              <w:rPr>
+                <w:rFonts w:ascii="Georgia" w:hAnsi="Georgia" w:cs="Georgia"/>
+                <w:b/>
+                <w:i w:val="0"/>
+                <w:color w:val="222222"/>
+                <w:sz w:val="15"/>
+              </w:rPr>
+              <w:t>Senses</w:t>
+            </w:r>
+            <w:r>
+              <w:rPr>
+                <w:rFonts w:ascii="Georgia" w:hAnsi="Georgia" w:cs="Georgia"/>
+                <w:b w:val="0"/>
+                <w:i w:val="0"/>
+                <w:color w:val="222222"/>
+                <w:sz w:val="15"/>
+              </w:rPr>
+              <w:t xml:space="preserve"> darkvision 60 ft, passive Perception 12</w:t>
+            </w:r>
+          </w:p>
+          <w:p>
+            <w:pPr>
+              <w:spacing w:after="20"/>
+            </w:pPr>
+            <w:r>
+              <w:rPr>
+                <w:rFonts w:ascii="Georgia" w:hAnsi="Georgia" w:cs="Georgia"/>
+                <w:b/>
+                <w:i w:val="0"/>
+                <w:color w:val="222222"/>
+                <w:sz w:val="15"/>
+              </w:rPr>
+              <w:t>Languages</w:t>
+            </w:r>
+            <w:r>
+              <w:rPr>
+                <w:rFonts w:ascii="Georgia" w:hAnsi="Georgia" w:cs="Georgia"/>
+                <w:b w:val="0"/>
+                <w:i w:val="0"/>
+                <w:color w:val="222222"/>
+                <w:sz w:val="15"/>
+              </w:rPr>
+              <w:t xml:space="preserve"> understands Common but cannot speak; telepathic impressions</w:t>
+            </w:r>
+          </w:p>
+          <w:p>
+            <w:pPr>
+              <w:spacing w:after="20"/>
+            </w:pPr>
+            <w:r>
+              <w:rPr>
+                <w:rFonts w:ascii="Georgia" w:hAnsi="Georgia" w:cs="Georgia"/>
+                <w:b/>
+                <w:i w:val="0"/>
+                <w:color w:val="222222"/>
+                <w:sz w:val="15"/>
+              </w:rPr>
+              <w:t>Challenge</w:t>
+            </w:r>
+            <w:r>
+              <w:rPr>
+                <w:rFonts w:ascii="Georgia" w:hAnsi="Georgia" w:cs="Georgia"/>
+                <w:b w:val="0"/>
+                <w:i w:val="0"/>
+                <w:color w:val="222222"/>
+                <w:sz w:val="15"/>
+              </w:rPr>
+              <w:t xml:space="preserve"> 1 (200 XP)</w:t>
+            </w:r>
+          </w:p>
+          <w:p>
+            <w:pPr>
+              <w:keepNext/>
+              <w:spacing w:before="60" w:after="20"/>
+            </w:pPr>
+            <w:r>
+              <w:rPr>
+                <w:rFonts w:ascii="Georgia" w:hAnsi="Georgia" w:cs="Georgia"/>
+                <w:b/>
+                <w:color w:val="8B2020"/>
+                <w:sz w:val="16"/>
+              </w:rPr>
+              <w:t>Traits</w:t>
+            </w:r>
+          </w:p>
+          <w:p>
+            <w:pPr>
+              <w:spacing w:after="20"/>
+            </w:pPr>
+            <w:r>
+              <w:rPr>
+                <w:rFonts w:ascii="Georgia" w:hAnsi="Georgia" w:cs="Georgia"/>
+                <w:b/>
+                <w:i/>
+                <w:color w:val="222222"/>
+                <w:sz w:val="15"/>
+              </w:rPr>
+              <w:t xml:space="preserve">Helpful Tongue. </w:t>
+            </w:r>
+            <w:r>
+              <w:rPr>
+                <w:rFonts w:ascii="Georgia" w:hAnsi="Georgia" w:cs="Georgia"/>
+                <w:b w:val="0"/>
+                <w:i w:val="0"/>
+                <w:color w:val="222222"/>
+                <w:sz w:val="15"/>
+              </w:rPr>
+              <w:t>Traveling with the party, Lickgloom can fetch small objects with its 10 foot tongue, and once per scene its tasting tongue grants one hero advantage on a Wisdom (Perception) or Intelligence (Investigation) check.</w:t>
+            </w:r>
+          </w:p>
+          <w:p>
+            <w:pPr>
+              <w:keepNext/>
+              <w:spacing w:before="60" w:after="20"/>
+            </w:pPr>
+            <w:r>
+              <w:rPr>
+                <w:rFonts w:ascii="Georgia" w:hAnsi="Georgia" w:cs="Georgia"/>
+                <w:b/>
+                <w:color w:val="8B2020"/>
+                <w:sz w:val="16"/>
+              </w:rPr>
+              <w:t>Actions</w:t>
+            </w:r>
+          </w:p>
+          <w:p>
+            <w:pPr>
+              <w:spacing w:after="20"/>
+            </w:pPr>
+            <w:r>
+              <w:rPr>
+                <w:rFonts w:ascii="Georgia" w:hAnsi="Georgia" w:cs="Georgia"/>
+                <w:b/>
+                <w:i/>
+                <w:color w:val="222222"/>
+                <w:sz w:val="15"/>
+              </w:rPr>
+              <w:t xml:space="preserve">Tongue Whip. </w:t>
+            </w:r>
+            <w:r>
+              <w:rPr>
+                <w:rFonts w:ascii="Georgia" w:hAnsi="Georgia" w:cs="Georgia"/>
+                <w:b w:val="0"/>
+                <w:i/>
+                <w:color w:val="222222"/>
+                <w:sz w:val="15"/>
+              </w:rPr>
+              <w:t>Melee Attack:</w:t>
+            </w:r>
+            <w:r>
+              <w:rPr>
+                <w:rFonts w:ascii="Georgia" w:hAnsi="Georgia" w:cs="Georgia"/>
+                <w:b w:val="0"/>
+                <w:i w:val="0"/>
+                <w:color w:val="222222"/>
+                <w:sz w:val="15"/>
+              </w:rPr>
+              <w:t xml:space="preserve"> +4 to hit, reach 10 ft. </w:t>
+            </w:r>
+            <w:r>
+              <w:rPr>
+                <w:rFonts w:ascii="Georgia" w:hAnsi="Georgia" w:cs="Georgia"/>
+                <w:b w:val="0"/>
+                <w:i/>
+                <w:color w:val="222222"/>
+                <w:sz w:val="15"/>
+              </w:rPr>
+              <w:t>Hit:</w:t>
+            </w:r>
+            <w:r>
+              <w:rPr>
+                <w:rFonts w:ascii="Georgia" w:hAnsi="Georgia" w:cs="Georgia"/>
+                <w:b w:val="0"/>
+                <w:i w:val="0"/>
+                <w:color w:val="222222"/>
+                <w:sz w:val="15"/>
+              </w:rPr>
+              <w:t xml:space="preserve"> 1d6 + 2 bludgeoning damage, and the target must succeed on a DC 12 Strength saving throw or be grappled (escape DC 12).</w:t>
+            </w:r>
+          </w:p>
+          <w:p>
+            <w:pPr>
+              <w:spacing w:after="20"/>
+            </w:pPr>
+            <w:r>
+              <w:rPr>
+                <w:rFonts w:ascii="Georgia" w:hAnsi="Georgia" w:cs="Georgia"/>
+                <w:b/>
+                <w:i/>
+                <w:color w:val="222222"/>
+                <w:sz w:val="15"/>
+              </w:rPr>
+              <w:t xml:space="preserve">Sticky Lick (Recharge 5-6). </w:t>
+            </w:r>
+            <w:r>
+              <w:rPr>
+                <w:rFonts w:ascii="Georgia" w:hAnsi="Georgia" w:cs="Georgia"/>
+                <w:b w:val="0"/>
+                <w:i w:val="0"/>
+                <w:color w:val="222222"/>
+                <w:sz w:val="15"/>
+              </w:rPr>
+              <w:t>One creature within 10 ft must succeed on a DC 13 Dexterity saving throw or lose one small item (a weapon, potion, or trinket), which Lickgloom pulls to itself.</w:t>
+            </w:r>
+          </w:p>
+          <w:p>
+            <w:pPr>
+              <w:spacing w:after="20"/>
+            </w:pPr>
+            <w:r>
+              <w:rPr>
+                <w:rFonts w:ascii="Georgia" w:hAnsi="Georgia" w:cs="Georgia"/>
+                <w:b/>
+                <w:i/>
+                <w:color w:val="222222"/>
+                <w:sz w:val="15"/>
+              </w:rPr>
+              <w:t xml:space="preserve">Lick Attack. </w:t>
+            </w:r>
+            <w:r>
+              <w:rPr>
+                <w:rFonts w:ascii="Georgia" w:hAnsi="Georgia" w:cs="Georgia"/>
+                <w:b w:val="0"/>
+                <w:i/>
+                <w:color w:val="222222"/>
+                <w:sz w:val="15"/>
+              </w:rPr>
+              <w:t>Melee Attack:</w:t>
+            </w:r>
+            <w:r>
+              <w:rPr>
+                <w:rFonts w:ascii="Georgia" w:hAnsi="Georgia" w:cs="Georgia"/>
+                <w:b w:val="0"/>
+                <w:i w:val="0"/>
+                <w:color w:val="222222"/>
+                <w:sz w:val="15"/>
+              </w:rPr>
+              <w:t xml:space="preserve"> +4 to hit, reach 5 ft. </w:t>
+            </w:r>
+            <w:r>
+              <w:rPr>
+                <w:rFonts w:ascii="Georgia" w:hAnsi="Georgia" w:cs="Georgia"/>
+                <w:b w:val="0"/>
+                <w:i/>
+                <w:color w:val="222222"/>
+                <w:sz w:val="15"/>
+              </w:rPr>
+              <w:t>Hit:</w:t>
+            </w:r>
+            <w:r>
+              <w:rPr>
+                <w:rFonts w:ascii="Georgia" w:hAnsi="Georgia" w:cs="Georgia"/>
+                <w:b w:val="0"/>
+                <w:i w:val="0"/>
+                <w:color w:val="222222"/>
+                <w:sz w:val="15"/>
+              </w:rPr>
+              <w:t xml:space="preserve"> 1d8 + 2 bludgeoning damage, and the target must succeed on a DC 12 Constitution saving throw or be stunned until the end of its next turn.</w:t>
+            </w:r>
+          </w:p>
+        </w:tc>
+      </w:tr>
+    </w:tbl>
+    <w:p>
+      <w:pPr>
+        <w:spacing w:after="40"/>
+      </w:pPr>
+    </w:p>
+    <w:p>
+      <w:pPr>
+        <w:spacing w:before="40" w:after="160"/>
+      </w:pPr>
+      <w:r>
+        <w:rPr>
+          <w:rFonts w:ascii="Georgia" w:hAnsi="Georgia" w:cs="Georgia"/>
+          <w:b/>
+          <w:color w:val="8B2020"/>
+          <w:sz w:val="18"/>
+        </w:rPr>
+        <w:t xml:space="preserve">Tactics: </w:t>
       </w:r>
       <w:r>
         <w:rPr>
           <w:rFonts w:ascii="Georgia" w:hAnsi="Georgia" w:cs="Georgia"/>
           <w:b w:val="0"/>
-          <w:i w:val="0"/>
+          <w:i/>
           <w:color w:val="222222"/>
           <w:sz w:val="18"/>
         </w:rPr>
-        <w:t xml:space="preserve"> One bite and one claw.</w:t>
+        <w:t>Not an enemy: curious, playful, and hungry for new tastes. It meets aggression by darting into the pond, and it meets bread by joining the party. In a fight it stays behind its friends and helps how it can; at the grove it hauled a hero out of a whirlpool with one heroic tongue.</w:t>
       </w:r>
     </w:p>
     <w:p>
       <w:pPr>
-        <w:pBdr>
-          <w:left w:val="single" w:sz="18" w:space="12" w:color="8B2020"/>
-        </w:pBdr>
-        <w:shd w:val="clear" w:color="auto" w:fill="FCF6F6"/>
-        <w:spacing w:before="30" w:after="70"/>
-        <w:ind w:left="340" w:right="340"/>
+        <w:keepNext/>
+        <w:spacing w:before="320" w:after="20"/>
+        <w:jc w:val="center"/>
       </w:pPr>
       <w:r>
         <w:rPr>
           <w:rFonts w:ascii="Georgia" w:hAnsi="Georgia" w:cs="Georgia"/>
           <w:b/>
-          <w:i w:val="0"/>
-          <w:color w:val="222222"/>
+          <w:color w:val="8B2020"/>
+          <w:sz w:val="26"/>
+        </w:rPr>
+        <w:t>ENEMIES, Fight 2: The Stone Circle</w:t>
+      </w:r>
+    </w:p>
+    <w:p>
+      <w:pPr>
+        <w:keepNext/>
+        <w:spacing w:after="120"/>
+        <w:jc w:val="center"/>
+      </w:pPr>
+      <w:r>
+        <w:rPr>
+          <w:rFonts w:ascii="Georgia" w:hAnsi="Georgia" w:cs="Georgia"/>
+          <w:color w:val="888888"/>
           <w:sz w:val="18"/>
         </w:rPr>
-        <w:t>Bite.</w:t>
+        <w:t>The Forest of Whispers ✦ Difficulty: Hard ✦ 1x Duckleaf, guardian of the circle</w:t>
+      </w:r>
+    </w:p>
+    <w:tbl>
+      <w:tblPr>
+        <w:tblW w:type="auto" w:w="0"/>
+        <w:jc w:val="center"/>
+        <w:tblLayout w:type="fixed"/>
+        <w:tblLook w:firstColumn="1" w:firstRow="1" w:lastColumn="0" w:lastRow="0" w:noHBand="0" w:noVBand="1" w:val="04A0"/>
+        <w:tblCellMar>
+          <w:left w:w="110" w:type="dxa"/>
+          <w:right w:w="110" w:type="dxa"/>
+          <w:top w:w="60" w:type="dxa"/>
+          <w:bottom w:w="80" w:type="dxa"/>
+        </w:tblCellMar>
+        <w:tblBorders>
+          <w:top w:val="single" w:sz="8" w:space="0" w:color="8B2020"/>
+          <w:left w:val="single" w:sz="8" w:space="0" w:color="8B2020"/>
+          <w:bottom w:val="single" w:sz="8" w:space="0" w:color="8B2020"/>
+          <w:right w:val="single" w:sz="8" w:space="0" w:color="8B2020"/>
+          <w:insideH w:val="single" w:sz="8" w:space="0" w:color="8B2020"/>
+          <w:insideV w:val="single" w:sz="8" w:space="0" w:color="8B2020"/>
+        </w:tblBorders>
+      </w:tblPr>
+      <w:tblGrid>
+        <w:gridCol w:w="9360"/>
+      </w:tblGrid>
+      <w:tr>
+        <w:trPr>
+          <w:cantSplit/>
+        </w:trPr>
+        <w:tc>
+          <w:tcPr>
+            <w:tcW w:type="dxa" w:w="9072"/>
+          </w:tcPr>
+          <w:p>
+            <w:pPr>
+              <w:shd w:val="clear" w:color="auto" w:fill="8B2020"/>
+              <w:spacing w:before="0" w:after="20"/>
+            </w:pPr>
+            <w:r>
+              <w:rPr>
+                <w:rFonts w:ascii="Georgia" w:hAnsi="Georgia" w:cs="Georgia"/>
+                <w:b/>
+                <w:color w:val="FFFFFF"/>
+                <w:sz w:val="22"/>
+              </w:rPr>
+              <w:t>DUCKLEAF</w:t>
+            </w:r>
+          </w:p>
+          <w:p>
+            <w:pPr>
+              <w:spacing w:after="40"/>
+            </w:pPr>
+            <w:r>
+              <w:rPr>
+                <w:rFonts w:ascii="Georgia" w:hAnsi="Georgia" w:cs="Georgia"/>
+                <w:i/>
+                <w:color w:val="8B2020"/>
+                <w:sz w:val="16"/>
+              </w:rPr>
+              <w:t>Small beast (Elemental Air), neutral ✦ CR 4 (1,100 XP)</w:t>
+            </w:r>
+          </w:p>
+          <w:p>
+            <w:pPr>
+              <w:spacing w:after="60"/>
+              <w:jc w:val="center"/>
+            </w:pPr>
+            <w:r>
+              <w:drawing>
+                <wp:inline xmlns:a="http://schemas.openxmlformats.org/drawingml/2006/main" xmlns:pic="http://schemas.openxmlformats.org/drawingml/2006/picture">
+                  <wp:extent cx="2926080" cy="2926080"/>
+                  <wp:docPr id="15" name="Picture 15"/>
+                  <wp:cNvGraphicFramePr>
+                    <a:graphicFrameLocks noChangeAspect="1"/>
+                  </wp:cNvGraphicFramePr>
+                  <a:graphic>
+                    <a:graphicData uri="http://schemas.openxmlformats.org/drawingml/2006/picture">
+                      <pic:pic>
+                        <pic:nvPicPr>
+                          <pic:cNvPr id="0" name="image.jpg"/>
+                          <pic:cNvPicPr/>
+                        </pic:nvPicPr>
+                        <pic:blipFill>
+                          <a:blip r:embed="rId24"/>
+                          <a:stretch>
+                            <a:fillRect/>
+                          </a:stretch>
+                        </pic:blipFill>
+                        <pic:spPr>
+                          <a:xfrm>
+                            <a:off x="0" y="0"/>
+                            <a:ext cx="2926080" cy="2926080"/>
+                          </a:xfrm>
+                          <a:prstGeom prst="rect"/>
+                        </pic:spPr>
+                      </pic:pic>
+                    </a:graphicData>
+                  </a:graphic>
+                </wp:inline>
+              </w:drawing>
+            </w:r>
+          </w:p>
+          <w:p>
+            <w:pPr>
+              <w:spacing w:after="20"/>
+            </w:pPr>
+            <w:r>
+              <w:rPr>
+                <w:rFonts w:ascii="Georgia" w:hAnsi="Georgia" w:cs="Georgia"/>
+                <w:b/>
+                <w:i w:val="0"/>
+                <w:color w:val="222222"/>
+                <w:sz w:val="15"/>
+              </w:rPr>
+              <w:t>AC</w:t>
+            </w:r>
+            <w:r>
+              <w:rPr>
+                <w:rFonts w:ascii="Georgia" w:hAnsi="Georgia" w:cs="Georgia"/>
+                <w:b w:val="0"/>
+                <w:i w:val="0"/>
+                <w:color w:val="222222"/>
+                <w:sz w:val="15"/>
+              </w:rPr>
+              <w:t xml:space="preserve"> 15 (natural armor)  </w:t>
+            </w:r>
+            <w:r>
+              <w:rPr>
+                <w:rFonts w:ascii="Georgia" w:hAnsi="Georgia" w:cs="Georgia"/>
+                <w:b/>
+                <w:i w:val="0"/>
+                <w:color w:val="222222"/>
+                <w:sz w:val="15"/>
+              </w:rPr>
+              <w:t>HP</w:t>
+            </w:r>
+            <w:r>
+              <w:rPr>
+                <w:rFonts w:ascii="Georgia" w:hAnsi="Georgia" w:cs="Georgia"/>
+                <w:b w:val="0"/>
+                <w:i w:val="0"/>
+                <w:color w:val="222222"/>
+                <w:sz w:val="15"/>
+              </w:rPr>
+              <w:t xml:space="preserve"> 52 (8d8 + 16)  </w:t>
+            </w:r>
+            <w:r>
+              <w:rPr>
+                <w:rFonts w:ascii="Georgia" w:hAnsi="Georgia" w:cs="Georgia"/>
+                <w:b/>
+                <w:i w:val="0"/>
+                <w:color w:val="222222"/>
+                <w:sz w:val="15"/>
+              </w:rPr>
+              <w:t>Speed</w:t>
+            </w:r>
+            <w:r>
+              <w:rPr>
+                <w:rFonts w:ascii="Georgia" w:hAnsi="Georgia" w:cs="Georgia"/>
+                <w:b w:val="0"/>
+                <w:i w:val="0"/>
+                <w:color w:val="222222"/>
+                <w:sz w:val="15"/>
+              </w:rPr>
+              <w:t xml:space="preserve"> 30 ft, fly 30 ft</w:t>
+            </w:r>
+          </w:p>
+          <w:p>
+            <w:pPr>
+              <w:spacing w:after="20"/>
+            </w:pPr>
+            <w:r>
+              <w:rPr>
+                <w:rFonts w:ascii="Georgia" w:hAnsi="Georgia" w:cs="Georgia"/>
+                <w:b/>
+                <w:i w:val="0"/>
+                <w:color w:val="222222"/>
+                <w:sz w:val="15"/>
+              </w:rPr>
+              <w:t>STR</w:t>
+            </w:r>
+            <w:r>
+              <w:rPr>
+                <w:rFonts w:ascii="Georgia" w:hAnsi="Georgia" w:cs="Georgia"/>
+                <w:b w:val="0"/>
+                <w:i w:val="0"/>
+                <w:color w:val="222222"/>
+                <w:sz w:val="15"/>
+              </w:rPr>
+              <w:t xml:space="preserve"> 14  </w:t>
+            </w:r>
+            <w:r>
+              <w:rPr>
+                <w:rFonts w:ascii="Georgia" w:hAnsi="Georgia" w:cs="Georgia"/>
+                <w:b/>
+                <w:i w:val="0"/>
+                <w:color w:val="222222"/>
+                <w:sz w:val="15"/>
+              </w:rPr>
+              <w:t>DEX</w:t>
+            </w:r>
+            <w:r>
+              <w:rPr>
+                <w:rFonts w:ascii="Georgia" w:hAnsi="Georgia" w:cs="Georgia"/>
+                <w:b w:val="0"/>
+                <w:i w:val="0"/>
+                <w:color w:val="222222"/>
+                <w:sz w:val="15"/>
+              </w:rPr>
+              <w:t xml:space="preserve"> 16  </w:t>
+            </w:r>
+            <w:r>
+              <w:rPr>
+                <w:rFonts w:ascii="Georgia" w:hAnsi="Georgia" w:cs="Georgia"/>
+                <w:b/>
+                <w:i w:val="0"/>
+                <w:color w:val="222222"/>
+                <w:sz w:val="15"/>
+              </w:rPr>
+              <w:t>CON</w:t>
+            </w:r>
+            <w:r>
+              <w:rPr>
+                <w:rFonts w:ascii="Georgia" w:hAnsi="Georgia" w:cs="Georgia"/>
+                <w:b w:val="0"/>
+                <w:i w:val="0"/>
+                <w:color w:val="222222"/>
+                <w:sz w:val="15"/>
+              </w:rPr>
+              <w:t xml:space="preserve"> 14  </w:t>
+            </w:r>
+            <w:r>
+              <w:rPr>
+                <w:rFonts w:ascii="Georgia" w:hAnsi="Georgia" w:cs="Georgia"/>
+                <w:b/>
+                <w:i w:val="0"/>
+                <w:color w:val="222222"/>
+                <w:sz w:val="15"/>
+              </w:rPr>
+              <w:t>INT</w:t>
+            </w:r>
+            <w:r>
+              <w:rPr>
+                <w:rFonts w:ascii="Georgia" w:hAnsi="Georgia" w:cs="Georgia"/>
+                <w:b w:val="0"/>
+                <w:i w:val="0"/>
+                <w:color w:val="222222"/>
+                <w:sz w:val="15"/>
+              </w:rPr>
+              <w:t xml:space="preserve"> 10  </w:t>
+            </w:r>
+            <w:r>
+              <w:rPr>
+                <w:rFonts w:ascii="Georgia" w:hAnsi="Georgia" w:cs="Georgia"/>
+                <w:b/>
+                <w:i w:val="0"/>
+                <w:color w:val="222222"/>
+                <w:sz w:val="15"/>
+              </w:rPr>
+              <w:t>WIS</w:t>
+            </w:r>
+            <w:r>
+              <w:rPr>
+                <w:rFonts w:ascii="Georgia" w:hAnsi="Georgia" w:cs="Georgia"/>
+                <w:b w:val="0"/>
+                <w:i w:val="0"/>
+                <w:color w:val="222222"/>
+                <w:sz w:val="15"/>
+              </w:rPr>
+              <w:t xml:space="preserve"> 12  </w:t>
+            </w:r>
+            <w:r>
+              <w:rPr>
+                <w:rFonts w:ascii="Georgia" w:hAnsi="Georgia" w:cs="Georgia"/>
+                <w:b/>
+                <w:i w:val="0"/>
+                <w:color w:val="222222"/>
+                <w:sz w:val="15"/>
+              </w:rPr>
+              <w:t>CHA</w:t>
+            </w:r>
+            <w:r>
+              <w:rPr>
+                <w:rFonts w:ascii="Georgia" w:hAnsi="Georgia" w:cs="Georgia"/>
+                <w:b w:val="0"/>
+                <w:i w:val="0"/>
+                <w:color w:val="222222"/>
+                <w:sz w:val="15"/>
+              </w:rPr>
+              <w:t xml:space="preserve"> 10</w:t>
+            </w:r>
+          </w:p>
+          <w:p>
+            <w:pPr>
+              <w:spacing w:after="20"/>
+            </w:pPr>
+            <w:r>
+              <w:rPr>
+                <w:rFonts w:ascii="Georgia" w:hAnsi="Georgia" w:cs="Georgia"/>
+                <w:b/>
+                <w:i w:val="0"/>
+                <w:color w:val="222222"/>
+                <w:sz w:val="15"/>
+              </w:rPr>
+              <w:t>Saves</w:t>
+            </w:r>
+            <w:r>
+              <w:rPr>
+                <w:rFonts w:ascii="Georgia" w:hAnsi="Georgia" w:cs="Georgia"/>
+                <w:b w:val="0"/>
+                <w:i w:val="0"/>
+                <w:color w:val="222222"/>
+                <w:sz w:val="15"/>
+              </w:rPr>
+              <w:t xml:space="preserve"> Dex +5, Wis +3  </w:t>
+            </w:r>
+            <w:r>
+              <w:rPr>
+                <w:rFonts w:ascii="Georgia" w:hAnsi="Georgia" w:cs="Georgia"/>
+                <w:b/>
+                <w:i w:val="0"/>
+                <w:color w:val="222222"/>
+                <w:sz w:val="15"/>
+              </w:rPr>
+              <w:t>Skills</w:t>
+            </w:r>
+            <w:r>
+              <w:rPr>
+                <w:rFonts w:ascii="Georgia" w:hAnsi="Georgia" w:cs="Georgia"/>
+                <w:b w:val="0"/>
+                <w:i w:val="0"/>
+                <w:color w:val="222222"/>
+                <w:sz w:val="15"/>
+              </w:rPr>
+              <w:t xml:space="preserve"> Acrobatics +5, Perception +3</w:t>
+            </w:r>
+          </w:p>
+          <w:p>
+            <w:pPr>
+              <w:spacing w:after="20"/>
+            </w:pPr>
+            <w:r>
+              <w:rPr>
+                <w:rFonts w:ascii="Georgia" w:hAnsi="Georgia" w:cs="Georgia"/>
+                <w:b/>
+                <w:i w:val="0"/>
+                <w:color w:val="222222"/>
+                <w:sz w:val="15"/>
+              </w:rPr>
+              <w:t>Resist</w:t>
+            </w:r>
+            <w:r>
+              <w:rPr>
+                <w:rFonts w:ascii="Georgia" w:hAnsi="Georgia" w:cs="Georgia"/>
+                <w:b w:val="0"/>
+                <w:i w:val="0"/>
+                <w:color w:val="222222"/>
+                <w:sz w:val="15"/>
+              </w:rPr>
+              <w:t xml:space="preserve"> slashing, bludgeoning (wind sheath)</w:t>
+            </w:r>
+          </w:p>
+          <w:p>
+            <w:pPr>
+              <w:spacing w:after="20"/>
+            </w:pPr>
+            <w:r>
+              <w:rPr>
+                <w:rFonts w:ascii="Georgia" w:hAnsi="Georgia" w:cs="Georgia"/>
+                <w:b/>
+                <w:i w:val="0"/>
+                <w:color w:val="222222"/>
+                <w:sz w:val="15"/>
+              </w:rPr>
+              <w:t>Senses</w:t>
+            </w:r>
+            <w:r>
+              <w:rPr>
+                <w:rFonts w:ascii="Georgia" w:hAnsi="Georgia" w:cs="Georgia"/>
+                <w:b w:val="0"/>
+                <w:i w:val="0"/>
+                <w:color w:val="222222"/>
+                <w:sz w:val="15"/>
+              </w:rPr>
+              <w:t xml:space="preserve"> darkvision 60 ft, passive Perception 13</w:t>
+            </w:r>
+          </w:p>
+          <w:p>
+            <w:pPr>
+              <w:spacing w:after="20"/>
+            </w:pPr>
+            <w:r>
+              <w:rPr>
+                <w:rFonts w:ascii="Georgia" w:hAnsi="Georgia" w:cs="Georgia"/>
+                <w:b/>
+                <w:i w:val="0"/>
+                <w:color w:val="222222"/>
+                <w:sz w:val="15"/>
+              </w:rPr>
+              <w:t>Languages</w:t>
+            </w:r>
+            <w:r>
+              <w:rPr>
+                <w:rFonts w:ascii="Georgia" w:hAnsi="Georgia" w:cs="Georgia"/>
+                <w:b w:val="0"/>
+                <w:i w:val="0"/>
+                <w:color w:val="222222"/>
+                <w:sz w:val="15"/>
+              </w:rPr>
+              <w:t xml:space="preserve"> telepathy 30 ft (quacks)</w:t>
+            </w:r>
+          </w:p>
+          <w:p>
+            <w:pPr>
+              <w:spacing w:after="20"/>
+            </w:pPr>
+            <w:r>
+              <w:rPr>
+                <w:rFonts w:ascii="Georgia" w:hAnsi="Georgia" w:cs="Georgia"/>
+                <w:b/>
+                <w:i w:val="0"/>
+                <w:color w:val="222222"/>
+                <w:sz w:val="15"/>
+              </w:rPr>
+              <w:t>Challenge</w:t>
+            </w:r>
+            <w:r>
+              <w:rPr>
+                <w:rFonts w:ascii="Georgia" w:hAnsi="Georgia" w:cs="Georgia"/>
+                <w:b w:val="0"/>
+                <w:i w:val="0"/>
+                <w:color w:val="222222"/>
+                <w:sz w:val="15"/>
+              </w:rPr>
+              <w:t xml:space="preserve"> 4 (1,100 XP)</w:t>
+            </w:r>
+          </w:p>
+          <w:p>
+            <w:pPr>
+              <w:keepNext/>
+              <w:spacing w:before="60" w:after="20"/>
+            </w:pPr>
+            <w:r>
+              <w:rPr>
+                <w:rFonts w:ascii="Georgia" w:hAnsi="Georgia" w:cs="Georgia"/>
+                <w:b/>
+                <w:color w:val="8B2020"/>
+                <w:sz w:val="16"/>
+              </w:rPr>
+              <w:t>Traits</w:t>
+            </w:r>
+          </w:p>
+          <w:p>
+            <w:pPr>
+              <w:spacing w:after="20"/>
+            </w:pPr>
+            <w:r>
+              <w:rPr>
+                <w:rFonts w:ascii="Georgia" w:hAnsi="Georgia" w:cs="Georgia"/>
+                <w:b/>
+                <w:i/>
+                <w:color w:val="222222"/>
+                <w:sz w:val="15"/>
+              </w:rPr>
+              <w:t xml:space="preserve">Winged Leap. </w:t>
+            </w:r>
+            <w:r>
+              <w:rPr>
+                <w:rFonts w:ascii="Georgia" w:hAnsi="Georgia" w:cs="Georgia"/>
+                <w:b w:val="0"/>
+                <w:i w:val="0"/>
+                <w:color w:val="222222"/>
+                <w:sz w:val="15"/>
+              </w:rPr>
+              <w:t>Duckleaf can leap 30 ft in any direction without provoking opportunity attacks, riding the wind to evade and reposition. If a stone of the circle is damaged or disrupted, it loses this trait for the rest of the battle.</w:t>
+            </w:r>
+          </w:p>
+          <w:p>
+            <w:pPr>
+              <w:keepNext/>
+              <w:spacing w:before="60" w:after="20"/>
+            </w:pPr>
+            <w:r>
+              <w:rPr>
+                <w:rFonts w:ascii="Georgia" w:hAnsi="Georgia" w:cs="Georgia"/>
+                <w:b/>
+                <w:color w:val="8B2020"/>
+                <w:sz w:val="16"/>
+              </w:rPr>
+              <w:t>Actions</w:t>
+            </w:r>
+          </w:p>
+          <w:p>
+            <w:pPr>
+              <w:spacing w:after="20"/>
+            </w:pPr>
+            <w:r>
+              <w:rPr>
+                <w:rFonts w:ascii="Georgia" w:hAnsi="Georgia" w:cs="Georgia"/>
+                <w:b/>
+                <w:i/>
+                <w:color w:val="222222"/>
+                <w:sz w:val="15"/>
+              </w:rPr>
+              <w:t xml:space="preserve">Leek Strike. </w:t>
+            </w:r>
+            <w:r>
+              <w:rPr>
+                <w:rFonts w:ascii="Georgia" w:hAnsi="Georgia" w:cs="Georgia"/>
+                <w:b w:val="0"/>
+                <w:i/>
+                <w:color w:val="222222"/>
+                <w:sz w:val="15"/>
+              </w:rPr>
+              <w:t>Melee Attack:</w:t>
+            </w:r>
+            <w:r>
+              <w:rPr>
+                <w:rFonts w:ascii="Georgia" w:hAnsi="Georgia" w:cs="Georgia"/>
+                <w:b w:val="0"/>
+                <w:i w:val="0"/>
+                <w:color w:val="222222"/>
+                <w:sz w:val="15"/>
+              </w:rPr>
+              <w:t xml:space="preserve"> +6 to hit, reach 5 ft. </w:t>
+            </w:r>
+            <w:r>
+              <w:rPr>
+                <w:rFonts w:ascii="Georgia" w:hAnsi="Georgia" w:cs="Georgia"/>
+                <w:b w:val="0"/>
+                <w:i/>
+                <w:color w:val="222222"/>
+                <w:sz w:val="15"/>
+              </w:rPr>
+              <w:t>Hit:</w:t>
+            </w:r>
+            <w:r>
+              <w:rPr>
+                <w:rFonts w:ascii="Georgia" w:hAnsi="Georgia" w:cs="Georgia"/>
+                <w:b w:val="0"/>
+                <w:i w:val="0"/>
+                <w:color w:val="222222"/>
+                <w:sz w:val="15"/>
+              </w:rPr>
+              <w:t xml:space="preserve"> 2d8 + 4 slashing damage, the wind guiding the blow with deadly accuracy.</w:t>
+            </w:r>
+          </w:p>
+          <w:p>
+            <w:pPr>
+              <w:spacing w:after="20"/>
+            </w:pPr>
+            <w:r>
+              <w:rPr>
+                <w:rFonts w:ascii="Georgia" w:hAnsi="Georgia" w:cs="Georgia"/>
+                <w:b/>
+                <w:i/>
+                <w:color w:val="222222"/>
+                <w:sz w:val="15"/>
+              </w:rPr>
+              <w:t xml:space="preserve">Aerial Slash. </w:t>
+            </w:r>
+            <w:r>
+              <w:rPr>
+                <w:rFonts w:ascii="Georgia" w:hAnsi="Georgia" w:cs="Georgia"/>
+                <w:b w:val="0"/>
+                <w:i/>
+                <w:color w:val="222222"/>
+                <w:sz w:val="15"/>
+              </w:rPr>
+              <w:t>Ranged Attack:</w:t>
+            </w:r>
+            <w:r>
+              <w:rPr>
+                <w:rFonts w:ascii="Georgia" w:hAnsi="Georgia" w:cs="Georgia"/>
+                <w:b w:val="0"/>
+                <w:i w:val="0"/>
+                <w:color w:val="222222"/>
+                <w:sz w:val="15"/>
+              </w:rPr>
+              <w:t xml:space="preserve"> +5 to hit, range 20/60 ft. </w:t>
+            </w:r>
+            <w:r>
+              <w:rPr>
+                <w:rFonts w:ascii="Georgia" w:hAnsi="Georgia" w:cs="Georgia"/>
+                <w:b w:val="0"/>
+                <w:i/>
+                <w:color w:val="222222"/>
+                <w:sz w:val="15"/>
+              </w:rPr>
+              <w:t>Hit:</w:t>
+            </w:r>
+            <w:r>
+              <w:rPr>
+                <w:rFonts w:ascii="Georgia" w:hAnsi="Georgia" w:cs="Georgia"/>
+                <w:b w:val="0"/>
+                <w:i w:val="0"/>
+                <w:color w:val="222222"/>
+                <w:sz w:val="15"/>
+              </w:rPr>
+              <w:t xml:space="preserve"> 3d6 + 3 slashing damage from a blade of sharpened air.</w:t>
+            </w:r>
+          </w:p>
+          <w:p>
+            <w:pPr>
+              <w:spacing w:after="20"/>
+            </w:pPr>
+            <w:r>
+              <w:rPr>
+                <w:rFonts w:ascii="Georgia" w:hAnsi="Georgia" w:cs="Georgia"/>
+                <w:b/>
+                <w:i/>
+                <w:color w:val="222222"/>
+                <w:sz w:val="15"/>
+              </w:rPr>
+              <w:t xml:space="preserve">Quack of Fury (Recharge 5-6). </w:t>
+            </w:r>
+            <w:r>
+              <w:rPr>
+                <w:rFonts w:ascii="Georgia" w:hAnsi="Georgia" w:cs="Georgia"/>
+                <w:b w:val="0"/>
+                <w:i w:val="0"/>
+                <w:color w:val="222222"/>
+                <w:sz w:val="15"/>
+              </w:rPr>
+              <w:t>A telepathic quack reverberates through the clearing. Each creature within 15 ft must succeed on a DC 14 Wisdom saving throw or be frightened for 1 minute; a frightened creature repeats the save at the end of each of its turns.</w:t>
+            </w:r>
+          </w:p>
+        </w:tc>
+      </w:tr>
+    </w:tbl>
+    <w:p>
+      <w:pPr>
+        <w:spacing w:after="40"/>
+      </w:pPr>
+    </w:p>
+    <w:p>
+      <w:pPr>
+        <w:spacing w:before="40" w:after="160"/>
+      </w:pPr>
+      <w:r>
+        <w:rPr>
+          <w:rFonts w:ascii="Georgia" w:hAnsi="Georgia" w:cs="Georgia"/>
+          <w:b/>
+          <w:color w:val="8B2020"/>
+          <w:sz w:val="18"/>
+        </w:rPr>
+        <w:t xml:space="preserve">Tactics: </w:t>
       </w:r>
       <w:r>
         <w:rPr>
           <w:rFonts w:ascii="Georgia" w:hAnsi="Georgia" w:cs="Georgia"/>
           <w:b w:val="0"/>
-          <w:i w:val="0"/>
+          <w:i/>
           <w:color w:val="222222"/>
           <w:sz w:val="18"/>
         </w:rPr>
-        <w:t xml:space="preserve"> +5, reach 5 ft., 1d8 + 3 piercing. </w:t>
+        <w:t>It opens with Aerial Slash from range, uses Winged Leap to skip away from melee without provoking, and saves Quack of Fury for a bunched-up party. The circle is the fight: wind visibly streams from the stones to the duck each time it leaps, and disrupting one stone grounds it; it defends the stones fiercely once it realizes what the heroes are doing. A guardian, not a hunter: heroes who heed the warning may withdraw, and it never pursues beyond the stones.</w:t>
       </w:r>
+    </w:p>
+    <w:p>
+      <w:pPr>
+        <w:keepNext/>
+        <w:spacing w:before="320" w:after="20"/>
+        <w:jc w:val="center"/>
+      </w:pPr>
       <w:r>
         <w:rPr>
           <w:rFonts w:ascii="Georgia" w:hAnsi="Georgia" w:cs="Georgia"/>
           <w:b/>
-          <w:i w:val="0"/>
-          <w:color w:val="222222"/>
+          <w:color w:val="8B2020"/>
+          <w:sz w:val="26"/>
+        </w:rPr>
+        <w:t>ENEMIES, Fight 3: The Grove of Elemental Waters</w:t>
+      </w:r>
+    </w:p>
+    <w:p>
+      <w:pPr>
+        <w:keepNext/>
+        <w:spacing w:after="120"/>
+        <w:jc w:val="center"/>
+      </w:pPr>
+      <w:r>
+        <w:rPr>
+          <w:rFonts w:ascii="Georgia" w:hAnsi="Georgia" w:cs="Georgia"/>
+          <w:color w:val="888888"/>
           <w:sz w:val="18"/>
         </w:rPr>
-        <w:t>Claw.</w:t>
+        <w:t>The Forest of Whispers ✦ Difficulty: Medium ✦ 1x Cognifin, the guardian's test</w:t>
+      </w:r>
+    </w:p>
+    <w:tbl>
+      <w:tblPr>
+        <w:tblW w:type="auto" w:w="0"/>
+        <w:jc w:val="center"/>
+        <w:tblLayout w:type="fixed"/>
+        <w:tblLook w:firstColumn="1" w:firstRow="1" w:lastColumn="0" w:lastRow="0" w:noHBand="0" w:noVBand="1" w:val="04A0"/>
+        <w:tblCellMar>
+          <w:left w:w="110" w:type="dxa"/>
+          <w:right w:w="110" w:type="dxa"/>
+          <w:top w:w="60" w:type="dxa"/>
+          <w:bottom w:w="80" w:type="dxa"/>
+        </w:tblCellMar>
+        <w:tblBorders>
+          <w:top w:val="single" w:sz="8" w:space="0" w:color="8B2020"/>
+          <w:left w:val="single" w:sz="8" w:space="0" w:color="8B2020"/>
+          <w:bottom w:val="single" w:sz="8" w:space="0" w:color="8B2020"/>
+          <w:right w:val="single" w:sz="8" w:space="0" w:color="8B2020"/>
+          <w:insideH w:val="single" w:sz="8" w:space="0" w:color="8B2020"/>
+          <w:insideV w:val="single" w:sz="8" w:space="0" w:color="8B2020"/>
+        </w:tblBorders>
+      </w:tblPr>
+      <w:tblGrid>
+        <w:gridCol w:w="9360"/>
+      </w:tblGrid>
+      <w:tr>
+        <w:trPr>
+          <w:cantSplit/>
+        </w:trPr>
+        <w:tc>
+          <w:tcPr>
+            <w:tcW w:type="dxa" w:w="9072"/>
+          </w:tcPr>
+          <w:p>
+            <w:pPr>
+              <w:shd w:val="clear" w:color="auto" w:fill="8B2020"/>
+              <w:spacing w:before="0" w:after="20"/>
+            </w:pPr>
+            <w:r>
+              <w:rPr>
+                <w:rFonts w:ascii="Georgia" w:hAnsi="Georgia" w:cs="Georgia"/>
+                <w:b/>
+                <w:color w:val="FFFFFF"/>
+                <w:sz w:val="22"/>
+              </w:rPr>
+              <w:t>COGNIFIN</w:t>
+            </w:r>
+          </w:p>
+          <w:p>
+            <w:pPr>
+              <w:spacing w:after="40"/>
+            </w:pPr>
+            <w:r>
+              <w:rPr>
+                <w:rFonts w:ascii="Georgia" w:hAnsi="Georgia" w:cs="Georgia"/>
+                <w:i/>
+                <w:color w:val="8B2020"/>
+                <w:sz w:val="16"/>
+              </w:rPr>
+              <w:t>Small beast (Elemental Water), neutral guardian ✦ CR 3 (700 XP)</w:t>
+            </w:r>
+          </w:p>
+          <w:p>
+            <w:pPr>
+              <w:spacing w:after="60"/>
+              <w:jc w:val="center"/>
+            </w:pPr>
+            <w:r>
+              <w:drawing>
+                <wp:inline xmlns:a="http://schemas.openxmlformats.org/drawingml/2006/main" xmlns:pic="http://schemas.openxmlformats.org/drawingml/2006/picture">
+                  <wp:extent cx="2926080" cy="2926080"/>
+                  <wp:docPr id="16" name="Picture 16"/>
+                  <wp:cNvGraphicFramePr>
+                    <a:graphicFrameLocks noChangeAspect="1"/>
+                  </wp:cNvGraphicFramePr>
+                  <a:graphic>
+                    <a:graphicData uri="http://schemas.openxmlformats.org/drawingml/2006/picture">
+                      <pic:pic>
+                        <pic:nvPicPr>
+                          <pic:cNvPr id="0" name="image.jpg"/>
+                          <pic:cNvPicPr/>
+                        </pic:nvPicPr>
+                        <pic:blipFill>
+                          <a:blip r:embed="rId20"/>
+                          <a:stretch>
+                            <a:fillRect/>
+                          </a:stretch>
+                        </pic:blipFill>
+                        <pic:spPr>
+                          <a:xfrm>
+                            <a:off x="0" y="0"/>
+                            <a:ext cx="2926080" cy="2926080"/>
+                          </a:xfrm>
+                          <a:prstGeom prst="rect"/>
+                        </pic:spPr>
+                      </pic:pic>
+                    </a:graphicData>
+                  </a:graphic>
+                </wp:inline>
+              </w:drawing>
+            </w:r>
+          </w:p>
+          <w:p>
+            <w:pPr>
+              <w:spacing w:after="20"/>
+            </w:pPr>
+            <w:r>
+              <w:rPr>
+                <w:rFonts w:ascii="Georgia" w:hAnsi="Georgia" w:cs="Georgia"/>
+                <w:b/>
+                <w:i w:val="0"/>
+                <w:color w:val="222222"/>
+                <w:sz w:val="15"/>
+              </w:rPr>
+              <w:t>AC</w:t>
+            </w:r>
+            <w:r>
+              <w:rPr>
+                <w:rFonts w:ascii="Georgia" w:hAnsi="Georgia" w:cs="Georgia"/>
+                <w:b w:val="0"/>
+                <w:i w:val="0"/>
+                <w:color w:val="222222"/>
+                <w:sz w:val="15"/>
+              </w:rPr>
+              <w:t xml:space="preserve"> 14 (natural armor)  </w:t>
+            </w:r>
+            <w:r>
+              <w:rPr>
+                <w:rFonts w:ascii="Georgia" w:hAnsi="Georgia" w:cs="Georgia"/>
+                <w:b/>
+                <w:i w:val="0"/>
+                <w:color w:val="222222"/>
+                <w:sz w:val="15"/>
+              </w:rPr>
+              <w:t>HP</w:t>
+            </w:r>
+            <w:r>
+              <w:rPr>
+                <w:rFonts w:ascii="Georgia" w:hAnsi="Georgia" w:cs="Georgia"/>
+                <w:b w:val="0"/>
+                <w:i w:val="0"/>
+                <w:color w:val="222222"/>
+                <w:sz w:val="15"/>
+              </w:rPr>
+              <w:t xml:space="preserve"> 45 (6d8 + 18)  </w:t>
+            </w:r>
+            <w:r>
+              <w:rPr>
+                <w:rFonts w:ascii="Georgia" w:hAnsi="Georgia" w:cs="Georgia"/>
+                <w:b/>
+                <w:i w:val="0"/>
+                <w:color w:val="222222"/>
+                <w:sz w:val="15"/>
+              </w:rPr>
+              <w:t>Speed</w:t>
+            </w:r>
+            <w:r>
+              <w:rPr>
+                <w:rFonts w:ascii="Georgia" w:hAnsi="Georgia" w:cs="Georgia"/>
+                <w:b w:val="0"/>
+                <w:i w:val="0"/>
+                <w:color w:val="222222"/>
+                <w:sz w:val="15"/>
+              </w:rPr>
+              <w:t xml:space="preserve"> 0 ft, fly 30 ft (hover)</w:t>
+            </w:r>
+          </w:p>
+          <w:p>
+            <w:pPr>
+              <w:spacing w:after="20"/>
+            </w:pPr>
+            <w:r>
+              <w:rPr>
+                <w:rFonts w:ascii="Georgia" w:hAnsi="Georgia" w:cs="Georgia"/>
+                <w:b/>
+                <w:i w:val="0"/>
+                <w:color w:val="222222"/>
+                <w:sz w:val="15"/>
+              </w:rPr>
+              <w:t>STR</w:t>
+            </w:r>
+            <w:r>
+              <w:rPr>
+                <w:rFonts w:ascii="Georgia" w:hAnsi="Georgia" w:cs="Georgia"/>
+                <w:b w:val="0"/>
+                <w:i w:val="0"/>
+                <w:color w:val="222222"/>
+                <w:sz w:val="15"/>
+              </w:rPr>
+              <w:t xml:space="preserve"> 10  </w:t>
+            </w:r>
+            <w:r>
+              <w:rPr>
+                <w:rFonts w:ascii="Georgia" w:hAnsi="Georgia" w:cs="Georgia"/>
+                <w:b/>
+                <w:i w:val="0"/>
+                <w:color w:val="222222"/>
+                <w:sz w:val="15"/>
+              </w:rPr>
+              <w:t>DEX</w:t>
+            </w:r>
+            <w:r>
+              <w:rPr>
+                <w:rFonts w:ascii="Georgia" w:hAnsi="Georgia" w:cs="Georgia"/>
+                <w:b w:val="0"/>
+                <w:i w:val="0"/>
+                <w:color w:val="222222"/>
+                <w:sz w:val="15"/>
+              </w:rPr>
+              <w:t xml:space="preserve"> 14  </w:t>
+            </w:r>
+            <w:r>
+              <w:rPr>
+                <w:rFonts w:ascii="Georgia" w:hAnsi="Georgia" w:cs="Georgia"/>
+                <w:b/>
+                <w:i w:val="0"/>
+                <w:color w:val="222222"/>
+                <w:sz w:val="15"/>
+              </w:rPr>
+              <w:t>CON</w:t>
+            </w:r>
+            <w:r>
+              <w:rPr>
+                <w:rFonts w:ascii="Georgia" w:hAnsi="Georgia" w:cs="Georgia"/>
+                <w:b w:val="0"/>
+                <w:i w:val="0"/>
+                <w:color w:val="222222"/>
+                <w:sz w:val="15"/>
+              </w:rPr>
+              <w:t xml:space="preserve"> 16  </w:t>
+            </w:r>
+            <w:r>
+              <w:rPr>
+                <w:rFonts w:ascii="Georgia" w:hAnsi="Georgia" w:cs="Georgia"/>
+                <w:b/>
+                <w:i w:val="0"/>
+                <w:color w:val="222222"/>
+                <w:sz w:val="15"/>
+              </w:rPr>
+              <w:t>INT</w:t>
+            </w:r>
+            <w:r>
+              <w:rPr>
+                <w:rFonts w:ascii="Georgia" w:hAnsi="Georgia" w:cs="Georgia"/>
+                <w:b w:val="0"/>
+                <w:i w:val="0"/>
+                <w:color w:val="222222"/>
+                <w:sz w:val="15"/>
+              </w:rPr>
+              <w:t xml:space="preserve"> 10  </w:t>
+            </w:r>
+            <w:r>
+              <w:rPr>
+                <w:rFonts w:ascii="Georgia" w:hAnsi="Georgia" w:cs="Georgia"/>
+                <w:b/>
+                <w:i w:val="0"/>
+                <w:color w:val="222222"/>
+                <w:sz w:val="15"/>
+              </w:rPr>
+              <w:t>WIS</w:t>
+            </w:r>
+            <w:r>
+              <w:rPr>
+                <w:rFonts w:ascii="Georgia" w:hAnsi="Georgia" w:cs="Georgia"/>
+                <w:b w:val="0"/>
+                <w:i w:val="0"/>
+                <w:color w:val="222222"/>
+                <w:sz w:val="15"/>
+              </w:rPr>
+              <w:t xml:space="preserve"> 14  </w:t>
+            </w:r>
+            <w:r>
+              <w:rPr>
+                <w:rFonts w:ascii="Georgia" w:hAnsi="Georgia" w:cs="Georgia"/>
+                <w:b/>
+                <w:i w:val="0"/>
+                <w:color w:val="222222"/>
+                <w:sz w:val="15"/>
+              </w:rPr>
+              <w:t>CHA</w:t>
+            </w:r>
+            <w:r>
+              <w:rPr>
+                <w:rFonts w:ascii="Georgia" w:hAnsi="Georgia" w:cs="Georgia"/>
+                <w:b w:val="0"/>
+                <w:i w:val="0"/>
+                <w:color w:val="222222"/>
+                <w:sz w:val="15"/>
+              </w:rPr>
+              <w:t xml:space="preserve"> 12</w:t>
+            </w:r>
+          </w:p>
+          <w:p>
+            <w:pPr>
+              <w:spacing w:after="20"/>
+            </w:pPr>
+            <w:r>
+              <w:rPr>
+                <w:rFonts w:ascii="Georgia" w:hAnsi="Georgia" w:cs="Georgia"/>
+                <w:b/>
+                <w:i w:val="0"/>
+                <w:color w:val="222222"/>
+                <w:sz w:val="15"/>
+              </w:rPr>
+              <w:t>Saves</w:t>
+            </w:r>
+            <w:r>
+              <w:rPr>
+                <w:rFonts w:ascii="Georgia" w:hAnsi="Georgia" w:cs="Georgia"/>
+                <w:b w:val="0"/>
+                <w:i w:val="0"/>
+                <w:color w:val="222222"/>
+                <w:sz w:val="15"/>
+              </w:rPr>
+              <w:t xml:space="preserve"> Dex +4, Wis +4  </w:t>
+            </w:r>
+            <w:r>
+              <w:rPr>
+                <w:rFonts w:ascii="Georgia" w:hAnsi="Georgia" w:cs="Georgia"/>
+                <w:b/>
+                <w:i w:val="0"/>
+                <w:color w:val="222222"/>
+                <w:sz w:val="15"/>
+              </w:rPr>
+              <w:t>Skills</w:t>
+            </w:r>
+            <w:r>
+              <w:rPr>
+                <w:rFonts w:ascii="Georgia" w:hAnsi="Georgia" w:cs="Georgia"/>
+                <w:b w:val="0"/>
+                <w:i w:val="0"/>
+                <w:color w:val="222222"/>
+                <w:sz w:val="15"/>
+              </w:rPr>
+              <w:t xml:space="preserve"> Perception +4, Arcana +2</w:t>
+            </w:r>
+          </w:p>
+          <w:p>
+            <w:pPr>
+              <w:spacing w:after="20"/>
+            </w:pPr>
+            <w:r>
+              <w:rPr>
+                <w:rFonts w:ascii="Georgia" w:hAnsi="Georgia" w:cs="Georgia"/>
+                <w:b/>
+                <w:i w:val="0"/>
+                <w:color w:val="222222"/>
+                <w:sz w:val="15"/>
+              </w:rPr>
+              <w:t>Resist</w:t>
+            </w:r>
+            <w:r>
+              <w:rPr>
+                <w:rFonts w:ascii="Georgia" w:hAnsi="Georgia" w:cs="Georgia"/>
+                <w:b w:val="0"/>
+                <w:i w:val="0"/>
+                <w:color w:val="222222"/>
+                <w:sz w:val="15"/>
+              </w:rPr>
+              <w:t xml:space="preserve"> cold, psychic</w:t>
+            </w:r>
+          </w:p>
+          <w:p>
+            <w:pPr>
+              <w:spacing w:after="20"/>
+            </w:pPr>
+            <w:r>
+              <w:rPr>
+                <w:rFonts w:ascii="Georgia" w:hAnsi="Georgia" w:cs="Georgia"/>
+                <w:b/>
+                <w:i w:val="0"/>
+                <w:color w:val="222222"/>
+                <w:sz w:val="15"/>
+              </w:rPr>
+              <w:t>Senses</w:t>
+            </w:r>
+            <w:r>
+              <w:rPr>
+                <w:rFonts w:ascii="Georgia" w:hAnsi="Georgia" w:cs="Georgia"/>
+                <w:b w:val="0"/>
+                <w:i w:val="0"/>
+                <w:color w:val="222222"/>
+                <w:sz w:val="15"/>
+              </w:rPr>
+              <w:t xml:space="preserve"> darkvision 60 ft, passive Perception 14</w:t>
+            </w:r>
+          </w:p>
+          <w:p>
+            <w:pPr>
+              <w:spacing w:after="20"/>
+            </w:pPr>
+            <w:r>
+              <w:rPr>
+                <w:rFonts w:ascii="Georgia" w:hAnsi="Georgia" w:cs="Georgia"/>
+                <w:b/>
+                <w:i w:val="0"/>
+                <w:color w:val="222222"/>
+                <w:sz w:val="15"/>
+              </w:rPr>
+              <w:t>Languages</w:t>
+            </w:r>
+            <w:r>
+              <w:rPr>
+                <w:rFonts w:ascii="Georgia" w:hAnsi="Georgia" w:cs="Georgia"/>
+                <w:b w:val="0"/>
+                <w:i w:val="0"/>
+                <w:color w:val="222222"/>
+                <w:sz w:val="15"/>
+              </w:rPr>
+              <w:t xml:space="preserve"> telepathy 60 ft (images and feelings)</w:t>
+            </w:r>
+          </w:p>
+          <w:p>
+            <w:pPr>
+              <w:spacing w:after="20"/>
+            </w:pPr>
+            <w:r>
+              <w:rPr>
+                <w:rFonts w:ascii="Georgia" w:hAnsi="Georgia" w:cs="Georgia"/>
+                <w:b/>
+                <w:i w:val="0"/>
+                <w:color w:val="222222"/>
+                <w:sz w:val="15"/>
+              </w:rPr>
+              <w:t>Challenge</w:t>
+            </w:r>
+            <w:r>
+              <w:rPr>
+                <w:rFonts w:ascii="Georgia" w:hAnsi="Georgia" w:cs="Georgia"/>
+                <w:b w:val="0"/>
+                <w:i w:val="0"/>
+                <w:color w:val="222222"/>
+                <w:sz w:val="15"/>
+              </w:rPr>
+              <w:t xml:space="preserve"> 3 (700 XP)</w:t>
+            </w:r>
+          </w:p>
+          <w:p>
+            <w:pPr>
+              <w:keepNext/>
+              <w:spacing w:before="60" w:after="20"/>
+            </w:pPr>
+            <w:r>
+              <w:rPr>
+                <w:rFonts w:ascii="Georgia" w:hAnsi="Georgia" w:cs="Georgia"/>
+                <w:b/>
+                <w:color w:val="8B2020"/>
+                <w:sz w:val="16"/>
+              </w:rPr>
+              <w:t>Actions</w:t>
+            </w:r>
+          </w:p>
+          <w:p>
+            <w:pPr>
+              <w:spacing w:after="20"/>
+            </w:pPr>
+            <w:r>
+              <w:rPr>
+                <w:rFonts w:ascii="Georgia" w:hAnsi="Georgia" w:cs="Georgia"/>
+                <w:b/>
+                <w:i/>
+                <w:color w:val="222222"/>
+                <w:sz w:val="15"/>
+              </w:rPr>
+              <w:t xml:space="preserve">Headache Blast. </w:t>
+            </w:r>
+            <w:r>
+              <w:rPr>
+                <w:rFonts w:ascii="Georgia" w:hAnsi="Georgia" w:cs="Georgia"/>
+                <w:b w:val="0"/>
+                <w:i/>
+                <w:color w:val="222222"/>
+                <w:sz w:val="15"/>
+              </w:rPr>
+              <w:t>Ranged Attack:</w:t>
+            </w:r>
+            <w:r>
+              <w:rPr>
+                <w:rFonts w:ascii="Georgia" w:hAnsi="Georgia" w:cs="Georgia"/>
+                <w:b w:val="0"/>
+                <w:i w:val="0"/>
+                <w:color w:val="222222"/>
+                <w:sz w:val="15"/>
+              </w:rPr>
+              <w:t xml:space="preserve"> +4 to hit, range 30 ft. </w:t>
+            </w:r>
+            <w:r>
+              <w:rPr>
+                <w:rFonts w:ascii="Georgia" w:hAnsi="Georgia" w:cs="Georgia"/>
+                <w:b w:val="0"/>
+                <w:i/>
+                <w:color w:val="222222"/>
+                <w:sz w:val="15"/>
+              </w:rPr>
+              <w:t>Hit:</w:t>
+            </w:r>
+            <w:r>
+              <w:rPr>
+                <w:rFonts w:ascii="Georgia" w:hAnsi="Georgia" w:cs="Georgia"/>
+                <w:b w:val="0"/>
+                <w:i w:val="0"/>
+                <w:color w:val="222222"/>
+                <w:sz w:val="15"/>
+              </w:rPr>
+              <w:t xml:space="preserve"> 2d6 + 2 psychic damage, a crush of pressure inside the mind.</w:t>
+            </w:r>
+          </w:p>
+          <w:p>
+            <w:pPr>
+              <w:spacing w:after="20"/>
+            </w:pPr>
+            <w:r>
+              <w:rPr>
+                <w:rFonts w:ascii="Georgia" w:hAnsi="Georgia" w:cs="Georgia"/>
+                <w:b/>
+                <w:i/>
+                <w:color w:val="222222"/>
+                <w:sz w:val="15"/>
+              </w:rPr>
+              <w:t xml:space="preserve">Water Pulse. </w:t>
+            </w:r>
+            <w:r>
+              <w:rPr>
+                <w:rFonts w:ascii="Georgia" w:hAnsi="Georgia" w:cs="Georgia"/>
+                <w:b w:val="0"/>
+                <w:i/>
+                <w:color w:val="222222"/>
+                <w:sz w:val="15"/>
+              </w:rPr>
+              <w:t>Ranged Attack:</w:t>
+            </w:r>
+            <w:r>
+              <w:rPr>
+                <w:rFonts w:ascii="Georgia" w:hAnsi="Georgia" w:cs="Georgia"/>
+                <w:b w:val="0"/>
+                <w:i w:val="0"/>
+                <w:color w:val="222222"/>
+                <w:sz w:val="15"/>
+              </w:rPr>
+              <w:t xml:space="preserve"> +4 to hit, range 30 ft. </w:t>
+            </w:r>
+            <w:r>
+              <w:rPr>
+                <w:rFonts w:ascii="Georgia" w:hAnsi="Georgia" w:cs="Georgia"/>
+                <w:b w:val="0"/>
+                <w:i/>
+                <w:color w:val="222222"/>
+                <w:sz w:val="15"/>
+              </w:rPr>
+              <w:t>Hit:</w:t>
+            </w:r>
+            <w:r>
+              <w:rPr>
+                <w:rFonts w:ascii="Georgia" w:hAnsi="Georgia" w:cs="Georgia"/>
+                <w:b w:val="0"/>
+                <w:i w:val="0"/>
+                <w:color w:val="222222"/>
+                <w:sz w:val="15"/>
+              </w:rPr>
+              <w:t xml:space="preserve"> 2d6 + 2 bludgeoning damage, and the target must succeed on a DC 12 Strength saving throw or be knocked prone by the crashing wave.</w:t>
+            </w:r>
+          </w:p>
+          <w:p>
+            <w:pPr>
+              <w:spacing w:after="20"/>
+            </w:pPr>
+            <w:r>
+              <w:rPr>
+                <w:rFonts w:ascii="Georgia" w:hAnsi="Georgia" w:cs="Georgia"/>
+                <w:b/>
+                <w:i/>
+                <w:color w:val="222222"/>
+                <w:sz w:val="15"/>
+              </w:rPr>
+              <w:t xml:space="preserve">Confusion Pulse (Recharge 5-6). </w:t>
+            </w:r>
+            <w:r>
+              <w:rPr>
+                <w:rFonts w:ascii="Georgia" w:hAnsi="Georgia" w:cs="Georgia"/>
+                <w:b w:val="0"/>
+                <w:i w:val="0"/>
+                <w:color w:val="222222"/>
+                <w:sz w:val="15"/>
+              </w:rPr>
+              <w:t>A wave of psychic energy in a 15 ft radius. Each creature in the area must succeed on a DC 13 Wisdom saving throw or be confused (as the confusion spell) for 1 minute; repeat the save at the end of each turn.</w:t>
+            </w:r>
+          </w:p>
+          <w:p>
+            <w:pPr>
+              <w:keepNext/>
+              <w:spacing w:before="60" w:after="20"/>
+            </w:pPr>
+            <w:r>
+              <w:rPr>
+                <w:rFonts w:ascii="Georgia" w:hAnsi="Georgia" w:cs="Georgia"/>
+                <w:b/>
+                <w:color w:val="8B2020"/>
+                <w:sz w:val="16"/>
+              </w:rPr>
+              <w:t>Reactions</w:t>
+            </w:r>
+          </w:p>
+          <w:p>
+            <w:pPr>
+              <w:spacing w:after="20"/>
+            </w:pPr>
+            <w:r>
+              <w:rPr>
+                <w:rFonts w:ascii="Georgia" w:hAnsi="Georgia" w:cs="Georgia"/>
+                <w:b/>
+                <w:i/>
+                <w:color w:val="222222"/>
+                <w:sz w:val="15"/>
+              </w:rPr>
+              <w:t xml:space="preserve">Psychic Shield. </w:t>
+            </w:r>
+            <w:r>
+              <w:rPr>
+                <w:rFonts w:ascii="Georgia" w:hAnsi="Georgia" w:cs="Georgia"/>
+                <w:b w:val="0"/>
+                <w:i w:val="0"/>
+                <w:color w:val="222222"/>
+                <w:sz w:val="15"/>
+              </w:rPr>
+              <w:t>When hit by an attack, Cognifin raises a shimmering barrier, gaining +2 AC until the start of its next turn.</w:t>
+            </w:r>
+          </w:p>
+          <w:p>
+            <w:pPr>
+              <w:keepNext/>
+              <w:spacing w:before="60" w:after="20"/>
+            </w:pPr>
+            <w:r>
+              <w:rPr>
+                <w:rFonts w:ascii="Georgia" w:hAnsi="Georgia" w:cs="Georgia"/>
+                <w:b/>
+                <w:color w:val="8B2020"/>
+                <w:sz w:val="16"/>
+              </w:rPr>
+              <w:t>Legendary Actions</w:t>
+            </w:r>
+          </w:p>
+          <w:p>
+            <w:pPr>
+              <w:spacing w:after="20"/>
+            </w:pPr>
+            <w:r>
+              <w:rPr>
+                <w:rFonts w:ascii="Georgia" w:hAnsi="Georgia" w:cs="Georgia"/>
+                <w:b/>
+                <w:i/>
+                <w:color w:val="222222"/>
+                <w:sz w:val="15"/>
+              </w:rPr>
+              <w:t xml:space="preserve">Waters of the Grove. </w:t>
+            </w:r>
+            <w:r>
+              <w:rPr>
+                <w:rFonts w:ascii="Georgia" w:hAnsi="Georgia" w:cs="Georgia"/>
+                <w:b w:val="0"/>
+                <w:i w:val="0"/>
+                <w:color w:val="222222"/>
+                <w:sz w:val="15"/>
+              </w:rPr>
+              <w:t xml:space="preserve">At the end of any hero's turn, Cognifin commands the pond: </w:t>
+            </w:r>
+            <w:r>
+              <w:rPr>
+                <w:rFonts w:ascii="Georgia" w:hAnsi="Georgia" w:cs="Georgia"/>
+                <w:b/>
+                <w:i w:val="0"/>
+                <w:color w:val="222222"/>
+                <w:sz w:val="15"/>
+              </w:rPr>
+              <w:t>Whirlpool</w:t>
+            </w:r>
+            <w:r>
+              <w:rPr>
+                <w:rFonts w:ascii="Georgia" w:hAnsi="Georgia" w:cs="Georgia"/>
+                <w:b w:val="0"/>
+                <w:i w:val="0"/>
+                <w:color w:val="222222"/>
+                <w:sz w:val="15"/>
+              </w:rPr>
+              <w:t xml:space="preserve"> (5 ft radius; DC 12 Strength save or be pulled 10 ft to the center and restrained until the end of its next turn) or </w:t>
+            </w:r>
+            <w:r>
+              <w:rPr>
+                <w:rFonts w:ascii="Georgia" w:hAnsi="Georgia" w:cs="Georgia"/>
+                <w:b/>
+                <w:i w:val="0"/>
+                <w:color w:val="222222"/>
+                <w:sz w:val="15"/>
+              </w:rPr>
+              <w:t>Tidal Wave</w:t>
+            </w:r>
+            <w:r>
+              <w:rPr>
+                <w:rFonts w:ascii="Georgia" w:hAnsi="Georgia" w:cs="Georgia"/>
+                <w:b w:val="0"/>
+                <w:i w:val="0"/>
+                <w:color w:val="222222"/>
+                <w:sz w:val="15"/>
+              </w:rPr>
+              <w:t xml:space="preserve"> (10 ft line; DC 12 Dexterity save or take 2d4 bludgeoning damage and be pushed back 5 ft).</w:t>
+            </w:r>
+          </w:p>
+        </w:tc>
+      </w:tr>
+    </w:tbl>
+    <w:p>
+      <w:pPr>
+        <w:spacing w:after="40"/>
+      </w:pPr>
+    </w:p>
+    <w:p>
+      <w:pPr>
+        <w:spacing w:before="40" w:after="160"/>
+      </w:pPr>
+      <w:r>
+        <w:rPr>
+          <w:rFonts w:ascii="Georgia" w:hAnsi="Georgia" w:cs="Georgia"/>
+          <w:b/>
+          <w:color w:val="8B2020"/>
+          <w:sz w:val="18"/>
+        </w:rPr>
+        <w:t xml:space="preserve">Tactics: </w:t>
       </w:r>
       <w:r>
         <w:rPr>
           <w:rFonts w:ascii="Georgia" w:hAnsi="Georgia" w:cs="Georgia"/>
           <w:b w:val="0"/>
-          <w:i w:val="0"/>
+          <w:i/>
           <w:color w:val="222222"/>
           <w:sz w:val="18"/>
         </w:rPr>
-        <w:t xml:space="preserve"> +5, reach 5 ft., 2d4 + 3 slashing.</w:t>
+        <w:t>It opens with Water Pulse to knock the closest hero prone, peppers the back line with Headache Blasts, and looses Confusion Pulse when the party groups up, while its legendary waters pull heroes into whirlpools or shove them back between turns. Disturbing the pond's surface (a spell, a splash, a well-thrown rock) breaks its focus and silences the waters for a round. The test is stern but never lethal: a hero who drops is washed gently to the bank, stable, and a party that falls or yields wakes at the grove's edge, free to try again once rested.</w:t>
       </w:r>
     </w:p>
     <w:p>
       <w:pPr>
-        <w:pBdr>
-          <w:left w:val="single" w:sz="18" w:space="12" w:color="8B2020"/>
-        </w:pBdr>
-        <w:shd w:val="clear" w:color="auto" w:fill="FCF6F6"/>
-        <w:spacing w:before="30" w:after="70"/>
-        <w:ind w:left="340" w:right="340"/>
+        <w:keepNext/>
+        <w:spacing w:before="320" w:after="20"/>
+        <w:jc w:val="center"/>
       </w:pPr>
       <w:r>
         <w:rPr>
           <w:rFonts w:ascii="Georgia" w:hAnsi="Georgia" w:cs="Georgia"/>
           <w:b/>
-          <w:i w:val="0"/>
-          <w:color w:val="222222"/>
+          <w:color w:val="8B2020"/>
+          <w:sz w:val="26"/>
+        </w:rPr>
+        <w:t>ENEMIES, Fight 4: The Foggy Road</w:t>
+      </w:r>
+    </w:p>
+    <w:p>
+      <w:pPr>
+        <w:keepNext/>
+        <w:spacing w:after="120"/>
+        <w:jc w:val="center"/>
+      </w:pPr>
+      <w:r>
+        <w:rPr>
+          <w:rFonts w:ascii="Georgia" w:hAnsi="Georgia" w:cs="Georgia"/>
+          <w:color w:val="888888"/>
           <w:sz w:val="18"/>
         </w:rPr>
-        <w:t>Fog Cloak (Bonus Action).</w:t>
+        <w:t>The Road to Oakshade ✦ Difficulty: Medium ✦ 2x Mist Stalker</w:t>
+      </w:r>
+    </w:p>
+    <w:tbl>
+      <w:tblPr>
+        <w:tblW w:type="auto" w:w="0"/>
+        <w:jc w:val="center"/>
+        <w:tblLayout w:type="fixed"/>
+        <w:tblLook w:firstColumn="1" w:firstRow="1" w:lastColumn="0" w:lastRow="0" w:noHBand="0" w:noVBand="1" w:val="04A0"/>
+        <w:tblCellMar>
+          <w:left w:w="110" w:type="dxa"/>
+          <w:right w:w="110" w:type="dxa"/>
+          <w:top w:w="60" w:type="dxa"/>
+          <w:bottom w:w="80" w:type="dxa"/>
+        </w:tblCellMar>
+        <w:tblBorders>
+          <w:top w:val="single" w:sz="8" w:space="0" w:color="8B2020"/>
+          <w:left w:val="single" w:sz="8" w:space="0" w:color="8B2020"/>
+          <w:bottom w:val="single" w:sz="8" w:space="0" w:color="8B2020"/>
+          <w:right w:val="single" w:sz="8" w:space="0" w:color="8B2020"/>
+          <w:insideH w:val="single" w:sz="8" w:space="0" w:color="8B2020"/>
+          <w:insideV w:val="single" w:sz="8" w:space="0" w:color="8B2020"/>
+        </w:tblBorders>
+      </w:tblPr>
+      <w:tblGrid>
+        <w:gridCol w:w="9360"/>
+      </w:tblGrid>
+      <w:tr>
+        <w:trPr>
+          <w:cantSplit/>
+        </w:trPr>
+        <w:tc>
+          <w:tcPr>
+            <w:tcW w:type="dxa" w:w="9072"/>
+          </w:tcPr>
+          <w:p>
+            <w:pPr>
+              <w:shd w:val="clear" w:color="auto" w:fill="8B2020"/>
+              <w:spacing w:before="0" w:after="20"/>
+            </w:pPr>
+            <w:r>
+              <w:rPr>
+                <w:rFonts w:ascii="Georgia" w:hAnsi="Georgia" w:cs="Georgia"/>
+                <w:b/>
+                <w:color w:val="FFFFFF"/>
+                <w:sz w:val="22"/>
+              </w:rPr>
+              <w:t>MIST STALKER</w:t>
+            </w:r>
+          </w:p>
+          <w:p>
+            <w:pPr>
+              <w:spacing w:after="40"/>
+            </w:pPr>
+            <w:r>
+              <w:rPr>
+                <w:rFonts w:ascii="Georgia" w:hAnsi="Georgia" w:cs="Georgia"/>
+                <w:i/>
+                <w:color w:val="8B2020"/>
+                <w:sz w:val="16"/>
+              </w:rPr>
+              <w:t>Medium fey (Feywild), unaligned ✦ CR 2 (450 XP) ✦ 2 in the ambush</w:t>
+            </w:r>
+          </w:p>
+          <w:p>
+            <w:pPr>
+              <w:spacing w:after="60"/>
+              <w:jc w:val="center"/>
+            </w:pPr>
+            <w:r>
+              <w:drawing>
+                <wp:inline xmlns:a="http://schemas.openxmlformats.org/drawingml/2006/main" xmlns:pic="http://schemas.openxmlformats.org/drawingml/2006/picture">
+                  <wp:extent cx="2926080" cy="2926080"/>
+                  <wp:docPr id="17" name="Picture 17"/>
+                  <wp:cNvGraphicFramePr>
+                    <a:graphicFrameLocks noChangeAspect="1"/>
+                  </wp:cNvGraphicFramePr>
+                  <a:graphic>
+                    <a:graphicData uri="http://schemas.openxmlformats.org/drawingml/2006/picture">
+                      <pic:pic>
+                        <pic:nvPicPr>
+                          <pic:cNvPr id="0" name="image.jpg"/>
+                          <pic:cNvPicPr/>
+                        </pic:nvPicPr>
+                        <pic:blipFill>
+                          <a:blip r:embed="rId25"/>
+                          <a:stretch>
+                            <a:fillRect/>
+                          </a:stretch>
+                        </pic:blipFill>
+                        <pic:spPr>
+                          <a:xfrm>
+                            <a:off x="0" y="0"/>
+                            <a:ext cx="2926080" cy="2926080"/>
+                          </a:xfrm>
+                          <a:prstGeom prst="rect"/>
+                        </pic:spPr>
+                      </pic:pic>
+                    </a:graphicData>
+                  </a:graphic>
+                </wp:inline>
+              </w:drawing>
+            </w:r>
+          </w:p>
+          <w:p>
+            <w:pPr>
+              <w:spacing w:after="20"/>
+            </w:pPr>
+            <w:r>
+              <w:rPr>
+                <w:rFonts w:ascii="Georgia" w:hAnsi="Georgia" w:cs="Georgia"/>
+                <w:b/>
+                <w:i w:val="0"/>
+                <w:color w:val="222222"/>
+                <w:sz w:val="15"/>
+              </w:rPr>
+              <w:t>AC</w:t>
+            </w:r>
+            <w:r>
+              <w:rPr>
+                <w:rFonts w:ascii="Georgia" w:hAnsi="Georgia" w:cs="Georgia"/>
+                <w:b w:val="0"/>
+                <w:i w:val="0"/>
+                <w:color w:val="222222"/>
+                <w:sz w:val="15"/>
+              </w:rPr>
+              <w:t xml:space="preserve"> 13  </w:t>
+            </w:r>
+            <w:r>
+              <w:rPr>
+                <w:rFonts w:ascii="Georgia" w:hAnsi="Georgia" w:cs="Georgia"/>
+                <w:b/>
+                <w:i w:val="0"/>
+                <w:color w:val="222222"/>
+                <w:sz w:val="15"/>
+              </w:rPr>
+              <w:t>HP</w:t>
+            </w:r>
+            <w:r>
+              <w:rPr>
+                <w:rFonts w:ascii="Georgia" w:hAnsi="Georgia" w:cs="Georgia"/>
+                <w:b w:val="0"/>
+                <w:i w:val="0"/>
+                <w:color w:val="222222"/>
+                <w:sz w:val="15"/>
+              </w:rPr>
+              <w:t xml:space="preserve"> 39 (6d8 + 12)  </w:t>
+            </w:r>
+            <w:r>
+              <w:rPr>
+                <w:rFonts w:ascii="Georgia" w:hAnsi="Georgia" w:cs="Georgia"/>
+                <w:b/>
+                <w:i w:val="0"/>
+                <w:color w:val="222222"/>
+                <w:sz w:val="15"/>
+              </w:rPr>
+              <w:t>Speed</w:t>
+            </w:r>
+            <w:r>
+              <w:rPr>
+                <w:rFonts w:ascii="Georgia" w:hAnsi="Georgia" w:cs="Georgia"/>
+                <w:b w:val="0"/>
+                <w:i w:val="0"/>
+                <w:color w:val="222222"/>
+                <w:sz w:val="15"/>
+              </w:rPr>
+              <w:t xml:space="preserve"> 40 ft</w:t>
+            </w:r>
+          </w:p>
+          <w:p>
+            <w:pPr>
+              <w:spacing w:after="20"/>
+            </w:pPr>
+            <w:r>
+              <w:rPr>
+                <w:rFonts w:ascii="Georgia" w:hAnsi="Georgia" w:cs="Georgia"/>
+                <w:b/>
+                <w:i w:val="0"/>
+                <w:color w:val="222222"/>
+                <w:sz w:val="15"/>
+              </w:rPr>
+              <w:t>STR</w:t>
+            </w:r>
+            <w:r>
+              <w:rPr>
+                <w:rFonts w:ascii="Georgia" w:hAnsi="Georgia" w:cs="Georgia"/>
+                <w:b w:val="0"/>
+                <w:i w:val="0"/>
+                <w:color w:val="222222"/>
+                <w:sz w:val="15"/>
+              </w:rPr>
+              <w:t xml:space="preserve"> 14  </w:t>
+            </w:r>
+            <w:r>
+              <w:rPr>
+                <w:rFonts w:ascii="Georgia" w:hAnsi="Georgia" w:cs="Georgia"/>
+                <w:b/>
+                <w:i w:val="0"/>
+                <w:color w:val="222222"/>
+                <w:sz w:val="15"/>
+              </w:rPr>
+              <w:t>DEX</w:t>
+            </w:r>
+            <w:r>
+              <w:rPr>
+                <w:rFonts w:ascii="Georgia" w:hAnsi="Georgia" w:cs="Georgia"/>
+                <w:b w:val="0"/>
+                <w:i w:val="0"/>
+                <w:color w:val="222222"/>
+                <w:sz w:val="15"/>
+              </w:rPr>
+              <w:t xml:space="preserve"> 16  </w:t>
+            </w:r>
+            <w:r>
+              <w:rPr>
+                <w:rFonts w:ascii="Georgia" w:hAnsi="Georgia" w:cs="Georgia"/>
+                <w:b/>
+                <w:i w:val="0"/>
+                <w:color w:val="222222"/>
+                <w:sz w:val="15"/>
+              </w:rPr>
+              <w:t>CON</w:t>
+            </w:r>
+            <w:r>
+              <w:rPr>
+                <w:rFonts w:ascii="Georgia" w:hAnsi="Georgia" w:cs="Georgia"/>
+                <w:b w:val="0"/>
+                <w:i w:val="0"/>
+                <w:color w:val="222222"/>
+                <w:sz w:val="15"/>
+              </w:rPr>
+              <w:t xml:space="preserve"> 14  </w:t>
+            </w:r>
+            <w:r>
+              <w:rPr>
+                <w:rFonts w:ascii="Georgia" w:hAnsi="Georgia" w:cs="Georgia"/>
+                <w:b/>
+                <w:i w:val="0"/>
+                <w:color w:val="222222"/>
+                <w:sz w:val="15"/>
+              </w:rPr>
+              <w:t>INT</w:t>
+            </w:r>
+            <w:r>
+              <w:rPr>
+                <w:rFonts w:ascii="Georgia" w:hAnsi="Georgia" w:cs="Georgia"/>
+                <w:b w:val="0"/>
+                <w:i w:val="0"/>
+                <w:color w:val="222222"/>
+                <w:sz w:val="15"/>
+              </w:rPr>
+              <w:t xml:space="preserve"> 6  </w:t>
+            </w:r>
+            <w:r>
+              <w:rPr>
+                <w:rFonts w:ascii="Georgia" w:hAnsi="Georgia" w:cs="Georgia"/>
+                <w:b/>
+                <w:i w:val="0"/>
+                <w:color w:val="222222"/>
+                <w:sz w:val="15"/>
+              </w:rPr>
+              <w:t>WIS</w:t>
+            </w:r>
+            <w:r>
+              <w:rPr>
+                <w:rFonts w:ascii="Georgia" w:hAnsi="Georgia" w:cs="Georgia"/>
+                <w:b w:val="0"/>
+                <w:i w:val="0"/>
+                <w:color w:val="222222"/>
+                <w:sz w:val="15"/>
+              </w:rPr>
+              <w:t xml:space="preserve"> 12  </w:t>
+            </w:r>
+            <w:r>
+              <w:rPr>
+                <w:rFonts w:ascii="Georgia" w:hAnsi="Georgia" w:cs="Georgia"/>
+                <w:b/>
+                <w:i w:val="0"/>
+                <w:color w:val="222222"/>
+                <w:sz w:val="15"/>
+              </w:rPr>
+              <w:t>CHA</w:t>
+            </w:r>
+            <w:r>
+              <w:rPr>
+                <w:rFonts w:ascii="Georgia" w:hAnsi="Georgia" w:cs="Georgia"/>
+                <w:b w:val="0"/>
+                <w:i w:val="0"/>
+                <w:color w:val="222222"/>
+                <w:sz w:val="15"/>
+              </w:rPr>
+              <w:t xml:space="preserve"> 8</w:t>
+            </w:r>
+          </w:p>
+          <w:p>
+            <w:pPr>
+              <w:spacing w:after="20"/>
+            </w:pPr>
+            <w:r>
+              <w:rPr>
+                <w:rFonts w:ascii="Georgia" w:hAnsi="Georgia" w:cs="Georgia"/>
+                <w:b/>
+                <w:i w:val="0"/>
+                <w:color w:val="222222"/>
+                <w:sz w:val="15"/>
+              </w:rPr>
+              <w:t>Skills</w:t>
+            </w:r>
+            <w:r>
+              <w:rPr>
+                <w:rFonts w:ascii="Georgia" w:hAnsi="Georgia" w:cs="Georgia"/>
+                <w:b w:val="0"/>
+                <w:i w:val="0"/>
+                <w:color w:val="222222"/>
+                <w:sz w:val="15"/>
+              </w:rPr>
+              <w:t xml:space="preserve"> Perception +3, Stealth +5</w:t>
+            </w:r>
+          </w:p>
+          <w:p>
+            <w:pPr>
+              <w:spacing w:after="20"/>
+            </w:pPr>
+            <w:r>
+              <w:rPr>
+                <w:rFonts w:ascii="Georgia" w:hAnsi="Georgia" w:cs="Georgia"/>
+                <w:b/>
+                <w:i w:val="0"/>
+                <w:color w:val="222222"/>
+                <w:sz w:val="15"/>
+              </w:rPr>
+              <w:t>Senses</w:t>
+            </w:r>
+            <w:r>
+              <w:rPr>
+                <w:rFonts w:ascii="Georgia" w:hAnsi="Georgia" w:cs="Georgia"/>
+                <w:b w:val="0"/>
+                <w:i w:val="0"/>
+                <w:color w:val="222222"/>
+                <w:sz w:val="15"/>
+              </w:rPr>
+              <w:t xml:space="preserve"> darkvision 60 ft, passive Perception 13</w:t>
+            </w:r>
+          </w:p>
+          <w:p>
+            <w:pPr>
+              <w:spacing w:after="20"/>
+            </w:pPr>
+            <w:r>
+              <w:rPr>
+                <w:rFonts w:ascii="Georgia" w:hAnsi="Georgia" w:cs="Georgia"/>
+                <w:b/>
+                <w:i w:val="0"/>
+                <w:color w:val="222222"/>
+                <w:sz w:val="15"/>
+              </w:rPr>
+              <w:t>Challenge</w:t>
+            </w:r>
+            <w:r>
+              <w:rPr>
+                <w:rFonts w:ascii="Georgia" w:hAnsi="Georgia" w:cs="Georgia"/>
+                <w:b w:val="0"/>
+                <w:i w:val="0"/>
+                <w:color w:val="222222"/>
+                <w:sz w:val="15"/>
+              </w:rPr>
+              <w:t xml:space="preserve"> 2 (450 XP)</w:t>
+            </w:r>
+          </w:p>
+          <w:p>
+            <w:pPr>
+              <w:keepNext/>
+              <w:spacing w:before="60" w:after="20"/>
+            </w:pPr>
+            <w:r>
+              <w:rPr>
+                <w:rFonts w:ascii="Georgia" w:hAnsi="Georgia" w:cs="Georgia"/>
+                <w:b/>
+                <w:color w:val="8B2020"/>
+                <w:sz w:val="16"/>
+              </w:rPr>
+              <w:t>Traits</w:t>
+            </w:r>
+          </w:p>
+          <w:p>
+            <w:pPr>
+              <w:spacing w:after="20"/>
+            </w:pPr>
+            <w:r>
+              <w:rPr>
+                <w:rFonts w:ascii="Georgia" w:hAnsi="Georgia" w:cs="Georgia"/>
+                <w:b/>
+                <w:i/>
+                <w:color w:val="222222"/>
+                <w:sz w:val="15"/>
+              </w:rPr>
+              <w:t xml:space="preserve">Fog Cloak (Bonus Action). </w:t>
+            </w:r>
+            <w:r>
+              <w:rPr>
+                <w:rFonts w:ascii="Georgia" w:hAnsi="Georgia" w:cs="Georgia"/>
+                <w:b w:val="0"/>
+                <w:i w:val="0"/>
+                <w:color w:val="222222"/>
+                <w:sz w:val="15"/>
+              </w:rPr>
+              <w:t>The stalker wraps itself in mist, becoming heavily obscured until the start of its next turn.</w:t>
+            </w:r>
+          </w:p>
+          <w:p>
+            <w:pPr>
+              <w:keepNext/>
+              <w:spacing w:before="60" w:after="20"/>
+            </w:pPr>
+            <w:r>
+              <w:rPr>
+                <w:rFonts w:ascii="Georgia" w:hAnsi="Georgia" w:cs="Georgia"/>
+                <w:b/>
+                <w:color w:val="8B2020"/>
+                <w:sz w:val="16"/>
+              </w:rPr>
+              <w:t>Actions</w:t>
+            </w:r>
+          </w:p>
+          <w:p>
+            <w:pPr>
+              <w:spacing w:after="20"/>
+            </w:pPr>
+            <w:r>
+              <w:rPr>
+                <w:rFonts w:ascii="Georgia" w:hAnsi="Georgia" w:cs="Georgia"/>
+                <w:b/>
+                <w:i/>
+                <w:color w:val="222222"/>
+                <w:sz w:val="15"/>
+              </w:rPr>
+              <w:t xml:space="preserve">Multiattack. </w:t>
+            </w:r>
+            <w:r>
+              <w:rPr>
+                <w:rFonts w:ascii="Georgia" w:hAnsi="Georgia" w:cs="Georgia"/>
+                <w:b w:val="0"/>
+                <w:i w:val="0"/>
+                <w:color w:val="222222"/>
+                <w:sz w:val="15"/>
+              </w:rPr>
+              <w:t>The mist stalker makes one bite attack and one claw attack.</w:t>
+            </w:r>
+          </w:p>
+          <w:p>
+            <w:pPr>
+              <w:spacing w:after="20"/>
+            </w:pPr>
+            <w:r>
+              <w:rPr>
+                <w:rFonts w:ascii="Georgia" w:hAnsi="Georgia" w:cs="Georgia"/>
+                <w:b/>
+                <w:i/>
+                <w:color w:val="222222"/>
+                <w:sz w:val="15"/>
+              </w:rPr>
+              <w:t xml:space="preserve">Bite. </w:t>
+            </w:r>
+            <w:r>
+              <w:rPr>
+                <w:rFonts w:ascii="Georgia" w:hAnsi="Georgia" w:cs="Georgia"/>
+                <w:b w:val="0"/>
+                <w:i/>
+                <w:color w:val="222222"/>
+                <w:sz w:val="15"/>
+              </w:rPr>
+              <w:t>Melee Attack:</w:t>
+            </w:r>
+            <w:r>
+              <w:rPr>
+                <w:rFonts w:ascii="Georgia" w:hAnsi="Georgia" w:cs="Georgia"/>
+                <w:b w:val="0"/>
+                <w:i w:val="0"/>
+                <w:color w:val="222222"/>
+                <w:sz w:val="15"/>
+              </w:rPr>
+              <w:t xml:space="preserve"> +5 to hit, reach 5 ft. </w:t>
+            </w:r>
+            <w:r>
+              <w:rPr>
+                <w:rFonts w:ascii="Georgia" w:hAnsi="Georgia" w:cs="Georgia"/>
+                <w:b w:val="0"/>
+                <w:i/>
+                <w:color w:val="222222"/>
+                <w:sz w:val="15"/>
+              </w:rPr>
+              <w:t>Hit:</w:t>
+            </w:r>
+            <w:r>
+              <w:rPr>
+                <w:rFonts w:ascii="Georgia" w:hAnsi="Georgia" w:cs="Georgia"/>
+                <w:b w:val="0"/>
+                <w:i w:val="0"/>
+                <w:color w:val="222222"/>
+                <w:sz w:val="15"/>
+              </w:rPr>
+              <w:t xml:space="preserve"> 1d8 + 3 piercing damage.</w:t>
+            </w:r>
+          </w:p>
+          <w:p>
+            <w:pPr>
+              <w:spacing w:after="20"/>
+            </w:pPr>
+            <w:r>
+              <w:rPr>
+                <w:rFonts w:ascii="Georgia" w:hAnsi="Georgia" w:cs="Georgia"/>
+                <w:b/>
+                <w:i/>
+                <w:color w:val="222222"/>
+                <w:sz w:val="15"/>
+              </w:rPr>
+              <w:t xml:space="preserve">Claw. </w:t>
+            </w:r>
+            <w:r>
+              <w:rPr>
+                <w:rFonts w:ascii="Georgia" w:hAnsi="Georgia" w:cs="Georgia"/>
+                <w:b w:val="0"/>
+                <w:i/>
+                <w:color w:val="222222"/>
+                <w:sz w:val="15"/>
+              </w:rPr>
+              <w:t>Melee Attack:</w:t>
+            </w:r>
+            <w:r>
+              <w:rPr>
+                <w:rFonts w:ascii="Georgia" w:hAnsi="Georgia" w:cs="Georgia"/>
+                <w:b w:val="0"/>
+                <w:i w:val="0"/>
+                <w:color w:val="222222"/>
+                <w:sz w:val="15"/>
+              </w:rPr>
+              <w:t xml:space="preserve"> +5 to hit, reach 5 ft. </w:t>
+            </w:r>
+            <w:r>
+              <w:rPr>
+                <w:rFonts w:ascii="Georgia" w:hAnsi="Georgia" w:cs="Georgia"/>
+                <w:b w:val="0"/>
+                <w:i/>
+                <w:color w:val="222222"/>
+                <w:sz w:val="15"/>
+              </w:rPr>
+              <w:t>Hit:</w:t>
+            </w:r>
+            <w:r>
+              <w:rPr>
+                <w:rFonts w:ascii="Georgia" w:hAnsi="Georgia" w:cs="Georgia"/>
+                <w:b w:val="0"/>
+                <w:i w:val="0"/>
+                <w:color w:val="222222"/>
+                <w:sz w:val="15"/>
+              </w:rPr>
+              <w:t xml:space="preserve"> 2d4 + 3 slashing damage.</w:t>
+            </w:r>
+          </w:p>
+          <w:p>
+            <w:pPr>
+              <w:spacing w:after="20"/>
+            </w:pPr>
+            <w:r>
+              <w:rPr>
+                <w:rFonts w:ascii="Georgia" w:hAnsi="Georgia" w:cs="Georgia"/>
+                <w:b/>
+                <w:i/>
+                <w:color w:val="222222"/>
+                <w:sz w:val="15"/>
+              </w:rPr>
+              <w:t xml:space="preserve">Howl of the Mist (Recharge 5-6). </w:t>
+            </w:r>
+            <w:r>
+              <w:rPr>
+                <w:rFonts w:ascii="Georgia" w:hAnsi="Georgia" w:cs="Georgia"/>
+                <w:b w:val="0"/>
+                <w:i w:val="0"/>
+                <w:color w:val="222222"/>
+                <w:sz w:val="15"/>
+              </w:rPr>
+              <w:t>A howl rolls through the fog from every direction at once. Each enemy within 30 ft must succeed on a DC 13 Wisdom saving throw or be frightened until the end of the stalker's next turn.</w:t>
+            </w:r>
+          </w:p>
+        </w:tc>
+      </w:tr>
+    </w:tbl>
+    <w:p>
+      <w:pPr>
+        <w:spacing w:after="40"/>
+      </w:pPr>
+    </w:p>
+    <w:p>
+      <w:pPr>
+        <w:spacing w:before="40" w:after="160"/>
+      </w:pPr>
+      <w:r>
+        <w:rPr>
+          <w:rFonts w:ascii="Georgia" w:hAnsi="Georgia" w:cs="Georgia"/>
+          <w:b/>
+          <w:color w:val="8B2020"/>
+          <w:sz w:val="18"/>
+        </w:rPr>
+        <w:t xml:space="preserve">Tactics: </w:t>
       </w:r>
       <w:r>
         <w:rPr>
           <w:rFonts w:ascii="Georgia" w:hAnsi="Georgia" w:cs="Georgia"/>
           <w:b w:val="0"/>
-          <w:i w:val="0"/>
+          <w:i/>
           <w:color w:val="222222"/>
           <w:sz w:val="18"/>
         </w:rPr>
-        <w:t xml:space="preserve"> Wraps itself in mist: heavily obscured until the start of its next turn.</w:t>
-      </w:r>
-    </w:p>
-    <w:p>
-      <w:pPr>
-        <w:pBdr>
-          <w:left w:val="single" w:sz="18" w:space="12" w:color="8B2020"/>
-        </w:pBdr>
-        <w:shd w:val="clear" w:color="auto" w:fill="FCF6F6"/>
-        <w:spacing w:before="30" w:after="70"/>
-        <w:ind w:left="340" w:right="340"/>
-      </w:pPr>
-      <w:r>
-        <w:rPr>
-          <w:rFonts w:ascii="Georgia" w:hAnsi="Georgia" w:cs="Georgia"/>
-          <w:b/>
-          <w:i w:val="0"/>
-          <w:color w:val="222222"/>
-          <w:sz w:val="18"/>
-        </w:rPr>
-        <w:t>Howl of the Mist (Recharge 5-6).</w:t>
-      </w:r>
-      <w:r>
-        <w:rPr>
-          <w:rFonts w:ascii="Georgia" w:hAnsi="Georgia" w:cs="Georgia"/>
-          <w:b w:val="0"/>
-          <w:i w:val="0"/>
-          <w:color w:val="222222"/>
-          <w:sz w:val="18"/>
-        </w:rPr>
-        <w:t xml:space="preserve"> Each enemy within 30 ft.: DC 13 Wisdom save or frightened until the end of the stalker's next turn.</w:t>
+        <w:t>Each stalker wraps itself in Fog Cloak and strikes from heavy obscurement, and their howls hunt for frightened, scattered prey. They will not leave their fog: heroes who regain the road and keep moving escape them, and a strong wind or a gust of magic that thins the mist steals their cover and their nerve. Two motes of fey energy glimmer where they fall.</w:t>
       </w:r>
     </w:p>
     <w:sectPr>

</xml_diff>

<commit_message>
Multi-type encounters sit side by side (DM directive)
- enemy_cards supports up to 3 columns
- S1 bar brawl: Bren + Tavern Regular paired
- S5 hold fight: Golem + Corsair + Engineer as a 3-up spread

Co-Authored-By: Claude Opus 4.8 <noreply@anthropic.com>
</commit_message>
<xml_diff>
--- a/sessions/session_01_gathering_of_friends.docx
+++ b/sessions/session_01_gathering_of_friends.docx
@@ -4374,7 +4374,8 @@
         </w:tblBorders>
       </w:tblPr>
       <w:tblGrid>
-        <w:gridCol w:w="9360"/>
+        <w:gridCol w:w="4680"/>
+        <w:gridCol w:w="4680"/>
       </w:tblGrid>
       <w:tr>
         <w:trPr>
@@ -4382,7 +4383,7 @@
         </w:trPr>
         <w:tc>
           <w:tcPr>
-            <w:tcW w:type="dxa" w:w="9072"/>
+            <w:tcW w:type="dxa" w:w="4536"/>
           </w:tcPr>
           <w:p>
             <w:pPr>
@@ -4589,44 +4590,9 @@
             </w:r>
           </w:p>
         </w:tc>
-      </w:tr>
-    </w:tbl>
-    <w:p>
-      <w:pPr>
-        <w:spacing w:after="40"/>
-      </w:pPr>
-    </w:p>
-    <w:tbl>
-      <w:tblPr>
-        <w:tblW w:type="auto" w:w="0"/>
-        <w:jc w:val="center"/>
-        <w:tblLayout w:type="fixed"/>
-        <w:tblLook w:firstColumn="1" w:firstRow="1" w:lastColumn="0" w:lastRow="0" w:noHBand="0" w:noVBand="1" w:val="04A0"/>
-        <w:tblCellMar>
-          <w:left w:w="110" w:type="dxa"/>
-          <w:right w:w="110" w:type="dxa"/>
-          <w:top w:w="60" w:type="dxa"/>
-          <w:bottom w:w="80" w:type="dxa"/>
-        </w:tblCellMar>
-        <w:tblBorders>
-          <w:top w:val="single" w:sz="8" w:space="0" w:color="8B2020"/>
-          <w:left w:val="single" w:sz="8" w:space="0" w:color="8B2020"/>
-          <w:bottom w:val="single" w:sz="8" w:space="0" w:color="8B2020"/>
-          <w:right w:val="single" w:sz="8" w:space="0" w:color="8B2020"/>
-          <w:insideH w:val="single" w:sz="8" w:space="0" w:color="8B2020"/>
-          <w:insideV w:val="single" w:sz="8" w:space="0" w:color="8B2020"/>
-        </w:tblBorders>
-      </w:tblPr>
-      <w:tblGrid>
-        <w:gridCol w:w="9360"/>
-      </w:tblGrid>
-      <w:tr>
-        <w:trPr>
-          <w:cantSplit/>
-        </w:trPr>
         <w:tc>
           <w:tcPr>
-            <w:tcW w:type="dxa" w:w="9072"/>
+            <w:tcW w:type="dxa" w:w="4536"/>
           </w:tcPr>
           <w:p>
             <w:pPr>

</xml_diff>

<commit_message>
Lore of Elaria fragments placed across Sessions 1-6
18 world-history fragments from lore/world_history.md dropped onto
art-heavy pages, each matched to its page's subject: creation myths
at the forest and stone circle, the Warden's price after her vision,
Maldrith named for the reader at the dark-figure page, the bells'
origin beside Faelan's tale, the Gilded Curtain facing the Old
Theater, the Old Shrine hook closing Session 6.

Co-Authored-By: Claude Opus 4.8 <noreply@anthropic.com>
</commit_message>
<xml_diff>
--- a/sessions/session_01_gathering_of_friends.docx
+++ b/sessions/session_01_gathering_of_friends.docx
@@ -1309,6 +1309,54 @@
     </w:p>
     <w:p>
       <w:pPr>
+        <w:keepNext/>
+        <w:spacing w:before="200" w:after="20"/>
+        <w:ind w:left="500" w:right="500"/>
+        <w:pBdr>
+          <w:top w:val="double" w:sz="6" w:space="4" w:color="1F4D78"/>
+        </w:pBdr>
+      </w:pPr>
+      <w:r>
+        <w:rPr>
+          <w:rFonts w:ascii="Georgia" w:hAnsi="Georgia" w:cs="Georgia"/>
+          <w:b/>
+          <w:color w:val="1F4D78"/>
+          <w:sz w:val="16"/>
+        </w:rPr>
+        <w:t xml:space="preserve">✦ LORE OF ELARIA ✦  </w:t>
+      </w:r>
+      <w:r>
+        <w:rPr>
+          <w:rFonts w:ascii="Georgia" w:hAnsi="Georgia" w:cs="Georgia"/>
+          <w:b/>
+          <w:color w:val="1F4D78"/>
+          <w:sz w:val="19"/>
+        </w:rPr>
+        <w:t>The Whispering Breeze Monastery</w:t>
+      </w:r>
+    </w:p>
+    <w:p>
+      <w:pPr>
+        <w:keepLines/>
+        <w:spacing w:before="20" w:after="200"/>
+        <w:ind w:left="500" w:right="500"/>
+        <w:pBdr>
+          <w:bottom w:val="double" w:sz="6" w:space="4" w:color="1F4D78"/>
+        </w:pBdr>
+      </w:pPr>
+      <w:r>
+        <w:rPr>
+          <w:rFonts w:ascii="Georgia" w:hAnsi="Georgia" w:cs="Georgia"/>
+          <w:b w:val="0"/>
+          <w:i/>
+          <w:color w:val="222222"/>
+          <w:sz w:val="19"/>
+        </w:rPr>
+        <w:t>High in the passes stands a monastery whose monks study the oldest wind, the one that has been circling the world since the Weaving. They say every storm is just that wind remembering something. Their teaching is short: when the whole world is screaming, get still.</w:t>
+      </w:r>
+    </w:p>
+    <w:p>
+      <w:pPr>
         <w:spacing w:after="0" w:before="0"/>
       </w:pPr>
       <w:r>
@@ -2254,6 +2302,54 @@
       </w:r>
     </w:p>
     <w:p>
+      <w:pPr>
+        <w:keepNext/>
+        <w:spacing w:before="200" w:after="20"/>
+        <w:ind w:left="500" w:right="500"/>
+        <w:pBdr>
+          <w:top w:val="double" w:sz="6" w:space="4" w:color="1F4D78"/>
+        </w:pBdr>
+      </w:pPr>
+      <w:r>
+        <w:rPr>
+          <w:rFonts w:ascii="Georgia" w:hAnsi="Georgia" w:cs="Georgia"/>
+          <w:b/>
+          <w:color w:val="1F4D78"/>
+          <w:sz w:val="16"/>
+        </w:rPr>
+        <w:t xml:space="preserve">✦ LORE OF ELARIA ✦  </w:t>
+      </w:r>
+      <w:r>
+        <w:rPr>
+          <w:rFonts w:ascii="Georgia" w:hAnsi="Georgia" w:cs="Georgia"/>
+          <w:b/>
+          <w:color w:val="1F4D78"/>
+          <w:sz w:val="19"/>
+        </w:rPr>
+        <w:t>The First Listeners</w:t>
+      </w:r>
+    </w:p>
+    <w:p>
+      <w:pPr>
+        <w:keepLines/>
+        <w:spacing w:before="20" w:after="200"/>
+        <w:ind w:left="500" w:right="500"/>
+        <w:pBdr>
+          <w:bottom w:val="double" w:sz="6" w:space="4" w:color="1F4D78"/>
+        </w:pBdr>
+      </w:pPr>
+      <w:r>
+        <w:rPr>
+          <w:rFonts w:ascii="Georgia" w:hAnsi="Georgia" w:cs="Georgia"/>
+          <w:b w:val="0"/>
+          <w:i/>
+          <w:color w:val="222222"/>
+          <w:sz w:val="19"/>
+        </w:rPr>
+        <w:t>Before there were villages there were listeners. The first druids did not learn magic; they learned quiet, and the forests, glad of the company, taught them the rest. The Circle of the Eternal Stars still opens every gathering with a full minute of silence, in honor of the age when that was the whole religion.</w:t>
+      </w:r>
+    </w:p>
+    <w:p>
       <w:r>
         <w:br w:type="page"/>
       </w:r>
@@ -2998,6 +3094,54 @@
           <w:sz w:val="21"/>
         </w:rPr>
         <w:t>who is opening the doors between worlds?</w:t>
+      </w:r>
+    </w:p>
+    <w:p>
+      <w:pPr>
+        <w:keepNext/>
+        <w:spacing w:before="200" w:after="20"/>
+        <w:ind w:left="500" w:right="500"/>
+        <w:pBdr>
+          <w:top w:val="double" w:sz="6" w:space="4" w:color="1F4D78"/>
+        </w:pBdr>
+      </w:pPr>
+      <w:r>
+        <w:rPr>
+          <w:rFonts w:ascii="Georgia" w:hAnsi="Georgia" w:cs="Georgia"/>
+          <w:b/>
+          <w:color w:val="1F4D78"/>
+          <w:sz w:val="16"/>
+        </w:rPr>
+        <w:t xml:space="preserve">✦ LORE OF ELARIA ✦  </w:t>
+      </w:r>
+      <w:r>
+        <w:rPr>
+          <w:rFonts w:ascii="Georgia" w:hAnsi="Georgia" w:cs="Georgia"/>
+          <w:b/>
+          <w:color w:val="1F4D78"/>
+          <w:sz w:val="19"/>
+        </w:rPr>
+        <w:t>Motes</w:t>
+      </w:r>
+    </w:p>
+    <w:p>
+      <w:pPr>
+        <w:keepLines/>
+        <w:spacing w:before="20" w:after="200"/>
+        <w:ind w:left="500" w:right="500"/>
+        <w:pBdr>
+          <w:bottom w:val="double" w:sz="6" w:space="4" w:color="1F4D78"/>
+        </w:pBdr>
+      </w:pPr>
+      <w:r>
+        <w:rPr>
+          <w:rFonts w:ascii="Georgia" w:hAnsi="Georgia" w:cs="Georgia"/>
+          <w:b w:val="0"/>
+          <w:i/>
+          <w:color w:val="222222"/>
+          <w:sz w:val="19"/>
+        </w:rPr>
+        <w:t>A mote is a crumb of another world, and the world it lands in treats it the way a pond treats a dropped lantern: strange light, strange ripples, and every fish in the pond suddenly having opinions. The wondrous creatures of the chronicle, the talking, glowing, impossible ones, are what happens when the ripples reach something alive.</w:t>
       </w:r>
     </w:p>
     <w:p>
@@ -4833,6 +4977,54 @@
     <w:p>
       <w:pPr>
         <w:keepNext/>
+        <w:spacing w:before="200" w:after="20"/>
+        <w:ind w:left="500" w:right="500"/>
+        <w:pBdr>
+          <w:top w:val="double" w:sz="6" w:space="4" w:color="1F4D78"/>
+        </w:pBdr>
+      </w:pPr>
+      <w:r>
+        <w:rPr>
+          <w:rFonts w:ascii="Georgia" w:hAnsi="Georgia" w:cs="Georgia"/>
+          <w:b/>
+          <w:color w:val="1F4D78"/>
+          <w:sz w:val="16"/>
+        </w:rPr>
+        <w:t xml:space="preserve">✦ LORE OF ELARIA ✦  </w:t>
+      </w:r>
+      <w:r>
+        <w:rPr>
+          <w:rFonts w:ascii="Georgia" w:hAnsi="Georgia" w:cs="Georgia"/>
+          <w:b/>
+          <w:color w:val="1F4D78"/>
+          <w:sz w:val="19"/>
+        </w:rPr>
+        <w:t>The Vale Villages</w:t>
+      </w:r>
+    </w:p>
+    <w:p>
+      <w:pPr>
+        <w:keepLines/>
+        <w:spacing w:before="20" w:after="200"/>
+        <w:ind w:left="500" w:right="500"/>
+        <w:pBdr>
+          <w:bottom w:val="double" w:sz="6" w:space="4" w:color="1F4D78"/>
+        </w:pBdr>
+      </w:pPr>
+      <w:r>
+        <w:rPr>
+          <w:rFonts w:ascii="Georgia" w:hAnsi="Georgia" w:cs="Georgia"/>
+          <w:b w:val="0"/>
+          <w:i/>
+          <w:color w:val="222222"/>
+          <w:sz w:val="19"/>
+        </w:rPr>
+        <w:t>The villages of Eldridge Vale were founded by families who followed the Warden's star west until it set behind friendly hills, then stopped. Every village in the vale still builds its tavern first and its walls never, which tells you everything about the thousand years the vale has had.</w:t>
+      </w:r>
+    </w:p>
+    <w:p>
+      <w:pPr>
+        <w:keepNext/>
         <w:spacing w:before="320" w:after="20"/>
         <w:jc w:val="center"/>
       </w:pPr>
@@ -6206,6 +6398,54 @@
           <w:sz w:val="18"/>
         </w:rPr>
         <w:t>It opens with Aerial Slash from range, uses Winged Leap to skip away from melee without provoking, and saves Quack of Fury for a bunched-up party. The circle is the fight: wind visibly streams from the stones to the duck each time it leaps, and disrupting one stone grounds it; it defends the stones fiercely once it realizes what the heroes are doing. A guardian, not a hunter: heroes who heed the warning may withdraw, and it never pursues beyond the stones.</w:t>
+      </w:r>
+    </w:p>
+    <w:p>
+      <w:pPr>
+        <w:keepNext/>
+        <w:spacing w:before="200" w:after="20"/>
+        <w:ind w:left="500" w:right="500"/>
+        <w:pBdr>
+          <w:top w:val="double" w:sz="6" w:space="4" w:color="1F4D78"/>
+        </w:pBdr>
+      </w:pPr>
+      <w:r>
+        <w:rPr>
+          <w:rFonts w:ascii="Georgia" w:hAnsi="Georgia" w:cs="Georgia"/>
+          <w:b/>
+          <w:color w:val="1F4D78"/>
+          <w:sz w:val="16"/>
+        </w:rPr>
+        <w:t xml:space="preserve">✦ LORE OF ELARIA ✦  </w:t>
+      </w:r>
+      <w:r>
+        <w:rPr>
+          <w:rFonts w:ascii="Georgia" w:hAnsi="Georgia" w:cs="Georgia"/>
+          <w:b/>
+          <w:color w:val="1F4D78"/>
+          <w:sz w:val="19"/>
+        </w:rPr>
+        <w:t>The Stone Rings</w:t>
+      </w:r>
+    </w:p>
+    <w:p>
+      <w:pPr>
+        <w:keepLines/>
+        <w:spacing w:before="20" w:after="200"/>
+        <w:ind w:left="500" w:right="500"/>
+        <w:pBdr>
+          <w:bottom w:val="double" w:sz="6" w:space="4" w:color="1F4D78"/>
+        </w:pBdr>
+      </w:pPr>
+      <w:r>
+        <w:rPr>
+          <w:rFonts w:ascii="Georgia" w:hAnsi="Georgia" w:cs="Georgia"/>
+          <w:b w:val="0"/>
+          <w:i/>
+          <w:color w:val="222222"/>
+          <w:sz w:val="19"/>
+        </w:rPr>
+        <w:t>The standing stones scattered across the vales are older than every road. Each ring was raised where a plane leans close to the world, and each was given a guardian, feathered, finned, or worse, to keep the leaning from becoming a fall.</w:t>
       </w:r>
     </w:p>
     <w:p>

</xml_diff>

<commit_message>
Enemy art pass: every stat card now has its own portrait
Generated and banked six approved portraits so all 88 enemy stat cards
carry artwork:
- Grimfang war band: a full painterly group scene (scarred boss, goblin
  archers, orc, hobgoblin sniper, worg) replacing the bare tribe logo on
  the Goblin Boss card (bestiary) and the Grimfang card (Session 2); the
  clan emblem carries onto the shield and banner.
- Snowbound Bandit (bestiary + Session 4), derived from the group art.
- Giant Rat (Session 6), matching the cellar-swarm look.
- Gift-box Mimic (bestiary winter court).
- Bren and the Tavern Regular (Session 1 bar brawl).

Prompts recorded in assets/gen_prompts/, mappings in image_manifest.md.
No em dashes. No margin or blank-page regressions. Affected deliverable
PDFs regenerated.

Co-Authored-By: Claude Opus 4.8 <noreply@anthropic.com>
</commit_message>
<xml_diff>
--- a/sessions/session_01_gathering_of_friends.docx
+++ b/sessions/session_01_gathering_of_friends.docx
@@ -4560,6 +4560,46 @@
           </w:p>
           <w:p>
             <w:pPr>
+              <w:spacing w:after="60"/>
+              <w:jc w:val="center"/>
+            </w:pPr>
+            <w:r>
+              <w:drawing>
+                <wp:inline xmlns:a="http://schemas.openxmlformats.org/drawingml/2006/main" xmlns:pic="http://schemas.openxmlformats.org/drawingml/2006/picture">
+                  <wp:extent cx="2377440" cy="2377440"/>
+                  <wp:docPr id="14" name="Picture 14"/>
+                  <wp:cNvGraphicFramePr>
+                    <a:graphicFrameLocks noChangeAspect="1"/>
+                  </wp:cNvGraphicFramePr>
+                  <a:graphic>
+                    <a:graphicData uri="http://schemas.openxmlformats.org/drawingml/2006/picture">
+                      <pic:pic>
+                        <pic:nvPicPr>
+                          <pic:cNvPr id="0" name="image.jpg"/>
+                          <pic:cNvPicPr/>
+                        </pic:nvPicPr>
+                        <pic:blipFill>
+                          <a:blip r:embed="rId23"/>
+                          <a:stretch>
+                            <a:fillRect/>
+                          </a:stretch>
+                        </pic:blipFill>
+                        <pic:spPr>
+                          <a:xfrm>
+                            <a:off x="0" y="0"/>
+                            <a:ext cx="2377440" cy="2377440"/>
+                          </a:xfrm>
+                          <a:prstGeom prst="rect"/>
+                        </pic:spPr>
+                      </pic:pic>
+                    </a:graphicData>
+                  </a:graphic>
+                </wp:inline>
+              </w:drawing>
+            </w:r>
+          </w:p>
+          <w:p>
+            <w:pPr>
               <w:spacing w:after="20"/>
             </w:pPr>
             <w:r>
@@ -4765,6 +4805,46 @@
                 <w:sz w:val="16"/>
               </w:rPr>
               <w:t>Medium humanoid ✦ bandit stats, softened ✦ 2 in the brawl</w:t>
+            </w:r>
+          </w:p>
+          <w:p>
+            <w:pPr>
+              <w:spacing w:after="60"/>
+              <w:jc w:val="center"/>
+            </w:pPr>
+            <w:r>
+              <w:drawing>
+                <wp:inline xmlns:a="http://schemas.openxmlformats.org/drawingml/2006/main" xmlns:pic="http://schemas.openxmlformats.org/drawingml/2006/picture">
+                  <wp:extent cx="2377440" cy="2377440"/>
+                  <wp:docPr id="15" name="Picture 15"/>
+                  <wp:cNvGraphicFramePr>
+                    <a:graphicFrameLocks noChangeAspect="1"/>
+                  </wp:cNvGraphicFramePr>
+                  <a:graphic>
+                    <a:graphicData uri="http://schemas.openxmlformats.org/drawingml/2006/picture">
+                      <pic:pic>
+                        <pic:nvPicPr>
+                          <pic:cNvPr id="0" name="image.jpg"/>
+                          <pic:cNvPicPr/>
+                        </pic:nvPicPr>
+                        <pic:blipFill>
+                          <a:blip r:embed="rId24"/>
+                          <a:stretch>
+                            <a:fillRect/>
+                          </a:stretch>
+                        </pic:blipFill>
+                        <pic:spPr>
+                          <a:xfrm>
+                            <a:off x="0" y="0"/>
+                            <a:ext cx="2377440" cy="2377440"/>
+                          </a:xfrm>
+                          <a:prstGeom prst="rect"/>
+                        </pic:spPr>
+                      </pic:pic>
+                    </a:graphicData>
+                  </a:graphic>
+                </wp:inline>
+              </w:drawing>
             </w:r>
           </w:p>
           <w:p>
@@ -5126,7 +5206,7 @@
                   <wp:extent cx="2560320" cy="2560320"/>
                   <wp:effectExtent l="0" t="0" r="0" b="0"/>
                   <wp:wrapSquare wrapText="bothSides"/>
-                  <wp:docPr id="14" name="Picture 14"/>
+                  <wp:docPr id="16" name="Picture 16"/>
                   <wp:cNvGraphicFramePr/>
                   <a:graphic xmlns:pic="http://schemas.openxmlformats.org/drawingml/2006/picture">
                     <a:graphicData uri="http://schemas.openxmlformats.org/drawingml/2006/picture">
@@ -5136,7 +5216,7 @@
                           <pic:cNvPicPr/>
                         </pic:nvPicPr>
                         <pic:blipFill>
-                          <a:blip r:embed="rId23"/>
+                          <a:blip r:embed="rId25"/>
                           <a:stretch>
                             <a:fillRect/>
                           </a:stretch>
@@ -5811,7 +5891,7 @@
                   <wp:extent cx="2560320" cy="2560320"/>
                   <wp:effectExtent l="0" t="0" r="0" b="0"/>
                   <wp:wrapSquare wrapText="bothSides"/>
-                  <wp:docPr id="15" name="Picture 15"/>
+                  <wp:docPr id="17" name="Picture 17"/>
                   <wp:cNvGraphicFramePr/>
                   <a:graphic xmlns:pic="http://schemas.openxmlformats.org/drawingml/2006/picture">
                     <a:graphicData uri="http://schemas.openxmlformats.org/drawingml/2006/picture">
@@ -5821,7 +5901,7 @@
                           <pic:cNvPicPr/>
                         </pic:nvPicPr>
                         <pic:blipFill>
-                          <a:blip r:embed="rId24"/>
+                          <a:blip r:embed="rId26"/>
                           <a:stretch>
                             <a:fillRect/>
                           </a:stretch>
@@ -6544,7 +6624,7 @@
                   <wp:extent cx="2560320" cy="2560320"/>
                   <wp:effectExtent l="0" t="0" r="0" b="0"/>
                   <wp:wrapSquare wrapText="bothSides"/>
-                  <wp:docPr id="16" name="Picture 16"/>
+                  <wp:docPr id="18" name="Picture 18"/>
                   <wp:cNvGraphicFramePr/>
                   <a:graphic xmlns:pic="http://schemas.openxmlformats.org/drawingml/2006/picture">
                     <a:graphicData uri="http://schemas.openxmlformats.org/drawingml/2006/picture">
@@ -7309,7 +7389,7 @@
                   <wp:extent cx="2560320" cy="2560320"/>
                   <wp:effectExtent l="0" t="0" r="0" b="0"/>
                   <wp:wrapSquare wrapText="bothSides"/>
-                  <wp:docPr id="17" name="Picture 17"/>
+                  <wp:docPr id="19" name="Picture 19"/>
                   <wp:cNvGraphicFramePr/>
                   <a:graphic xmlns:pic="http://schemas.openxmlformats.org/drawingml/2006/picture">
                     <a:graphicData uri="http://schemas.openxmlformats.org/drawingml/2006/picture">
@@ -7319,7 +7399,7 @@
                           <pic:cNvPicPr/>
                         </pic:nvPicPr>
                         <pic:blipFill>
-                          <a:blip r:embed="rId25"/>
+                          <a:blip r:embed="rId27"/>
                           <a:stretch>
                             <a:fillRect/>
                           </a:stretch>

</xml_diff>

<commit_message>
Session 1: correct the mote tally and the S2 rival-clan seed
Closing tally said three motes but the day yields four (green Duckleaf, blue Cognifin, two fey from the Mist Stalkers). Foreshadow note reworded so the clan that catches up in Session 2 is named as the rival Grimfang, not Stabby's own Bloodfang.

Co-Authored-By: Claude Opus 4.8 <noreply@anthropic.com>
</commit_message>
<xml_diff>
--- a/sessions/session_01_gathering_of_friends.docx
+++ b/sessions/session_01_gathering_of_friends.docx
@@ -4038,7 +4038,7 @@
           <w:color w:val="222222"/>
           <w:sz w:val="21"/>
         </w:rPr>
-        <w:t>Their first day together was done: a friendship, a brawl, two guardians bested, three motes of runaway magic, and a mystery with no bottom yet. In the morning, the search for the missing villagers would carry the Guardians of Elaria, though they did not yet know that name, deeper into the whispering wood, and toward a laboratory on the cliffs where an old elf kept watch on the doors between worlds.</w:t>
+        <w:t>Their first day together was done: a friendship, a brawl, two guardians bested, four motes of runaway magic, and a mystery with no bottom yet. In the morning, the search for the missing villagers would carry the Guardians of Elaria, though they did not yet know that name, deeper into the whispering wood, and toward a laboratory on the cliffs where an old elf kept watch on the doors between worlds.</w:t>
       </w:r>
     </w:p>
     <w:p>
@@ -4357,7 +4357,7 @@
           <w:color w:val="222222"/>
           <w:sz w:val="21"/>
         </w:rPr>
-        <w:t xml:space="preserve"> the BANG of the tavern door is his overture → the brawl is his stage: he fights like a rumor, everywhere and nowhere → faster than Duckleaf's wind, laughing on Cognifin's slick stones → seeds: the Bloodfang Clan and Master Kaelon in his introduction (Door: the clan catches up with him in Session 2).</w:t>
+        <w:t xml:space="preserve"> the BANG of the tavern door is his overture → the brawl is his stage: he fights like a rumor, everywhere and nowhere → faster than Duckleaf's wind, laughing on Cognifin's slick stones → seeds: the Bloodfang Clan and Master Kaelon in his introduction (Door: a rival clan, the Grimfang, catches up with him in Session 2).</w:t>
       </w:r>
     </w:p>
     <w:p>

</xml_diff>